<commit_message>
docs: revisão da arquitetura antes da validação
O protocolo passa a ser derivado do código de envio, e a função confere
se ele já existe antes de gravar a foto: sem isso, quem lesse um
protocolo na consulta poderia trocar a foto de um relato alheio.
O RNF-04 fica com uma qualidade só, o registro de recusa deixa de
guardar o valor recusado, e o documento passa a dizer onde o RNF-03 e
o RNF-04 mudam os critérios da Sprint 1.

Co-Authored-By: Claude Opus 5.5 <noreply@anthropic.com>
</commit_message>
<xml_diff>
--- a/docs/02-arquitetura.docx
+++ b/docs/02-arquitetura.docx
@@ -259,7 +259,7 @@
         <w:pStyle w:val="BodyText"/>
       </w:pPr>
       <w:r>
-        <w:t xml:space="preserve">O número tem razão. A consulta é feita na plataforma, com o sinal fraco, e a parte da espera que vem da rede da estação não é nossa; a parte que é nossa tem de ser pequena para que a soma das duas caiba no tempo de o trem parar. Os 300 relatos equivalem a dez por dia, todo dia, na mesma estação: muito mais do que qualquer estação terá no começo, e o número precisa continuar valendo quando o uso crescer.</w:t>
+        <w:t xml:space="preserve">De onde vêm os números. A consulta é feita na plataforma, com o sinal fraco, e a parte da espera que vem da rede da estação não é nossa; a parte que é nossa tem de ser pequena para que a soma das duas caiba no tempo de o trem parar. Os 300 relatos equivalem a dez por dia, todo dia, na mesma estação: muito mais do que qualquer estação terá no começo, e o número precisa continuar valendo quando o uso crescer.</w:t>
       </w:r>
     </w:p>
     <w:p>
@@ -380,7 +380,15 @@
           <w:sz w:val="21"/>
           <w:szCs w:val="21"/>
         </w:rPr>
-        <w:t xml:space="preserve">No túnel o sinal cai, e o envio pode ter sido gravado com a resposta perdida no caminho. Tentar de novo é o certo a fazer, e só é seguro se o sistema reconhecer o pedido repetido. A página gera um código aleatório para cada relato, que vira o protocolo. A tabela só grava o relato se aquele protocolo ainda não existir, e a foto, guardada com o protocolo no nome, é regravada no mesmo endereço em vez de duplicada. A confirmação faz o mesmo com o código da última confirmação somada.</w:t>
+        <w:t xml:space="preserve">No túnel o sinal cai, e o envio pode ter sido gravado com a resposta perdida no caminho. Tentar de novo é o certo a fazer, e só é seguro se o sistema reconhecer o pedido repetido. A página gera um código aleatório para cada envio e repete o mesmo código a cada nova tentativa; a função deriva dele o protocolo. Se o protocolo já existe na tabela, é um reenvio: a função devolve o mesmo protocolo sem tocar na foto nem na tabela. A confirmação faz o mesmo com o código da última confirmação somada.</w:t>
+      </w:r>
+    </w:p>
+    <w:p>
+      <w:pPr>
+        <w:pStyle w:val="BodyText"/>
+      </w:pPr>
+      <w:r>
+        <w:t xml:space="preserve">O protocolo é um resumo do código, os 16 primeiros caracteres do seu SHA-256, e não o próprio código. O protocolo aparece na consulta, porque é por ele que se confirma um relato; o código, não. Se o protocolo fosse o código, quem o lesse na consulta poderia reenviá-lo com outra foto e trocar a foto de um relato alheio (seção 9). E o código identifica o envio, e não quem enviou: é novo a cada relato e a cada confirmação, e a página o descarta quando recebe a resposta. Por isso ele não fere o RD-01.</w:t>
       </w:r>
     </w:p>
     <w:p>
@@ -514,6 +522,14 @@
     </w:p>
     <w:p>
       <w:pPr>
+        <w:pStyle w:val="BodyText"/>
+      </w:pPr>
+      <w:r>
+        <w:t xml:space="preserve">O RNF-03 acrescenta um cuidado ao critério US-01, cenário 1, da Sprint 1: a foto JPEG de 2 MB tem de chegar sem EXIF. Pela página ela chega, porque a página a limpa; mandada direto à API como saiu da câmera, ela seria recusada, e é isso que o RNF-03 pede.</w:t>
+      </w:r>
+    </w:p>
+    <w:p>
+      <w:pPr>
         <w:pStyle w:val="Heading3"/>
       </w:pPr>
       <w:r>
@@ -549,7 +565,7 @@
           <w:sz w:val="21"/>
           <w:szCs w:val="21"/>
         </w:rPr>
-        <w:t xml:space="preserve">[Segurança] Um mesmo relato deve somar no máximo 1 confirmação a cada 10 minutos, com 20 confirmações disparadas em sequência contra o mesmo relato, sem que o sistema guarde nada de quem confirmou.</w:t>
+        <w:t xml:space="preserve">[Segurança] Um mesmo relato deve somar no máximo 1 confirmação a cada 10 minutos, com 20 confirmações disparadas em sequência contra o mesmo relato.</w:t>
       </w:r>
       <w:r>
         <w:br/>
@@ -639,6 +655,14 @@
       </w:pPr>
       <w:r>
         <w:t xml:space="preserve">O limite não impede a fraude; ele a torna lenta, e o risco que sobra está declarado na seção 9. Ele também não atrapalha o uso real: duas passageiras que confirmam o mesmo problema em menos de 10 minutos não acrescentam informação, e a segunda recebe a mensagem de que o relato acabou de ser confirmado.</w:t>
+      </w:r>
+    </w:p>
+    <w:p>
+      <w:pPr>
+        <w:pStyle w:val="BodyText"/>
+      </w:pPr>
+      <w:r>
+        <w:t xml:space="preserve">O RNF-04 também acrescenta um dado ao critério US-03, cenário 1, da Sprint 1: para que o relato A passe de 2 para 3 confirmações, a última confirmação dele tem de ter mais de 10 minutos. Isso entra no "Dado que" quando o teste for escrito, na Sprint 5.</w:t>
       </w:r>
     </w:p>
     <w:p>
@@ -1103,7 +1127,7 @@
         <w:pStyle w:val="BodyText"/>
       </w:pPr>
       <w:r>
-        <w:t xml:space="preserve">Dois requisitos no pilar 2 não é acaso. Num sistema de relatos anônimos sobre segurança, a ameaça vem de dois lados: expor quem relatou (RNF-03) e falsificar o que foi relatado (RNF-04).</w:t>
+        <w:t xml:space="preserve">Ter dois requisitos no pilar 2 não é acaso. Num sistema de relatos anônimos sobre segurança, a ameaça vem de dois lados: expor quem relatou (RNF-03) e falsificar o que foi relatado (RNF-04).</w:t>
       </w:r>
     </w:p>
     <w:p>
@@ -1770,7 +1794,7 @@
         <w:t xml:space="preserve">registrar</w:t>
       </w:r>
       <w:r>
-        <w:t xml:space="preserve"> grava na tabela e no bucket de fotos, sem nenhuma permissão de excluir; a </w:t>
+        <w:t xml:space="preserve"> lê e grava na tabela e grava no bucket de fotos, sem nenhuma permissão de excluir; a </w:t>
       </w:r>
       <w:r>
         <w:rPr>
@@ -1781,7 +1805,7 @@
         <w:t xml:space="preserve">confirmar</w:t>
       </w:r>
       <w:r>
-        <w:t xml:space="preserve"> só atualiza a tabela.</w:t>
+        <w:t xml:space="preserve"> lê e atualiza a tabela, também sem excluir.</w:t>
       </w:r>
     </w:p>
     <w:p>
@@ -2093,8 +2117,8 @@
       </w:tblPr>
       <w:tblGrid>
         <w:gridCol w:w="1202"/>
-        <w:gridCol w:w="3853"/>
-        <w:gridCol w:w="3971"/>
+        <w:gridCol w:w="3856"/>
+        <w:gridCol w:w="3968"/>
       </w:tblGrid>
       <w:tr>
         <w:trPr>
@@ -2123,7 +2147,7 @@
         </w:tc>
         <w:tc>
           <w:tcPr>
-            <w:tcW w:w="3853" w:type="dxa"/>
+            <w:tcW w:w="3856" w:type="dxa"/>
             <w:shd w:val="clear" w:color="auto" w:fill="F2F5F9"/>
           </w:tcPr>
           <w:p>
@@ -2143,7 +2167,7 @@
         </w:tc>
         <w:tc>
           <w:tcPr>
-            <w:tcW w:w="3971" w:type="dxa"/>
+            <w:tcW w:w="3968" w:type="dxa"/>
             <w:shd w:val="clear" w:color="auto" w:fill="F2F5F9"/>
           </w:tcPr>
           <w:p>
@@ -2182,7 +2206,7 @@
         </w:tc>
         <w:tc>
           <w:tcPr>
-            <w:tcW w:w="3853" w:type="dxa"/>
+            <w:tcW w:w="3856" w:type="dxa"/>
           </w:tcPr>
           <w:p>
             <w:pPr>
@@ -2226,15 +2250,15 @@
         </w:tc>
         <w:tc>
           <w:tcPr>
-            <w:tcW w:w="3971" w:type="dxa"/>
-          </w:tcPr>
-          <w:p>
-            <w:pPr>
-              <w:pStyle w:val="Compact"/>
-              <w:spacing w:before="40" w:after="40"/>
-            </w:pPr>
-            <w:r>
-              <w:t xml:space="preserve">A página conhece um endereço só, e as funções não precisam cuidar de roteamento. É também o único ponto por onde algo vindo de fora chega aos dados</w:t>
+            <w:tcW w:w="3968" w:type="dxa"/>
+          </w:tcPr>
+          <w:p>
+            <w:pPr>
+              <w:pStyle w:val="Compact"/>
+              <w:spacing w:before="40" w:after="40"/>
+            </w:pPr>
+            <w:r>
+              <w:t xml:space="preserve">A página conhece um endereço só, e as funções não precisam cuidar de roteamento. É também o único ponto por onde algo vindo de fora chega à tabela</w:t>
             </w:r>
           </w:p>
         </w:tc>
@@ -2259,7 +2283,7 @@
         </w:tc>
         <w:tc>
           <w:tcPr>
-            <w:tcW w:w="3853" w:type="dxa"/>
+            <w:tcW w:w="3856" w:type="dxa"/>
           </w:tcPr>
           <w:p>
             <w:pPr>
@@ -2273,7 +2297,7 @@
         </w:tc>
         <w:tc>
           <w:tcPr>
-            <w:tcW w:w="3971" w:type="dxa"/>
+            <w:tcW w:w="3968" w:type="dxa"/>
           </w:tcPr>
           <w:p>
             <w:pPr>
@@ -2432,10 +2456,10 @@
         <w:tblLook w:val="0020" w:firstRow="1" w:lastRow="0" w:firstColumn="0" w:lastColumn="0" w:noHBand="0" w:noVBand="0"/>
       </w:tblPr>
       <w:tblGrid>
-        <w:gridCol w:w="1447"/>
-        <w:gridCol w:w="2284"/>
-        <w:gridCol w:w="3729"/>
-        <w:gridCol w:w="1566"/>
+        <w:gridCol w:w="1446"/>
+        <w:gridCol w:w="2281"/>
+        <w:gridCol w:w="3736"/>
+        <w:gridCol w:w="1563"/>
       </w:tblGrid>
       <w:tr>
         <w:trPr>
@@ -2444,7 +2468,7 @@
         </w:trPr>
         <w:tc>
           <w:tcPr>
-            <w:tcW w:w="1447" w:type="dxa"/>
+            <w:tcW w:w="1446" w:type="dxa"/>
             <w:shd w:val="clear" w:color="auto" w:fill="F2F5F9"/>
           </w:tcPr>
           <w:p>
@@ -2464,7 +2488,7 @@
         </w:tc>
         <w:tc>
           <w:tcPr>
-            <w:tcW w:w="2284" w:type="dxa"/>
+            <w:tcW w:w="2281" w:type="dxa"/>
             <w:shd w:val="clear" w:color="auto" w:fill="F2F5F9"/>
           </w:tcPr>
           <w:p>
@@ -2484,7 +2508,7 @@
         </w:tc>
         <w:tc>
           <w:tcPr>
-            <w:tcW w:w="3729" w:type="dxa"/>
+            <w:tcW w:w="3736" w:type="dxa"/>
             <w:shd w:val="clear" w:color="auto" w:fill="F2F5F9"/>
           </w:tcPr>
           <w:p>
@@ -2504,7 +2528,7 @@
         </w:tc>
         <w:tc>
           <w:tcPr>
-            <w:tcW w:w="1566" w:type="dxa"/>
+            <w:tcW w:w="1563" w:type="dxa"/>
             <w:shd w:val="clear" w:color="auto" w:fill="F2F5F9"/>
           </w:tcPr>
           <w:p>
@@ -2529,7 +2553,7 @@
         </w:trPr>
         <w:tc>
           <w:tcPr>
-            <w:tcW w:w="1447" w:type="dxa"/>
+            <w:tcW w:w="1446" w:type="dxa"/>
           </w:tcPr>
           <w:p>
             <w:pPr>
@@ -2543,7 +2567,7 @@
         </w:tc>
         <w:tc>
           <w:tcPr>
-            <w:tcW w:w="2284" w:type="dxa"/>
+            <w:tcW w:w="2281" w:type="dxa"/>
           </w:tcPr>
           <w:p>
             <w:pPr>
@@ -2557,21 +2581,21 @@
         </w:tc>
         <w:tc>
           <w:tcPr>
-            <w:tcW w:w="3729" w:type="dxa"/>
-          </w:tcPr>
-          <w:p>
-            <w:pPr>
-              <w:pStyle w:val="Compact"/>
-              <w:spacing w:before="40" w:after="40"/>
-            </w:pPr>
-            <w:r>
-              <w:t xml:space="preserve">Mostra o formulário, a consulta e o botão de confirmar; limpa e reduz a foto e gera o código do relato antes de enviar</w:t>
-            </w:r>
-          </w:p>
-        </w:tc>
-        <w:tc>
-          <w:tcPr>
-            <w:tcW w:w="1566" w:type="dxa"/>
+            <w:tcW w:w="3736" w:type="dxa"/>
+          </w:tcPr>
+          <w:p>
+            <w:pPr>
+              <w:pStyle w:val="Compact"/>
+              <w:spacing w:before="40" w:after="40"/>
+            </w:pPr>
+            <w:r>
+              <w:t xml:space="preserve">Mostra o formulário, a consulta e o botão de confirmar; limpa e reduz a foto e gera o código de envio antes de enviar</w:t>
+            </w:r>
+          </w:p>
+        </w:tc>
+        <w:tc>
+          <w:tcPr>
+            <w:tcW w:w="1563" w:type="dxa"/>
           </w:tcPr>
           <w:p>
             <w:pPr>
@@ -2590,7 +2614,7 @@
         </w:trPr>
         <w:tc>
           <w:tcPr>
-            <w:tcW w:w="1447" w:type="dxa"/>
+            <w:tcW w:w="1446" w:type="dxa"/>
           </w:tcPr>
           <w:p>
             <w:pPr>
@@ -2604,7 +2628,7 @@
         </w:tc>
         <w:tc>
           <w:tcPr>
-            <w:tcW w:w="2284" w:type="dxa"/>
+            <w:tcW w:w="2281" w:type="dxa"/>
           </w:tcPr>
           <w:p>
             <w:pPr>
@@ -2626,7 +2650,7 @@
         </w:tc>
         <w:tc>
           <w:tcPr>
-            <w:tcW w:w="3729" w:type="dxa"/>
+            <w:tcW w:w="3736" w:type="dxa"/>
           </w:tcPr>
           <w:p>
             <w:pPr>
@@ -2670,7 +2694,7 @@
         </w:tc>
         <w:tc>
           <w:tcPr>
-            <w:tcW w:w="1566" w:type="dxa"/>
+            <w:tcW w:w="1563" w:type="dxa"/>
           </w:tcPr>
           <w:p>
             <w:pPr>
@@ -2689,7 +2713,7 @@
         </w:trPr>
         <w:tc>
           <w:tcPr>
-            <w:tcW w:w="1447" w:type="dxa"/>
+            <w:tcW w:w="1446" w:type="dxa"/>
           </w:tcPr>
           <w:p>
             <w:pPr>
@@ -2703,7 +2727,7 @@
         </w:tc>
         <w:tc>
           <w:tcPr>
-            <w:tcW w:w="2284" w:type="dxa"/>
+            <w:tcW w:w="2281" w:type="dxa"/>
           </w:tcPr>
           <w:p>
             <w:pPr>
@@ -2717,7 +2741,7 @@
         </w:tc>
         <w:tc>
           <w:tcPr>
-            <w:tcW w:w="3729" w:type="dxa"/>
+            <w:tcW w:w="3736" w:type="dxa"/>
           </w:tcPr>
           <w:p>
             <w:pPr>
@@ -2731,7 +2755,7 @@
         </w:tc>
         <w:tc>
           <w:tcPr>
-            <w:tcW w:w="1566" w:type="dxa"/>
+            <w:tcW w:w="1563" w:type="dxa"/>
           </w:tcPr>
           <w:p>
             <w:pPr>
@@ -2750,7 +2774,7 @@
         </w:trPr>
         <w:tc>
           <w:tcPr>
-            <w:tcW w:w="1447" w:type="dxa"/>
+            <w:tcW w:w="1446" w:type="dxa"/>
           </w:tcPr>
           <w:p>
             <w:pPr>
@@ -2764,7 +2788,7 @@
         </w:tc>
         <w:tc>
           <w:tcPr>
-            <w:tcW w:w="2284" w:type="dxa"/>
+            <w:tcW w:w="2281" w:type="dxa"/>
           </w:tcPr>
           <w:p>
             <w:pPr>
@@ -2778,21 +2802,21 @@
         </w:tc>
         <w:tc>
           <w:tcPr>
-            <w:tcW w:w="3729" w:type="dxa"/>
-          </w:tcPr>
-          <w:p>
-            <w:pPr>
-              <w:pStyle w:val="Compact"/>
-              <w:spacing w:before="40" w:after="40"/>
-            </w:pPr>
-            <w:r>
-              <w:t xml:space="preserve">Valida, grava a foto, grava o relato só se o protocolo for novo</w:t>
-            </w:r>
-          </w:p>
-        </w:tc>
-        <w:tc>
-          <w:tcPr>
-            <w:tcW w:w="1566" w:type="dxa"/>
+            <w:tcW w:w="3736" w:type="dxa"/>
+          </w:tcPr>
+          <w:p>
+            <w:pPr>
+              <w:pStyle w:val="Compact"/>
+              <w:spacing w:before="40" w:after="40"/>
+            </w:pPr>
+            <w:r>
+              <w:t xml:space="preserve">Valida, deriva o protocolo e grava a foto e o relato, só se o protocolo for novo</w:t>
+            </w:r>
+          </w:p>
+        </w:tc>
+        <w:tc>
+          <w:tcPr>
+            <w:tcW w:w="1563" w:type="dxa"/>
           </w:tcPr>
           <w:p>
             <w:pPr>
@@ -2811,7 +2835,7 @@
         </w:trPr>
         <w:tc>
           <w:tcPr>
-            <w:tcW w:w="1447" w:type="dxa"/>
+            <w:tcW w:w="1446" w:type="dxa"/>
           </w:tcPr>
           <w:p>
             <w:pPr>
@@ -2825,7 +2849,7 @@
         </w:tc>
         <w:tc>
           <w:tcPr>
-            <w:tcW w:w="2284" w:type="dxa"/>
+            <w:tcW w:w="2281" w:type="dxa"/>
           </w:tcPr>
           <w:p>
             <w:pPr>
@@ -2839,7 +2863,7 @@
         </w:tc>
         <w:tc>
           <w:tcPr>
-            <w:tcW w:w="3729" w:type="dxa"/>
+            <w:tcW w:w="3736" w:type="dxa"/>
           </w:tcPr>
           <w:p>
             <w:pPr>
@@ -2864,7 +2888,7 @@
         </w:tc>
         <w:tc>
           <w:tcPr>
-            <w:tcW w:w="1566" w:type="dxa"/>
+            <w:tcW w:w="1563" w:type="dxa"/>
           </w:tcPr>
           <w:p>
             <w:pPr>
@@ -2883,7 +2907,7 @@
         </w:trPr>
         <w:tc>
           <w:tcPr>
-            <w:tcW w:w="1447" w:type="dxa"/>
+            <w:tcW w:w="1446" w:type="dxa"/>
           </w:tcPr>
           <w:p>
             <w:pPr>
@@ -2897,7 +2921,7 @@
         </w:tc>
         <w:tc>
           <w:tcPr>
-            <w:tcW w:w="2284" w:type="dxa"/>
+            <w:tcW w:w="2281" w:type="dxa"/>
           </w:tcPr>
           <w:p>
             <w:pPr>
@@ -2911,7 +2935,7 @@
         </w:tc>
         <w:tc>
           <w:tcPr>
-            <w:tcW w:w="3729" w:type="dxa"/>
+            <w:tcW w:w="3736" w:type="dxa"/>
           </w:tcPr>
           <w:p>
             <w:pPr>
@@ -2925,7 +2949,7 @@
         </w:tc>
         <w:tc>
           <w:tcPr>
-            <w:tcW w:w="1566" w:type="dxa"/>
+            <w:tcW w:w="1563" w:type="dxa"/>
           </w:tcPr>
           <w:p>
             <w:pPr>
@@ -2944,7 +2968,7 @@
         </w:trPr>
         <w:tc>
           <w:tcPr>
-            <w:tcW w:w="1447" w:type="dxa"/>
+            <w:tcW w:w="1446" w:type="dxa"/>
           </w:tcPr>
           <w:p>
             <w:pPr>
@@ -2958,7 +2982,7 @@
         </w:tc>
         <w:tc>
           <w:tcPr>
-            <w:tcW w:w="2284" w:type="dxa"/>
+            <w:tcW w:w="2281" w:type="dxa"/>
           </w:tcPr>
           <w:p>
             <w:pPr>
@@ -2980,7 +3004,7 @@
         </w:tc>
         <w:tc>
           <w:tcPr>
-            <w:tcW w:w="3729" w:type="dxa"/>
+            <w:tcW w:w="3736" w:type="dxa"/>
           </w:tcPr>
           <w:p>
             <w:pPr>
@@ -3005,7 +3029,7 @@
         </w:tc>
         <w:tc>
           <w:tcPr>
-            <w:tcW w:w="1566" w:type="dxa"/>
+            <w:tcW w:w="1563" w:type="dxa"/>
           </w:tcPr>
           <w:p>
             <w:pPr>
@@ -3024,7 +3048,7 @@
         </w:trPr>
         <w:tc>
           <w:tcPr>
-            <w:tcW w:w="1447" w:type="dxa"/>
+            <w:tcW w:w="1446" w:type="dxa"/>
           </w:tcPr>
           <w:p>
             <w:pPr>
@@ -3038,7 +3062,7 @@
         </w:tc>
         <w:tc>
           <w:tcPr>
-            <w:tcW w:w="2284" w:type="dxa"/>
+            <w:tcW w:w="2281" w:type="dxa"/>
           </w:tcPr>
           <w:p>
             <w:pPr>
@@ -3060,7 +3084,7 @@
         </w:tc>
         <w:tc>
           <w:tcPr>
-            <w:tcW w:w="3729" w:type="dxa"/>
+            <w:tcW w:w="3736" w:type="dxa"/>
           </w:tcPr>
           <w:p>
             <w:pPr>
@@ -3085,7 +3109,7 @@
         </w:tc>
         <w:tc>
           <w:tcPr>
-            <w:tcW w:w="1566" w:type="dxa"/>
+            <w:tcW w:w="1563" w:type="dxa"/>
           </w:tcPr>
           <w:p>
             <w:pPr>
@@ -3104,7 +3128,7 @@
         </w:trPr>
         <w:tc>
           <w:tcPr>
-            <w:tcW w:w="1447" w:type="dxa"/>
+            <w:tcW w:w="1446" w:type="dxa"/>
           </w:tcPr>
           <w:p>
             <w:pPr>
@@ -3118,7 +3142,7 @@
         </w:tc>
         <w:tc>
           <w:tcPr>
-            <w:tcW w:w="2284" w:type="dxa"/>
+            <w:tcW w:w="2281" w:type="dxa"/>
           </w:tcPr>
           <w:p>
             <w:pPr>
@@ -3132,7 +3156,7 @@
         </w:tc>
         <w:tc>
           <w:tcPr>
-            <w:tcW w:w="3729" w:type="dxa"/>
+            <w:tcW w:w="3736" w:type="dxa"/>
           </w:tcPr>
           <w:p>
             <w:pPr>
@@ -3157,7 +3181,7 @@
         </w:tc>
         <w:tc>
           <w:tcPr>
-            <w:tcW w:w="1566" w:type="dxa"/>
+            <w:tcW w:w="1563" w:type="dxa"/>
           </w:tcPr>
           <w:p>
             <w:pPr>
@@ -3176,7 +3200,7 @@
         </w:trPr>
         <w:tc>
           <w:tcPr>
-            <w:tcW w:w="1447" w:type="dxa"/>
+            <w:tcW w:w="1446" w:type="dxa"/>
           </w:tcPr>
           <w:p>
             <w:pPr>
@@ -3190,7 +3214,7 @@
         </w:tc>
         <w:tc>
           <w:tcPr>
-            <w:tcW w:w="2284" w:type="dxa"/>
+            <w:tcW w:w="2281" w:type="dxa"/>
           </w:tcPr>
           <w:p>
             <w:pPr>
@@ -3204,7 +3228,7 @@
         </w:tc>
         <w:tc>
           <w:tcPr>
-            <w:tcW w:w="3729" w:type="dxa"/>
+            <w:tcW w:w="3736" w:type="dxa"/>
           </w:tcPr>
           <w:p>
             <w:pPr>
@@ -3218,7 +3242,7 @@
         </w:tc>
         <w:tc>
           <w:tcPr>
-            <w:tcW w:w="1566" w:type="dxa"/>
+            <w:tcW w:w="1563" w:type="dxa"/>
           </w:tcPr>
           <w:p>
             <w:pPr>
@@ -3251,7 +3275,7 @@
         <w:pStyle w:val="BodyText"/>
       </w:pPr>
       <w:r>
-        <w:t xml:space="preserve">A passageira escolhe a estação na lista, o tipo de problema e a faixa de horário, escreve a descrição, tira ou escolhe a foto e toca em "Enviar relato". Antes de enviar, a página faz duas coisas: redesenha a foto, o que tira dela os metadados EXIF e a reduz para no máximo 1600 pixels no lado maior (RNF-03), e gera um código aleatório para aquele relato, que vai ser o protocolo (RNF-02). Envia tudo em um único POST para a rota </w:t>
+        <w:t xml:space="preserve">A passageira escolhe a estação na lista, o tipo de problema e a faixa de horário, escreve a descrição, tira ou escolhe a foto e toca em "Enviar relato". Antes de enviar, a página faz duas coisas: redesenha a foto, o que tira dela os metadados EXIF e a reduz para no máximo 1600 pixels no lado maior (RNF-03), e gera um código aleatório para aquele envio, que ela repete se precisar tentar de novo (RNF-02). Envia tudo em um único POST para a rota </w:t>
       </w:r>
       <w:r>
         <w:rPr>
@@ -3281,7 +3305,7 @@
         <w:t xml:space="preserve">registrar</w:t>
       </w:r>
       <w:r>
-        <w:t xml:space="preserve">. Ela confere, nesta ordem, a estação na lista aceita, o tipo de problema, a faixa de horário e a foto: presente, com até 2 MB e sem EXIF. No primeiro campo recusado, devolve 400 dizendo qual foi, e imprime uma linha com a operação, o campo recusado e o valor informado, sem nada de quem enviou (RF-05 e RNF-03).</w:t>
+        <w:t xml:space="preserve">. Ela confere, nesta ordem, a estação na lista aceita, o tipo de problema, a faixa de horário, a foto (presente, com até 2 MB e sem EXIF) e a descrição, se houver, com até 500 caracteres. No primeiro campo recusado, devolve 400 dizendo qual foi, e imprime uma linha com a operação e o nome do campo recusado. O valor recusado não vai para o registro: é texto escrito por quem enviou, e o registro não guarda nada de quem enviou (RF-05 e RNF-03).</w:t>
       </w:r>
     </w:p>
     <w:p>
@@ -3289,7 +3313,7 @@
         <w:pStyle w:val="BodyText"/>
       </w:pPr>
       <w:r>
-        <w:t xml:space="preserve">A foto vai primeiro: ela é gravada no S3, em </w:t>
+        <w:t xml:space="preserve">Com tudo válido, a função deriva o protocolo do código de envio e confere se ele já existe na tabela. Se existir, é um reenvio: a função não toca na foto nem na tabela e devolve o mesmo protocolo (RNF-02). Se não existir, a foto vai primeiro: ela é gravada no S3, em </w:t>
       </w:r>
       <w:r>
         <w:rPr>
@@ -3300,7 +3324,7 @@
         <w:t xml:space="preserve">fotos/&lt;estacao_id&gt;/&lt;protocolo&gt;.jpg</w:t>
       </w:r>
       <w:r>
-        <w:t xml:space="preserve">. Só depois o relato é gravado na tabela, com 0 confirmações, e só se aquele protocolo ainda não existir. Se já existir, é um reenvio: a função não grava nada e devolve o mesmo protocolo (RNF-02). A ordem é a preocupação de Reliability do FURPS da Sprint 1: não pode existir relato listado apontando para uma foto que nunca subiu. O pior caso no sentido contrário é uma foto sem relato, que nenhuma consulta mostra; e, se a passageira reenviar, a mesma foto é regravada no mesmo endereço.</w:t>
+        <w:t xml:space="preserve">. Só depois o relato é gravado na tabela, com 0 confirmações, numa gravação condicional que só acontece se o protocolo ainda não existir, o que cobre dois reenvios que cheguem ao mesmo tempo. A ordem é a preocupação de Reliability do FURPS da Sprint 1: não pode existir relato listado apontando para uma foto que nunca subiu. O pior caso no sentido contrário é uma foto sem relato, que nenhuma consulta mostra; e, se a passageira reenviar, a mesma foto é regravada no mesmo endereço.</w:t>
       </w:r>
     </w:p>
     <w:p>
@@ -3848,10 +3872,10 @@
         <w:tblLook w:val="0020" w:firstRow="1" w:lastRow="0" w:firstColumn="0" w:lastColumn="0" w:noHBand="0" w:noVBand="0"/>
       </w:tblPr>
       <w:tblGrid>
-        <w:gridCol w:w="1219"/>
-        <w:gridCol w:w="3088"/>
-        <w:gridCol w:w="3087"/>
-        <w:gridCol w:w="1632"/>
+        <w:gridCol w:w="1218"/>
+        <w:gridCol w:w="3085"/>
+        <w:gridCol w:w="3092"/>
+        <w:gridCol w:w="1631"/>
       </w:tblGrid>
       <w:tr>
         <w:trPr>
@@ -3860,7 +3884,7 @@
         </w:trPr>
         <w:tc>
           <w:tcPr>
-            <w:tcW w:w="1219" w:type="dxa"/>
+            <w:tcW w:w="1218" w:type="dxa"/>
             <w:shd w:val="clear" w:color="auto" w:fill="F2F5F9"/>
           </w:tcPr>
           <w:p>
@@ -3880,7 +3904,7 @@
         </w:tc>
         <w:tc>
           <w:tcPr>
-            <w:tcW w:w="3088" w:type="dxa"/>
+            <w:tcW w:w="3085" w:type="dxa"/>
             <w:shd w:val="clear" w:color="auto" w:fill="F2F5F9"/>
           </w:tcPr>
           <w:p>
@@ -3900,7 +3924,7 @@
         </w:tc>
         <w:tc>
           <w:tcPr>
-            <w:tcW w:w="3087" w:type="dxa"/>
+            <w:tcW w:w="3092" w:type="dxa"/>
             <w:shd w:val="clear" w:color="auto" w:fill="F2F5F9"/>
           </w:tcPr>
           <w:p>
@@ -3920,7 +3944,7 @@
         </w:tc>
         <w:tc>
           <w:tcPr>
-            <w:tcW w:w="1632" w:type="dxa"/>
+            <w:tcW w:w="1631" w:type="dxa"/>
             <w:shd w:val="clear" w:color="auto" w:fill="F2F5F9"/>
           </w:tcPr>
           <w:p>
@@ -3945,7 +3969,7 @@
         </w:trPr>
         <w:tc>
           <w:tcPr>
-            <w:tcW w:w="1219" w:type="dxa"/>
+            <w:tcW w:w="1218" w:type="dxa"/>
           </w:tcPr>
           <w:p>
             <w:pPr>
@@ -3959,7 +3983,7 @@
         </w:tc>
         <w:tc>
           <w:tcPr>
-            <w:tcW w:w="3088" w:type="dxa"/>
+            <w:tcW w:w="3085" w:type="dxa"/>
           </w:tcPr>
           <w:p>
             <w:pPr>
@@ -3978,7 +4002,7 @@
         </w:tc>
         <w:tc>
           <w:tcPr>
-            <w:tcW w:w="3087" w:type="dxa"/>
+            <w:tcW w:w="3092" w:type="dxa"/>
           </w:tcPr>
           <w:p>
             <w:pPr>
@@ -4000,7 +4024,7 @@
         </w:tc>
         <w:tc>
           <w:tcPr>
-            <w:tcW w:w="1632" w:type="dxa"/>
+            <w:tcW w:w="1631" w:type="dxa"/>
           </w:tcPr>
           <w:p>
             <w:pPr>
@@ -4019,7 +4043,7 @@
         </w:trPr>
         <w:tc>
           <w:tcPr>
-            <w:tcW w:w="1219" w:type="dxa"/>
+            <w:tcW w:w="1218" w:type="dxa"/>
           </w:tcPr>
           <w:p>
             <w:pPr>
@@ -4033,7 +4057,7 @@
         </w:tc>
         <w:tc>
           <w:tcPr>
-            <w:tcW w:w="3088" w:type="dxa"/>
+            <w:tcW w:w="3085" w:type="dxa"/>
           </w:tcPr>
           <w:p>
             <w:pPr>
@@ -4052,7 +4076,7 @@
         </w:tc>
         <w:tc>
           <w:tcPr>
-            <w:tcW w:w="3087" w:type="dxa"/>
+            <w:tcW w:w="3092" w:type="dxa"/>
           </w:tcPr>
           <w:p>
             <w:pPr>
@@ -4074,7 +4098,7 @@
         </w:tc>
         <w:tc>
           <w:tcPr>
-            <w:tcW w:w="1632" w:type="dxa"/>
+            <w:tcW w:w="1631" w:type="dxa"/>
           </w:tcPr>
           <w:p>
             <w:pPr>
@@ -4093,7 +4117,7 @@
         </w:trPr>
         <w:tc>
           <w:tcPr>
-            <w:tcW w:w="1219" w:type="dxa"/>
+            <w:tcW w:w="1218" w:type="dxa"/>
           </w:tcPr>
           <w:p>
             <w:pPr>
@@ -4107,7 +4131,7 @@
         </w:tc>
         <w:tc>
           <w:tcPr>
-            <w:tcW w:w="3088" w:type="dxa"/>
+            <w:tcW w:w="3085" w:type="dxa"/>
           </w:tcPr>
           <w:p>
             <w:pPr>
@@ -4126,40 +4150,40 @@
         </w:tc>
         <w:tc>
           <w:tcPr>
-            <w:tcW w:w="3087" w:type="dxa"/>
-          </w:tcPr>
-          <w:p>
-            <w:pPr>
-              <w:pStyle w:val="Compact"/>
-              <w:spacing w:before="40" w:after="40"/>
-            </w:pPr>
-            <w:r>
-              <w:t xml:space="preserve">texto, UUID gerado pela página para cada relato e conferido pela função</w:t>
-            </w:r>
-          </w:p>
-        </w:tc>
-        <w:tc>
-          <w:tcPr>
-            <w:tcW w:w="1632" w:type="dxa"/>
-          </w:tcPr>
-          <w:p>
-            <w:pPr>
-              <w:pStyle w:val="Compact"/>
-              <w:spacing w:before="40" w:after="40"/>
-            </w:pPr>
-            <w:r>
-              <w:t xml:space="preserve">sim</w:t>
-            </w:r>
-          </w:p>
-        </w:tc>
-      </w:tr>
-      <w:tr>
-        <w:trPr>
-          <w:cantSplit/>
-        </w:trPr>
-        <w:tc>
-          <w:tcPr>
-            <w:tcW w:w="1219" w:type="dxa"/>
+            <w:tcW w:w="3092" w:type="dxa"/>
+          </w:tcPr>
+          <w:p>
+            <w:pPr>
+              <w:pStyle w:val="Compact"/>
+              <w:spacing w:before="40" w:after="40"/>
+            </w:pPr>
+            <w:r>
+              <w:t xml:space="preserve">texto, gerado pela função: os 16 primeiros caracteres do SHA-256 do código de envio criado pela página</w:t>
+            </w:r>
+          </w:p>
+        </w:tc>
+        <w:tc>
+          <w:tcPr>
+            <w:tcW w:w="1631" w:type="dxa"/>
+          </w:tcPr>
+          <w:p>
+            <w:pPr>
+              <w:pStyle w:val="Compact"/>
+              <w:spacing w:before="40" w:after="40"/>
+            </w:pPr>
+            <w:r>
+              <w:t xml:space="preserve">sim, gerado</w:t>
+            </w:r>
+          </w:p>
+        </w:tc>
+      </w:tr>
+      <w:tr>
+        <w:trPr>
+          <w:cantSplit/>
+        </w:trPr>
+        <w:tc>
+          <w:tcPr>
+            <w:tcW w:w="1218" w:type="dxa"/>
           </w:tcPr>
           <w:p>
             <w:pPr>
@@ -4173,7 +4197,7 @@
         </w:tc>
         <w:tc>
           <w:tcPr>
-            <w:tcW w:w="3088" w:type="dxa"/>
+            <w:tcW w:w="3085" w:type="dxa"/>
           </w:tcPr>
           <w:p>
             <w:pPr>
@@ -4192,7 +4216,7 @@
         </w:tc>
         <w:tc>
           <w:tcPr>
-            <w:tcW w:w="3087" w:type="dxa"/>
+            <w:tcW w:w="3092" w:type="dxa"/>
           </w:tcPr>
           <w:p>
             <w:pPr>
@@ -4206,7 +4230,7 @@
         </w:tc>
         <w:tc>
           <w:tcPr>
-            <w:tcW w:w="1632" w:type="dxa"/>
+            <w:tcW w:w="1631" w:type="dxa"/>
           </w:tcPr>
           <w:p>
             <w:pPr>
@@ -4225,7 +4249,7 @@
         </w:trPr>
         <w:tc>
           <w:tcPr>
-            <w:tcW w:w="1219" w:type="dxa"/>
+            <w:tcW w:w="1218" w:type="dxa"/>
           </w:tcPr>
           <w:p>
             <w:pPr>
@@ -4239,7 +4263,7 @@
         </w:tc>
         <w:tc>
           <w:tcPr>
-            <w:tcW w:w="3088" w:type="dxa"/>
+            <w:tcW w:w="3085" w:type="dxa"/>
           </w:tcPr>
           <w:p>
             <w:pPr>
@@ -4258,7 +4282,7 @@
         </w:tc>
         <w:tc>
           <w:tcPr>
-            <w:tcW w:w="3087" w:type="dxa"/>
+            <w:tcW w:w="3092" w:type="dxa"/>
           </w:tcPr>
           <w:p>
             <w:pPr>
@@ -4272,7 +4296,7 @@
         </w:tc>
         <w:tc>
           <w:tcPr>
-            <w:tcW w:w="1632" w:type="dxa"/>
+            <w:tcW w:w="1631" w:type="dxa"/>
           </w:tcPr>
           <w:p>
             <w:pPr>
@@ -4291,7 +4315,7 @@
         </w:trPr>
         <w:tc>
           <w:tcPr>
-            <w:tcW w:w="1219" w:type="dxa"/>
+            <w:tcW w:w="1218" w:type="dxa"/>
           </w:tcPr>
           <w:p>
             <w:pPr>
@@ -4305,7 +4329,7 @@
         </w:tc>
         <w:tc>
           <w:tcPr>
-            <w:tcW w:w="3088" w:type="dxa"/>
+            <w:tcW w:w="3085" w:type="dxa"/>
           </w:tcPr>
           <w:p>
             <w:pPr>
@@ -4324,7 +4348,7 @@
         </w:tc>
         <w:tc>
           <w:tcPr>
-            <w:tcW w:w="3087" w:type="dxa"/>
+            <w:tcW w:w="3092" w:type="dxa"/>
           </w:tcPr>
           <w:p>
             <w:pPr>
@@ -4338,7 +4362,7 @@
         </w:tc>
         <w:tc>
           <w:tcPr>
-            <w:tcW w:w="1632" w:type="dxa"/>
+            <w:tcW w:w="1631" w:type="dxa"/>
           </w:tcPr>
           <w:p>
             <w:pPr>
@@ -4357,7 +4381,7 @@
         </w:trPr>
         <w:tc>
           <w:tcPr>
-            <w:tcW w:w="1219" w:type="dxa"/>
+            <w:tcW w:w="1218" w:type="dxa"/>
           </w:tcPr>
           <w:p>
             <w:pPr>
@@ -4371,7 +4395,7 @@
         </w:tc>
         <w:tc>
           <w:tcPr>
-            <w:tcW w:w="3088" w:type="dxa"/>
+            <w:tcW w:w="3085" w:type="dxa"/>
           </w:tcPr>
           <w:p>
             <w:pPr>
@@ -4390,7 +4414,7 @@
         </w:tc>
         <w:tc>
           <w:tcPr>
-            <w:tcW w:w="3087" w:type="dxa"/>
+            <w:tcW w:w="3092" w:type="dxa"/>
           </w:tcPr>
           <w:p>
             <w:pPr>
@@ -4404,7 +4428,7 @@
         </w:tc>
         <w:tc>
           <w:tcPr>
-            <w:tcW w:w="1632" w:type="dxa"/>
+            <w:tcW w:w="1631" w:type="dxa"/>
           </w:tcPr>
           <w:p>
             <w:pPr>
@@ -4423,7 +4447,7 @@
         </w:trPr>
         <w:tc>
           <w:tcPr>
-            <w:tcW w:w="1219" w:type="dxa"/>
+            <w:tcW w:w="1218" w:type="dxa"/>
           </w:tcPr>
           <w:p>
             <w:pPr>
@@ -4437,7 +4461,7 @@
         </w:tc>
         <w:tc>
           <w:tcPr>
-            <w:tcW w:w="3088" w:type="dxa"/>
+            <w:tcW w:w="3085" w:type="dxa"/>
           </w:tcPr>
           <w:p>
             <w:pPr>
@@ -4456,7 +4480,7 @@
         </w:tc>
         <w:tc>
           <w:tcPr>
-            <w:tcW w:w="3087" w:type="dxa"/>
+            <w:tcW w:w="3092" w:type="dxa"/>
           </w:tcPr>
           <w:p>
             <w:pPr>
@@ -4470,7 +4494,7 @@
         </w:tc>
         <w:tc>
           <w:tcPr>
-            <w:tcW w:w="1632" w:type="dxa"/>
+            <w:tcW w:w="1631" w:type="dxa"/>
           </w:tcPr>
           <w:p>
             <w:pPr>
@@ -4489,7 +4513,7 @@
         </w:trPr>
         <w:tc>
           <w:tcPr>
-            <w:tcW w:w="1219" w:type="dxa"/>
+            <w:tcW w:w="1218" w:type="dxa"/>
           </w:tcPr>
           <w:p>
             <w:pPr>
@@ -4503,7 +4527,7 @@
         </w:tc>
         <w:tc>
           <w:tcPr>
-            <w:tcW w:w="3088" w:type="dxa"/>
+            <w:tcW w:w="3085" w:type="dxa"/>
           </w:tcPr>
           <w:p>
             <w:pPr>
@@ -4522,7 +4546,7 @@
         </w:tc>
         <w:tc>
           <w:tcPr>
-            <w:tcW w:w="3087" w:type="dxa"/>
+            <w:tcW w:w="3092" w:type="dxa"/>
           </w:tcPr>
           <w:p>
             <w:pPr>
@@ -4536,7 +4560,7 @@
         </w:tc>
         <w:tc>
           <w:tcPr>
-            <w:tcW w:w="1632" w:type="dxa"/>
+            <w:tcW w:w="1631" w:type="dxa"/>
           </w:tcPr>
           <w:p>
             <w:pPr>
@@ -4555,7 +4579,7 @@
         </w:trPr>
         <w:tc>
           <w:tcPr>
-            <w:tcW w:w="1219" w:type="dxa"/>
+            <w:tcW w:w="1218" w:type="dxa"/>
           </w:tcPr>
           <w:p>
             <w:pPr>
@@ -4569,7 +4593,7 @@
         </w:tc>
         <w:tc>
           <w:tcPr>
-            <w:tcW w:w="3088" w:type="dxa"/>
+            <w:tcW w:w="3085" w:type="dxa"/>
           </w:tcPr>
           <w:p>
             <w:pPr>
@@ -4588,7 +4612,7 @@
         </w:tc>
         <w:tc>
           <w:tcPr>
-            <w:tcW w:w="3087" w:type="dxa"/>
+            <w:tcW w:w="3092" w:type="dxa"/>
           </w:tcPr>
           <w:p>
             <w:pPr>
@@ -4602,7 +4626,7 @@
         </w:tc>
         <w:tc>
           <w:tcPr>
-            <w:tcW w:w="1632" w:type="dxa"/>
+            <w:tcW w:w="1631" w:type="dxa"/>
           </w:tcPr>
           <w:p>
             <w:pPr>
@@ -4621,7 +4645,7 @@
         </w:trPr>
         <w:tc>
           <w:tcPr>
-            <w:tcW w:w="1219" w:type="dxa"/>
+            <w:tcW w:w="1218" w:type="dxa"/>
           </w:tcPr>
           <w:p>
             <w:pPr>
@@ -4635,7 +4659,7 @@
         </w:tc>
         <w:tc>
           <w:tcPr>
-            <w:tcW w:w="3088" w:type="dxa"/>
+            <w:tcW w:w="3085" w:type="dxa"/>
           </w:tcPr>
           <w:p>
             <w:pPr>
@@ -4654,7 +4678,7 @@
         </w:tc>
         <w:tc>
           <w:tcPr>
-            <w:tcW w:w="3087" w:type="dxa"/>
+            <w:tcW w:w="3092" w:type="dxa"/>
           </w:tcPr>
           <w:p>
             <w:pPr>
@@ -4668,7 +4692,7 @@
         </w:tc>
         <w:tc>
           <w:tcPr>
-            <w:tcW w:w="1632" w:type="dxa"/>
+            <w:tcW w:w="1631" w:type="dxa"/>
           </w:tcPr>
           <w:p>
             <w:pPr>
@@ -4738,7 +4762,7 @@
           <w:sz w:val="19"/>
           <w:szCs w:val="19"/>
         </w:rPr>
-        <w:t xml:space="preserve">  "dia_protocolo": "2026-10-15#3f6c2b1e-8a4d-4c1f-9b7e-2d5a0c9e7f11",</w:t>
+        <w:t xml:space="preserve">  "dia_protocolo": "2026-10-15#9c1e5a7b2f40d863",</w:t>
       </w:r>
       <w:r>
         <w:br/>
@@ -4749,7 +4773,7 @@
           <w:sz w:val="19"/>
           <w:szCs w:val="19"/>
         </w:rPr>
-        <w:t xml:space="preserve">  "protocolo": "3f6c2b1e-8a4d-4c1f-9b7e-2d5a0c9e7f11",</w:t>
+        <w:t xml:space="preserve">  "protocolo": "9c1e5a7b2f40d863",</w:t>
       </w:r>
       <w:r>
         <w:br/>
@@ -4793,7 +4817,7 @@
           <w:sz w:val="19"/>
           <w:szCs w:val="19"/>
         </w:rPr>
-        <w:t xml:space="preserve">  "foto": "fotos/BRS/3f6c2b1e-8a4d-4c1f-9b7e-2d5a0c9e7f11.jpg",</w:t>
+        <w:t xml:space="preserve">  "foto": "fotos/BRS/9c1e5a7b2f40d863.jpg",</w:t>
       </w:r>
       <w:r>
         <w:br/>
@@ -4859,8 +4883,8 @@
         <w:tblLook w:val="0020" w:firstRow="1" w:lastRow="0" w:firstColumn="0" w:lastColumn="0" w:noHBand="0" w:noVBand="0"/>
       </w:tblPr>
       <w:tblGrid>
-        <w:gridCol w:w="3002"/>
-        <w:gridCol w:w="6024"/>
+        <w:gridCol w:w="3070"/>
+        <w:gridCol w:w="5956"/>
       </w:tblGrid>
       <w:tr>
         <w:trPr>
@@ -4869,7 +4893,7 @@
         </w:trPr>
         <w:tc>
           <w:tcPr>
-            <w:tcW w:w="3002" w:type="dxa"/>
+            <w:tcW w:w="3070" w:type="dxa"/>
             <w:shd w:val="clear" w:color="auto" w:fill="F2F5F9"/>
           </w:tcPr>
           <w:p>
@@ -4889,7 +4913,7 @@
         </w:tc>
         <w:tc>
           <w:tcPr>
-            <w:tcW w:w="6024" w:type="dxa"/>
+            <w:tcW w:w="5956" w:type="dxa"/>
             <w:shd w:val="clear" w:color="auto" w:fill="F2F5F9"/>
           </w:tcPr>
           <w:p>
@@ -4914,7 +4938,7 @@
         </w:trPr>
         <w:tc>
           <w:tcPr>
-            <w:tcW w:w="3002" w:type="dxa"/>
+            <w:tcW w:w="3070" w:type="dxa"/>
           </w:tcPr>
           <w:p>
             <w:pPr>
@@ -4928,7 +4952,7 @@
         </w:tc>
         <w:tc>
           <w:tcPr>
-            <w:tcW w:w="6024" w:type="dxa"/>
+            <w:tcW w:w="5956" w:type="dxa"/>
           </w:tcPr>
           <w:p>
             <w:pPr>
@@ -4955,7 +4979,7 @@
         </w:trPr>
         <w:tc>
           <w:tcPr>
-            <w:tcW w:w="3002" w:type="dxa"/>
+            <w:tcW w:w="3070" w:type="dxa"/>
           </w:tcPr>
           <w:p>
             <w:pPr>
@@ -4969,7 +4993,7 @@
         </w:tc>
         <w:tc>
           <w:tcPr>
-            <w:tcW w:w="6024" w:type="dxa"/>
+            <w:tcW w:w="5956" w:type="dxa"/>
           </w:tcPr>
           <w:p>
             <w:pPr>
@@ -4996,7 +5020,7 @@
         </w:trPr>
         <w:tc>
           <w:tcPr>
-            <w:tcW w:w="3002" w:type="dxa"/>
+            <w:tcW w:w="3070" w:type="dxa"/>
           </w:tcPr>
           <w:p>
             <w:pPr>
@@ -5010,7 +5034,7 @@
         </w:tc>
         <w:tc>
           <w:tcPr>
-            <w:tcW w:w="6024" w:type="dxa"/>
+            <w:tcW w:w="5956" w:type="dxa"/>
           </w:tcPr>
           <w:p>
             <w:pPr>
@@ -5051,7 +5075,7 @@
         </w:trPr>
         <w:tc>
           <w:tcPr>
-            <w:tcW w:w="3002" w:type="dxa"/>
+            <w:tcW w:w="3070" w:type="dxa"/>
           </w:tcPr>
           <w:p>
             <w:pPr>
@@ -5065,15 +5089,15 @@
         </w:tc>
         <w:tc>
           <w:tcPr>
-            <w:tcW w:w="6024" w:type="dxa"/>
-          </w:tcPr>
-          <w:p>
-            <w:pPr>
-              <w:pStyle w:val="Compact"/>
-              <w:spacing w:before="40" w:after="40"/>
-            </w:pPr>
-            <w:r>
-              <w:t xml:space="preserve">"Os relatos da Linha 11", ou "todos os relatos de iluminação precária, de qualquer estação": exigem um </w:t>
+            <w:tcW w:w="5956" w:type="dxa"/>
+          </w:tcPr>
+          <w:p>
+            <w:pPr>
+              <w:pStyle w:val="Compact"/>
+              <w:spacing w:before="40" w:after="40"/>
+            </w:pPr>
+            <w:r>
+              <w:t xml:space="preserve">"Todos os relatos de iluminação precária, de qualquer estação": exige um </w:t>
             </w:r>
             <w:r>
               <w:rPr>
@@ -5095,7 +5119,7 @@
         </w:trPr>
         <w:tc>
           <w:tcPr>
-            <w:tcW w:w="3002" w:type="dxa"/>
+            <w:tcW w:w="3070" w:type="dxa"/>
           </w:tcPr>
           <w:p>
             <w:pPr>
@@ -5109,7 +5133,7 @@
         </w:tc>
         <w:tc>
           <w:tcPr>
-            <w:tcW w:w="6024" w:type="dxa"/>
+            <w:tcW w:w="5956" w:type="dxa"/>
           </w:tcPr>
           <w:p>
             <w:pPr>
@@ -5150,7 +5174,7 @@
         <w:pStyle w:val="BodyText"/>
       </w:pPr>
       <w:r>
-        <w:t xml:space="preserve">A consulta por linha fica cara, e isso não é descuido: a Sprint 1 já descartou consultar por linha (seção 8 daquele documento), porque a passageira decide por onde andar dentro de uma estação, e não de uma linha.</w:t>
+        <w:t xml:space="preserve">A consulta por linha também fica cara: não há chave para ela, e a Linha 11 viraria 16 consultas, uma por estação. Isso não é descuido: a Sprint 1 já descartou consultar por linha (seção 8 daquele documento), porque a passageira decide por onde andar dentro de uma estação, e não de uma linha.</w:t>
       </w:r>
     </w:p>
     <w:p>
@@ -6658,8 +6682,8 @@
         <w:tblLook w:val="0020" w:firstRow="1" w:lastRow="0" w:firstColumn="0" w:lastColumn="0" w:noHBand="0" w:noVBand="0"/>
       </w:tblPr>
       <w:tblGrid>
-        <w:gridCol w:w="2114"/>
-        <w:gridCol w:w="6912"/>
+        <w:gridCol w:w="2098"/>
+        <w:gridCol w:w="6928"/>
       </w:tblGrid>
       <w:tr>
         <w:trPr>
@@ -6668,7 +6692,7 @@
         </w:trPr>
         <w:tc>
           <w:tcPr>
-            <w:tcW w:w="2114" w:type="dxa"/>
+            <w:tcW w:w="2098" w:type="dxa"/>
             <w:shd w:val="clear" w:color="auto" w:fill="F2F5F9"/>
           </w:tcPr>
           <w:p>
@@ -6688,7 +6712,7 @@
         </w:tc>
         <w:tc>
           <w:tcPr>
-            <w:tcW w:w="6912" w:type="dxa"/>
+            <w:tcW w:w="6928" w:type="dxa"/>
             <w:shd w:val="clear" w:color="auto" w:fill="F2F5F9"/>
           </w:tcPr>
           <w:p>
@@ -6713,7 +6737,7 @@
         </w:trPr>
         <w:tc>
           <w:tcPr>
-            <w:tcW w:w="2114" w:type="dxa"/>
+            <w:tcW w:w="2098" w:type="dxa"/>
           </w:tcPr>
           <w:p>
             <w:pPr>
@@ -6727,26 +6751,26 @@
         </w:tc>
         <w:tc>
           <w:tcPr>
-            <w:tcW w:w="6912" w:type="dxa"/>
-          </w:tcPr>
-          <w:p>
-            <w:pPr>
-              <w:pStyle w:val="Compact"/>
-              <w:spacing w:before="40" w:after="40"/>
-            </w:pPr>
-            <w:r>
-              <w:t xml:space="preserve">Os doze itens do backlog. Na Sprint 3, o caminho da gravação: RF-01, RF-02, RF-05, o RNF-02 do relato e o RNF-03. Na Sprint 4, o que depende de haver o que listar e de existir a página, nesta ordem: RF-04, US-03, o RNF-02 da confirmação e o RNF-04; depois RF-03, US-02 e RNF-01; e a US-01, que só se completa com a página.</w:t>
-            </w:r>
-          </w:p>
-        </w:tc>
-      </w:tr>
-      <w:tr>
-        <w:trPr>
-          <w:cantSplit/>
-        </w:trPr>
-        <w:tc>
-          <w:tcPr>
-            <w:tcW w:w="2114" w:type="dxa"/>
+            <w:tcW w:w="6928" w:type="dxa"/>
+          </w:tcPr>
+          <w:p>
+            <w:pPr>
+              <w:pStyle w:val="Compact"/>
+              <w:spacing w:before="40" w:after="40"/>
+            </w:pPr>
+            <w:r>
+              <w:t xml:space="preserve">Os doze itens do backlog. Na Sprint 3, o caminho da gravação: RF-01, RF-02, RF-05, o RNF-02 do relato e o RNF-03 na função. Na Sprint 4, o que depende de haver o que listar e de existir a página, nesta ordem: RF-04, US-03, o RNF-02 da confirmação e o RNF-04; depois RF-03, US-02 e RNF-01; e a US-01, que só se completa com a página.</w:t>
+            </w:r>
+          </w:p>
+        </w:tc>
+      </w:tr>
+      <w:tr>
+        <w:trPr>
+          <w:cantSplit/>
+        </w:trPr>
+        <w:tc>
+          <w:tcPr>
+            <w:tcW w:w="2098" w:type="dxa"/>
           </w:tcPr>
           <w:p>
             <w:pPr>
@@ -6760,7 +6784,7 @@
         </w:tc>
         <w:tc>
           <w:tcPr>
-            <w:tcW w:w="6912" w:type="dxa"/>
+            <w:tcW w:w="6928" w:type="dxa"/>
           </w:tcPr>
           <w:p>
             <w:pPr>
@@ -6779,7 +6803,7 @@
         </w:trPr>
         <w:tc>
           <w:tcPr>
-            <w:tcW w:w="2114" w:type="dxa"/>
+            <w:tcW w:w="2098" w:type="dxa"/>
           </w:tcPr>
           <w:p>
             <w:pPr>
@@ -6793,7 +6817,7 @@
         </w:tc>
         <w:tc>
           <w:tcPr>
-            <w:tcW w:w="6912" w:type="dxa"/>
+            <w:tcW w:w="6928" w:type="dxa"/>
           </w:tcPr>
           <w:p>
             <w:pPr>
@@ -6812,7 +6836,7 @@
               <w:t xml:space="preserve">confirmar</w:t>
             </w:r>
             <w:r>
-              <w:t xml:space="preserve">, que o roteiro não ensina, e a razão está logo abaixo desta tabela. O RNF-01 não custa código, só medição. O RNF-02 e o RNF-04 custam uma condição na gravação cada um.</w:t>
+              <w:t xml:space="preserve">, que o roteiro não ensina, e a razão está logo abaixo desta tabela. O RNF-01 não custa código, só medição. O RNF-02 e o RNF-04 custam poucas linhas: condições na gravação, que a própria tabela confere.</w:t>
             </w:r>
           </w:p>
         </w:tc>
@@ -6881,9 +6905,9 @@
         <w:tblLook w:val="0020" w:firstRow="1" w:lastRow="0" w:firstColumn="0" w:lastColumn="0" w:noHBand="0" w:noVBand="0"/>
       </w:tblPr>
       <w:tblGrid>
-        <w:gridCol w:w="2378"/>
-        <w:gridCol w:w="2531"/>
-        <w:gridCol w:w="4117"/>
+        <w:gridCol w:w="2381"/>
+        <w:gridCol w:w="2496"/>
+        <w:gridCol w:w="4149"/>
       </w:tblGrid>
       <w:tr>
         <w:trPr>
@@ -6892,7 +6916,7 @@
         </w:trPr>
         <w:tc>
           <w:tcPr>
-            <w:tcW w:w="2378" w:type="dxa"/>
+            <w:tcW w:w="2381" w:type="dxa"/>
             <w:shd w:val="clear" w:color="auto" w:fill="F2F5F9"/>
           </w:tcPr>
           <w:p>
@@ -6912,7 +6936,7 @@
         </w:tc>
         <w:tc>
           <w:tcPr>
-            <w:tcW w:w="2531" w:type="dxa"/>
+            <w:tcW w:w="2496" w:type="dxa"/>
             <w:shd w:val="clear" w:color="auto" w:fill="F2F5F9"/>
           </w:tcPr>
           <w:p>
@@ -6932,7 +6956,7 @@
         </w:tc>
         <w:tc>
           <w:tcPr>
-            <w:tcW w:w="4117" w:type="dxa"/>
+            <w:tcW w:w="4149" w:type="dxa"/>
             <w:shd w:val="clear" w:color="auto" w:fill="F2F5F9"/>
           </w:tcPr>
           <w:p>
@@ -6957,7 +6981,7 @@
         </w:trPr>
         <w:tc>
           <w:tcPr>
-            <w:tcW w:w="2378" w:type="dxa"/>
+            <w:tcW w:w="2381" w:type="dxa"/>
           </w:tcPr>
           <w:p>
             <w:pPr>
@@ -6971,7 +6995,7 @@
         </w:tc>
         <w:tc>
           <w:tcPr>
-            <w:tcW w:w="2531" w:type="dxa"/>
+            <w:tcW w:w="2496" w:type="dxa"/>
           </w:tcPr>
           <w:p>
             <w:pPr>
@@ -6985,7 +7009,7 @@
         </w:tc>
         <w:tc>
           <w:tcPr>
-            <w:tcW w:w="4117" w:type="dxa"/>
+            <w:tcW w:w="4149" w:type="dxa"/>
           </w:tcPr>
           <w:p>
             <w:pPr>
@@ -7004,7 +7028,7 @@
         </w:trPr>
         <w:tc>
           <w:tcPr>
-            <w:tcW w:w="2378" w:type="dxa"/>
+            <w:tcW w:w="2381" w:type="dxa"/>
           </w:tcPr>
           <w:p>
             <w:pPr>
@@ -7029,7 +7053,7 @@
         </w:tc>
         <w:tc>
           <w:tcPr>
-            <w:tcW w:w="2531" w:type="dxa"/>
+            <w:tcW w:w="2496" w:type="dxa"/>
           </w:tcPr>
           <w:p>
             <w:pPr>
@@ -7043,7 +7067,7 @@
         </w:tc>
         <w:tc>
           <w:tcPr>
-            <w:tcW w:w="4117" w:type="dxa"/>
+            <w:tcW w:w="4149" w:type="dxa"/>
           </w:tcPr>
           <w:p>
             <w:pPr>
@@ -7062,7 +7086,7 @@
         </w:trPr>
         <w:tc>
           <w:tcPr>
-            <w:tcW w:w="2378" w:type="dxa"/>
+            <w:tcW w:w="2381" w:type="dxa"/>
           </w:tcPr>
           <w:p>
             <w:pPr>
@@ -7076,7 +7100,7 @@
         </w:tc>
         <w:tc>
           <w:tcPr>
-            <w:tcW w:w="2531" w:type="dxa"/>
+            <w:tcW w:w="2496" w:type="dxa"/>
           </w:tcPr>
           <w:p>
             <w:pPr>
@@ -7090,7 +7114,7 @@
         </w:tc>
         <w:tc>
           <w:tcPr>
-            <w:tcW w:w="4117" w:type="dxa"/>
+            <w:tcW w:w="4149" w:type="dxa"/>
           </w:tcPr>
           <w:p>
             <w:pPr>
@@ -7109,7 +7133,7 @@
         </w:trPr>
         <w:tc>
           <w:tcPr>
-            <w:tcW w:w="2378" w:type="dxa"/>
+            <w:tcW w:w="2381" w:type="dxa"/>
           </w:tcPr>
           <w:p>
             <w:pPr>
@@ -7123,7 +7147,7 @@
         </w:tc>
         <w:tc>
           <w:tcPr>
-            <w:tcW w:w="2531" w:type="dxa"/>
+            <w:tcW w:w="2496" w:type="dxa"/>
           </w:tcPr>
           <w:p>
             <w:pPr>
@@ -7137,26 +7161,73 @@
         </w:tc>
         <w:tc>
           <w:tcPr>
-            <w:tcW w:w="4117" w:type="dxa"/>
-          </w:tcPr>
-          <w:p>
-            <w:pPr>
-              <w:pStyle w:val="Compact"/>
-              <w:spacing w:before="40" w:after="40"/>
-            </w:pPr>
-            <w:r>
-              <w:t xml:space="preserve">O filtro é aplicado depois de ler: a consulta leria todos os relatos que a estação já teve, desde o primeiro dia, e o tempo cresceria para sempre. O preço desta decisão é um defeito conhecido: um reenvio que atravesse a meia-noite cai em outro dia, ganha outra chave e duplica o relato. A janela é de segundos, e fica declarada aqui.</w:t>
-            </w:r>
-          </w:p>
-        </w:tc>
-      </w:tr>
-      <w:tr>
-        <w:trPr>
-          <w:cantSplit/>
-        </w:trPr>
-        <w:tc>
-          <w:tcPr>
-            <w:tcW w:w="2378" w:type="dxa"/>
+            <w:tcW w:w="4149" w:type="dxa"/>
+          </w:tcPr>
+          <w:p>
+            <w:pPr>
+              <w:pStyle w:val="Compact"/>
+              <w:spacing w:before="40" w:after="40"/>
+            </w:pPr>
+            <w:r>
+              <w:t xml:space="preserve">O filtro é aplicado depois de ler: a consulta leria todos os relatos que a estação já teve, desde o primeiro dia, e o tempo cresceria para sempre. O preço desta decisão é um defeito conhecido: um reenvio que atravesse a meia-noite em UTC, 21h em Brasília, cai em outro dia, ganha outra chave e duplica o relato. A janela é de segundos, e fica declarada aqui.</w:t>
+            </w:r>
+          </w:p>
+        </w:tc>
+      </w:tr>
+      <w:tr>
+        <w:trPr>
+          <w:cantSplit/>
+        </w:trPr>
+        <w:tc>
+          <w:tcPr>
+            <w:tcW w:w="2381" w:type="dxa"/>
+          </w:tcPr>
+          <w:p>
+            <w:pPr>
+              <w:pStyle w:val="Compact"/>
+              <w:spacing w:before="40" w:after="40"/>
+            </w:pPr>
+            <w:r>
+              <w:t xml:space="preserve">O protocolo é derivado do código de envio, por um hash</w:t>
+            </w:r>
+          </w:p>
+        </w:tc>
+        <w:tc>
+          <w:tcPr>
+            <w:tcW w:w="2496" w:type="dxa"/>
+          </w:tcPr>
+          <w:p>
+            <w:pPr>
+              <w:pStyle w:val="Compact"/>
+              <w:spacing w:before="40" w:after="40"/>
+            </w:pPr>
+            <w:r>
+              <w:t xml:space="preserve">O protocolo é o próprio código gerado pela página</w:t>
+            </w:r>
+          </w:p>
+        </w:tc>
+        <w:tc>
+          <w:tcPr>
+            <w:tcW w:w="4149" w:type="dxa"/>
+          </w:tcPr>
+          <w:p>
+            <w:pPr>
+              <w:pStyle w:val="Compact"/>
+              <w:spacing w:before="40" w:after="40"/>
+            </w:pPr>
+            <w:r>
+              <w:t xml:space="preserve">O protocolo aparece na consulta. Se ele fosse o código, quem o lesse poderia reenviá-lo num outro dia, com outra foto, e a foto nova seria gravada no endereço da foto do relato original. Com o hash, conhecer o protocolo não permite chegar ao código.</w:t>
+            </w:r>
+          </w:p>
+        </w:tc>
+      </w:tr>
+      <w:tr>
+        <w:trPr>
+          <w:cantSplit/>
+        </w:trPr>
+        <w:tc>
+          <w:tcPr>
+            <w:tcW w:w="2381" w:type="dxa"/>
           </w:tcPr>
           <w:p>
             <w:pPr>
@@ -7170,7 +7241,7 @@
         </w:tc>
         <w:tc>
           <w:tcPr>
-            <w:tcW w:w="2531" w:type="dxa"/>
+            <w:tcW w:w="2496" w:type="dxa"/>
           </w:tcPr>
           <w:p>
             <w:pPr>
@@ -7184,7 +7255,7 @@
         </w:tc>
         <w:tc>
           <w:tcPr>
-            <w:tcW w:w="4117" w:type="dxa"/>
+            <w:tcW w:w="4149" w:type="dxa"/>
           </w:tcPr>
           <w:p>
             <w:pPr>
@@ -7203,7 +7274,7 @@
         </w:trPr>
         <w:tc>
           <w:tcPr>
-            <w:tcW w:w="2378" w:type="dxa"/>
+            <w:tcW w:w="2381" w:type="dxa"/>
           </w:tcPr>
           <w:p>
             <w:pPr>
@@ -7217,7 +7288,7 @@
         </w:tc>
         <w:tc>
           <w:tcPr>
-            <w:tcW w:w="2531" w:type="dxa"/>
+            <w:tcW w:w="2496" w:type="dxa"/>
           </w:tcPr>
           <w:p>
             <w:pPr>
@@ -7231,7 +7302,7 @@
         </w:tc>
         <w:tc>
           <w:tcPr>
-            <w:tcW w:w="4117" w:type="dxa"/>
+            <w:tcW w:w="4149" w:type="dxa"/>
           </w:tcPr>
           <w:p>
             <w:pPr>
@@ -7250,7 +7321,7 @@
         </w:trPr>
         <w:tc>
           <w:tcPr>
-            <w:tcW w:w="2378" w:type="dxa"/>
+            <w:tcW w:w="2381" w:type="dxa"/>
           </w:tcPr>
           <w:p>
             <w:pPr>
@@ -7264,7 +7335,7 @@
         </w:tc>
         <w:tc>
           <w:tcPr>
-            <w:tcW w:w="2531" w:type="dxa"/>
+            <w:tcW w:w="2496" w:type="dxa"/>
           </w:tcPr>
           <w:p>
             <w:pPr>
@@ -7286,7 +7357,7 @@
         </w:tc>
         <w:tc>
           <w:tcPr>
-            <w:tcW w:w="4117" w:type="dxa"/>
+            <w:tcW w:w="4149" w:type="dxa"/>
           </w:tcPr>
           <w:p>
             <w:pPr>
@@ -7316,7 +7387,7 @@
         </w:trPr>
         <w:tc>
           <w:tcPr>
-            <w:tcW w:w="2378" w:type="dxa"/>
+            <w:tcW w:w="2381" w:type="dxa"/>
           </w:tcPr>
           <w:p>
             <w:pPr>
@@ -7330,7 +7401,7 @@
         </w:tc>
         <w:tc>
           <w:tcPr>
-            <w:tcW w:w="2531" w:type="dxa"/>
+            <w:tcW w:w="2496" w:type="dxa"/>
           </w:tcPr>
           <w:p>
             <w:pPr>
@@ -7344,7 +7415,7 @@
         </w:tc>
         <w:tc>
           <w:tcPr>
-            <w:tcW w:w="4117" w:type="dxa"/>
+            <w:tcW w:w="4149" w:type="dxa"/>
           </w:tcPr>
           <w:p>
             <w:pPr>

</xml_diff>

<commit_message>
docs: cinco requisitos não funcionais, um para cada RF da Sprint 1
Orientação da professora em 15/10: os RNFs da Sprint 2 partem dos cinco
requisitos funcionais da Sprint 1. O anonimato no registro e nas fotos e
o limite de confirmações passam a decisões da seção 9. O diagrama ganha
os novos rótulos, tema claro e menos setas cruzadas.

Co-Authored-By: Claude Opus 5.5 <noreply@anthropic.com>
</commit_message>
<xml_diff>
--- a/docs/02-arquitetura.docx
+++ b/docs/02-arquitetura.docx
@@ -90,7 +90,7 @@
         <w:br/>
       </w:r>
       <w:r>
-        <w:t xml:space="preserve">Versão: 1.0</w:t>
+        <w:t xml:space="preserve">Versão: 1.1</w:t>
       </w:r>
     </w:p>
     <w:p>
@@ -123,922 +123,7 @@
         <w:pStyle w:val="BodyText"/>
       </w:pPr>
       <w:r>
-        <w:t xml:space="preserve">Os quatro saem do que a Sprint 1 deixou escrito. A Performance e a Reliability do FURPS viraram o RNF-01 e o RNF-02, agora com número. O RNF-03 dá número ao RD-01, o relato anônimo, no ponto em que ele é mais fácil de quebrar sem querer. O RNF-04 cumpre o que a seção 8 da Sprint 1 prometeu: o risco de confirmações repetidas volta aqui como requisito. As outras três linhas do FURPS não viraram requisito não funcional, e a seção 1.2 diz para onde cada uma foi.</w:t>
-      </w:r>
-    </w:p>
-    <w:p>
-      <w:pPr>
-        <w:pStyle w:val="Heading3"/>
-      </w:pPr>
-      <w:r>
-        <w:t xml:space="preserve">RNF-01</w:t>
-      </w:r>
-    </w:p>
-    <w:p>
-      <w:pPr>
-        <w:pStyle w:val="SourceCode"/>
-      </w:pPr>
-      <w:r>
-        <w:rPr>
-          <w:rStyle w:val="VerbatimChar"/>
-        </w:rPr>
-        <w:t xml:space="preserve">requisito</w:t>
-      </w:r>
-      <w:r>
-        <w:br/>
-      </w:r>
-      <w:r>
-        <w:rPr>
-          <w:rStyle w:val="VerbatimChar"/>
-        </w:rPr>
-        <w:t xml:space="preserve">  [Performance] A consulta dos relatos de uma estação deve</w:t>
-      </w:r>
-      <w:r>
-        <w:br/>
-      </w:r>
-      <w:r>
-        <w:rPr>
-          <w:rStyle w:val="VerbatimChar"/>
-        </w:rPr>
-        <w:t xml:space="preserve">  responder em no máximo 500 ms no percentil 95, com até</w:t>
-      </w:r>
-      <w:r>
-        <w:br/>
-      </w:r>
-      <w:r>
-        <w:rPr>
-          <w:rStyle w:val="VerbatimChar"/>
-        </w:rPr>
-        <w:t xml:space="preserve">  300 relatos dos últimos 30 dias na estação consultada e</w:t>
-      </w:r>
-      <w:r>
-        <w:br/>
-      </w:r>
-      <w:r>
-        <w:rPr>
-          <w:rStyle w:val="VerbatimChar"/>
-        </w:rPr>
-        <w:t xml:space="preserve">  30 requisições seguidas.</w:t>
-      </w:r>
-      <w:r>
-        <w:br/>
-      </w:r>
-      <w:r>
-        <w:rPr>
-          <w:rStyle w:val="VerbatimChar"/>
-        </w:rPr>
-        <w:t xml:space="preserve"/>
-      </w:r>
-      <w:r>
-        <w:br/>
-      </w:r>
-      <w:r>
-        <w:rPr>
-          <w:rStyle w:val="VerbatimChar"/>
-        </w:rPr>
-        <w:t xml:space="preserve">serviço AWS</w:t>
-      </w:r>
-      <w:r>
-        <w:br/>
-      </w:r>
-      <w:r>
-        <w:rPr>
-          <w:rStyle w:val="VerbatimChar"/>
-        </w:rPr>
-        <w:t xml:space="preserve">  Amazon DynamoDB</w:t>
-      </w:r>
-      <w:r>
-        <w:br/>
-      </w:r>
-      <w:r>
-        <w:rPr>
-          <w:rStyle w:val="VerbatimChar"/>
-        </w:rPr>
-        <w:t xml:space="preserve"/>
-      </w:r>
-      <w:r>
-        <w:br/>
-      </w:r>
-      <w:r>
-        <w:rPr>
-          <w:rStyle w:val="VerbatimChar"/>
-        </w:rPr>
-        <w:t xml:space="preserve">pilar do Well-Architected</w:t>
-      </w:r>
-      <w:r>
-        <w:br/>
-      </w:r>
-      <w:r>
-        <w:rPr>
-          <w:rStyle w:val="VerbatimChar"/>
-        </w:rPr>
-        <w:t xml:space="preserve">  4, Eficiência de Performance</w:t>
-      </w:r>
-      <w:r>
-        <w:br/>
-      </w:r>
-      <w:r>
-        <w:rPr>
-          <w:rStyle w:val="VerbatimChar"/>
-        </w:rPr>
-        <w:t xml:space="preserve"/>
-      </w:r>
-      <w:r>
-        <w:br/>
-      </w:r>
-      <w:r>
-        <w:rPr>
-          <w:rStyle w:val="VerbatimChar"/>
-        </w:rPr>
-        <w:t xml:space="preserve">razão</w:t>
-      </w:r>
-      <w:r>
-        <w:br/>
-      </w:r>
-      <w:r>
-        <w:rPr>
-          <w:rStyle w:val="VerbatimChar"/>
-        </w:rPr>
-        <w:t xml:space="preserve">  A chave de partição é a estação, e a chave de ordenação</w:t>
-      </w:r>
-      <w:r>
-        <w:br/>
-      </w:r>
-      <w:r>
-        <w:rPr>
-          <w:rStyle w:val="VerbatimChar"/>
-        </w:rPr>
-        <w:t xml:space="preserve">  começa pelo dia do envio. A consulta vai direto à</w:t>
-      </w:r>
-      <w:r>
-        <w:br/>
-      </w:r>
-      <w:r>
-        <w:rPr>
-          <w:rStyle w:val="VerbatimChar"/>
-        </w:rPr>
-        <w:t xml:space="preserve">  partição da estação e lê só a fatia dos últimos 30 dias:</w:t>
-      </w:r>
-      <w:r>
-        <w:br/>
-      </w:r>
-      <w:r>
-        <w:rPr>
-          <w:rStyle w:val="VerbatimChar"/>
-        </w:rPr>
-        <w:t xml:space="preserve">  o relato de dois anos atrás nem chega a ser lido. O</w:t>
-      </w:r>
-      <w:r>
-        <w:br/>
-      </w:r>
-      <w:r>
-        <w:rPr>
-          <w:rStyle w:val="VerbatimChar"/>
-        </w:rPr>
-        <w:t xml:space="preserve">  tempo cresce com a janela de uma estação, e não com a</w:t>
-      </w:r>
-      <w:r>
-        <w:br/>
-      </w:r>
-      <w:r>
-        <w:rPr>
-          <w:rStyle w:val="VerbatimChar"/>
-        </w:rPr>
-        <w:t xml:space="preserve">  tabela inteira. E a resposta leva o endereço da foto, e</w:t>
-      </w:r>
-      <w:r>
-        <w:br/>
-      </w:r>
-      <w:r>
-        <w:rPr>
-          <w:rStyle w:val="VerbatimChar"/>
-        </w:rPr>
-        <w:t xml:space="preserve">  não a foto: a lista chega inteira antes de a primeira</w:t>
-      </w:r>
-      <w:r>
-        <w:br/>
-      </w:r>
-      <w:r>
-        <w:rPr>
-          <w:rStyle w:val="VerbatimChar"/>
-        </w:rPr>
-        <w:t xml:space="preserve">  imagem começar a baixar.</w:t>
-      </w:r>
-    </w:p>
-    <w:p>
-      <w:pPr>
-        <w:pStyle w:val="BodyText"/>
-      </w:pPr>
-      <w:r>
-        <w:t xml:space="preserve">De onde vêm os números. A consulta é feita na plataforma, com o sinal fraco, e a parte da espera que vem da rede da estação não é nossa; a parte que é nossa tem de ser pequena para que a soma das duas caiba no tempo de o trem parar. Os 300 relatos equivalem a dez por dia, todo dia, na mesma estação: muito mais do que qualquer estação terá no começo, e o número precisa continuar valendo quando o uso crescer.</w:t>
-      </w:r>
-    </w:p>
-    <w:p>
-      <w:pPr>
-        <w:pStyle w:val="Heading3"/>
-      </w:pPr>
-      <w:r>
-        <w:t xml:space="preserve">RNF-02</w:t>
-      </w:r>
-    </w:p>
-    <w:p>
-      <w:pPr>
-        <w:pStyle w:val="SourceCode"/>
-      </w:pPr>
-      <w:r>
-        <w:rPr>
-          <w:rStyle w:val="VerbatimChar"/>
-        </w:rPr>
-        <w:t xml:space="preserve">requisito</w:t>
-      </w:r>
-      <w:r>
-        <w:br/>
-      </w:r>
-      <w:r>
-        <w:rPr>
-          <w:rStyle w:val="VerbatimChar"/>
-        </w:rPr>
-        <w:t xml:space="preserve">  [Reliability] O reenvio de um mesmo relato, ou de uma</w:t>
-      </w:r>
-      <w:r>
-        <w:br/>
-      </w:r>
-      <w:r>
-        <w:rPr>
-          <w:rStyle w:val="VerbatimChar"/>
-        </w:rPr>
-        <w:t xml:space="preserve">  mesma confirmação, deve gravar zero duplicados: com 5</w:t>
-      </w:r>
-      <w:r>
-        <w:br/>
-      </w:r>
-      <w:r>
-        <w:rPr>
-          <w:rStyle w:val="VerbatimChar"/>
-        </w:rPr>
-        <w:t xml:space="preserve">  reenvios seguidos do mesmo pedido, a estação ganha</w:t>
-      </w:r>
-      <w:r>
-        <w:br/>
-      </w:r>
-      <w:r>
-        <w:rPr>
-          <w:rStyle w:val="VerbatimChar"/>
-        </w:rPr>
-        <w:t xml:space="preserve">  exatamente 1 relato e 1 foto, e o relato confirmado</w:t>
-      </w:r>
-      <w:r>
-        <w:br/>
-      </w:r>
-      <w:r>
-        <w:rPr>
-          <w:rStyle w:val="VerbatimChar"/>
-        </w:rPr>
-        <w:t xml:space="preserve">  ganha exatamente 1 confirmação.</w:t>
-      </w:r>
-      <w:r>
-        <w:br/>
-      </w:r>
-      <w:r>
-        <w:rPr>
-          <w:rStyle w:val="VerbatimChar"/>
-        </w:rPr>
-        <w:t xml:space="preserve"/>
-      </w:r>
-      <w:r>
-        <w:br/>
-      </w:r>
-      <w:r>
-        <w:rPr>
-          <w:rStyle w:val="VerbatimChar"/>
-        </w:rPr>
-        <w:t xml:space="preserve">serviço AWS</w:t>
-      </w:r>
-      <w:r>
-        <w:br/>
-      </w:r>
-      <w:r>
-        <w:rPr>
-          <w:rStyle w:val="VerbatimChar"/>
-        </w:rPr>
-        <w:t xml:space="preserve">  Amazon DynamoDB, com gravação condicional, e Amazon S3,</w:t>
-      </w:r>
-      <w:r>
-        <w:br/>
-      </w:r>
-      <w:r>
-        <w:rPr>
-          <w:rStyle w:val="VerbatimChar"/>
-        </w:rPr>
-        <w:t xml:space="preserve">  com a foto guardada sob o protocolo</w:t>
-      </w:r>
-      <w:r>
-        <w:br/>
-      </w:r>
-      <w:r>
-        <w:rPr>
-          <w:rStyle w:val="VerbatimChar"/>
-        </w:rPr>
-        <w:t xml:space="preserve"/>
-      </w:r>
-      <w:r>
-        <w:br/>
-      </w:r>
-      <w:r>
-        <w:rPr>
-          <w:rStyle w:val="VerbatimChar"/>
-        </w:rPr>
-        <w:t xml:space="preserve">pilar do Well-Architected</w:t>
-      </w:r>
-      <w:r>
-        <w:br/>
-      </w:r>
-      <w:r>
-        <w:rPr>
-          <w:rStyle w:val="VerbatimChar"/>
-        </w:rPr>
-        <w:t xml:space="preserve">  3, Confiabilidade</w:t>
-      </w:r>
-      <w:r>
-        <w:br/>
-      </w:r>
-      <w:r>
-        <w:rPr>
-          <w:rStyle w:val="VerbatimChar"/>
-        </w:rPr>
-        <w:t xml:space="preserve"/>
-      </w:r>
-      <w:r>
-        <w:br/>
-      </w:r>
-      <w:r>
-        <w:rPr>
-          <w:rStyle w:val="VerbatimChar"/>
-        </w:rPr>
-        <w:t xml:space="preserve">razão</w:t>
-      </w:r>
-      <w:r>
-        <w:br/>
-      </w:r>
-      <w:r>
-        <w:rPr>
-          <w:rStyle w:val="VerbatimChar"/>
-        </w:rPr>
-        <w:t xml:space="preserve">  No túnel o sinal cai, e o envio pode ter sido gravado</w:t>
-      </w:r>
-      <w:r>
-        <w:br/>
-      </w:r>
-      <w:r>
-        <w:rPr>
-          <w:rStyle w:val="VerbatimChar"/>
-        </w:rPr>
-        <w:t xml:space="preserve">  com a resposta perdida no caminho. Tentar de novo é o</w:t>
-      </w:r>
-      <w:r>
-        <w:br/>
-      </w:r>
-      <w:r>
-        <w:rPr>
-          <w:rStyle w:val="VerbatimChar"/>
-        </w:rPr>
-        <w:t xml:space="preserve">  certo a fazer, e só é seguro se o sistema reconhecer o</w:t>
-      </w:r>
-      <w:r>
-        <w:br/>
-      </w:r>
-      <w:r>
-        <w:rPr>
-          <w:rStyle w:val="VerbatimChar"/>
-        </w:rPr>
-        <w:t xml:space="preserve">  pedido repetido. A página gera um código aleatório</w:t>
-      </w:r>
-      <w:r>
-        <w:br/>
-      </w:r>
-      <w:r>
-        <w:rPr>
-          <w:rStyle w:val="VerbatimChar"/>
-        </w:rPr>
-        <w:t xml:space="preserve">  para cada envio e repete o mesmo código a cada nova</w:t>
-      </w:r>
-      <w:r>
-        <w:br/>
-      </w:r>
-      <w:r>
-        <w:rPr>
-          <w:rStyle w:val="VerbatimChar"/>
-        </w:rPr>
-        <w:t xml:space="preserve">  tentativa; a função deriva dele o protocolo. Se o</w:t>
-      </w:r>
-      <w:r>
-        <w:br/>
-      </w:r>
-      <w:r>
-        <w:rPr>
-          <w:rStyle w:val="VerbatimChar"/>
-        </w:rPr>
-        <w:t xml:space="preserve">  protocolo já existe na tabela, é um reenvio: a função</w:t>
-      </w:r>
-      <w:r>
-        <w:br/>
-      </w:r>
-      <w:r>
-        <w:rPr>
-          <w:rStyle w:val="VerbatimChar"/>
-        </w:rPr>
-        <w:t xml:space="preserve">  devolve o mesmo protocolo sem tocar na foto nem na</w:t>
-      </w:r>
-      <w:r>
-        <w:br/>
-      </w:r>
-      <w:r>
-        <w:rPr>
-          <w:rStyle w:val="VerbatimChar"/>
-        </w:rPr>
-        <w:t xml:space="preserve">  tabela. A confirmação faz o mesmo com o código da</w:t>
-      </w:r>
-      <w:r>
-        <w:br/>
-      </w:r>
-      <w:r>
-        <w:rPr>
-          <w:rStyle w:val="VerbatimChar"/>
-        </w:rPr>
-        <w:t xml:space="preserve">  última confirmação somada.</w:t>
-      </w:r>
-    </w:p>
-    <w:p>
-      <w:pPr>
-        <w:pStyle w:val="BodyText"/>
-      </w:pPr>
-      <w:r>
-        <w:t xml:space="preserve">O protocolo é um resumo do código, os 16 primeiros caracteres do seu SHA-256, e não o próprio código. O protocolo aparece na consulta, porque é por ele que se confirma um relato; o código, não. Se o protocolo fosse o código, quem o lesse na consulta poderia reenviá-lo com outra foto e trocar a foto de um relato alheio (seção 9). E o código identifica o envio, e não quem enviou: é novo a cada relato e a cada confirmação, e a página o descarta quando recebe a resposta. Por isso ele não fere o RD-01.</w:t>
-      </w:r>
-    </w:p>
-    <w:p>
-      <w:pPr>
-        <w:pStyle w:val="Heading3"/>
-      </w:pPr>
-      <w:r>
-        <w:t xml:space="preserve">RNF-03</w:t>
-      </w:r>
-    </w:p>
-    <w:p>
-      <w:pPr>
-        <w:pStyle w:val="SourceCode"/>
-      </w:pPr>
-      <w:r>
-        <w:rPr>
-          <w:rStyle w:val="VerbatimChar"/>
-        </w:rPr>
-        <w:t xml:space="preserve">requisito</w:t>
-      </w:r>
-      <w:r>
-        <w:br/>
-      </w:r>
-      <w:r>
-        <w:rPr>
-          <w:rStyle w:val="VerbatimChar"/>
-        </w:rPr>
-        <w:t xml:space="preserve">  [Segurança] Nenhum dado de quem relata ou confirma deve</w:t>
-      </w:r>
-      <w:r>
-        <w:br/>
-      </w:r>
-      <w:r>
-        <w:rPr>
-          <w:rStyle w:val="VerbatimChar"/>
-        </w:rPr>
-        <w:t xml:space="preserve">  ficar guardado: zero ocorrências de endereço IP, de</w:t>
-      </w:r>
-      <w:r>
-        <w:br/>
-      </w:r>
-      <w:r>
-        <w:rPr>
-          <w:rStyle w:val="VerbatimChar"/>
-        </w:rPr>
-        <w:t xml:space="preserve">  identificação do navegador e de metadados EXIF de</w:t>
-      </w:r>
-      <w:r>
-        <w:br/>
-      </w:r>
-      <w:r>
-        <w:rPr>
-          <w:rStyle w:val="VerbatimChar"/>
-        </w:rPr>
-        <w:t xml:space="preserve">  localização ou de aparelho, conferidas no CloudWatch</w:t>
-      </w:r>
-      <w:r>
-        <w:br/>
-      </w:r>
-      <w:r>
-        <w:rPr>
-          <w:rStyle w:val="VerbatimChar"/>
-        </w:rPr>
-        <w:t xml:space="preserve">  Logs, na tabela e nas fotos do bucket depois de 20</w:t>
-      </w:r>
-      <w:r>
-        <w:br/>
-      </w:r>
-      <w:r>
-        <w:rPr>
-          <w:rStyle w:val="VerbatimChar"/>
-        </w:rPr>
-        <w:t xml:space="preserve">  relatos e 20 confirmações.</w:t>
-      </w:r>
-      <w:r>
-        <w:br/>
-      </w:r>
-      <w:r>
-        <w:rPr>
-          <w:rStyle w:val="VerbatimChar"/>
-        </w:rPr>
-        <w:t xml:space="preserve"/>
-      </w:r>
-      <w:r>
-        <w:br/>
-      </w:r>
-      <w:r>
-        <w:rPr>
-          <w:rStyle w:val="VerbatimChar"/>
-        </w:rPr>
-        <w:t xml:space="preserve">serviço AWS</w:t>
-      </w:r>
-      <w:r>
-        <w:br/>
-      </w:r>
-      <w:r>
-        <w:rPr>
-          <w:rStyle w:val="VerbatimChar"/>
-        </w:rPr>
-        <w:t xml:space="preserve">  AWS Lambda e Amazon CloudWatch Logs</w:t>
-      </w:r>
-      <w:r>
-        <w:br/>
-      </w:r>
-      <w:r>
-        <w:rPr>
-          <w:rStyle w:val="VerbatimChar"/>
-        </w:rPr>
-        <w:t xml:space="preserve"/>
-      </w:r>
-      <w:r>
-        <w:br/>
-      </w:r>
-      <w:r>
-        <w:rPr>
-          <w:rStyle w:val="VerbatimChar"/>
-        </w:rPr>
-        <w:t xml:space="preserve">pilar do Well-Architected</w:t>
-      </w:r>
-      <w:r>
-        <w:br/>
-      </w:r>
-      <w:r>
-        <w:rPr>
-          <w:rStyle w:val="VerbatimChar"/>
-        </w:rPr>
-        <w:t xml:space="preserve">  2, Segurança</w:t>
-      </w:r>
-      <w:r>
-        <w:br/>
-      </w:r>
-      <w:r>
-        <w:rPr>
-          <w:rStyle w:val="VerbatimChar"/>
-        </w:rPr>
-        <w:t xml:space="preserve"/>
-      </w:r>
-      <w:r>
-        <w:br/>
-      </w:r>
-      <w:r>
-        <w:rPr>
-          <w:rStyle w:val="VerbatimChar"/>
-        </w:rPr>
-        <w:t xml:space="preserve">razão</w:t>
-      </w:r>
-      <w:r>
-        <w:br/>
-      </w:r>
-      <w:r>
-        <w:rPr>
-          <w:rStyle w:val="VerbatimChar"/>
-        </w:rPr>
-        <w:t xml:space="preserve">  O RD-01 não se quebra por um campo de nome no</w:t>
-      </w:r>
-      <w:r>
-        <w:br/>
-      </w:r>
-      <w:r>
-        <w:rPr>
-          <w:rStyle w:val="VerbatimChar"/>
-        </w:rPr>
-        <w:t xml:space="preserve">  formulário: quebra-se sem que ninguém perceba. O API</w:t>
-      </w:r>
-      <w:r>
-        <w:br/>
-      </w:r>
-      <w:r>
-        <w:rPr>
-          <w:rStyle w:val="VerbatimChar"/>
-        </w:rPr>
-        <w:t xml:space="preserve">  Gateway entrega à função, dentro do evento, o IP e o</w:t>
-      </w:r>
-      <w:r>
-        <w:br/>
-      </w:r>
-      <w:r>
-        <w:rPr>
-          <w:rStyle w:val="VerbatimChar"/>
-        </w:rPr>
-        <w:t xml:space="preserve">  navegador de quem chamou, e um print(event), o hábito</w:t>
-      </w:r>
-      <w:r>
-        <w:br/>
-      </w:r>
-      <w:r>
-        <w:rPr>
-          <w:rStyle w:val="VerbatimChar"/>
-        </w:rPr>
-        <w:t xml:space="preserve">  mais comum de depuração, gravaria o IP de cada</w:t>
-      </w:r>
-      <w:r>
-        <w:br/>
-      </w:r>
-      <w:r>
-        <w:rPr>
-          <w:rStyle w:val="VerbatimChar"/>
-        </w:rPr>
-        <w:t xml:space="preserve">  passageira no CloudWatch. A foto tirada no celular</w:t>
-      </w:r>
-      <w:r>
-        <w:br/>
-      </w:r>
-      <w:r>
-        <w:rPr>
-          <w:rStyle w:val="VerbatimChar"/>
-        </w:rPr>
-        <w:t xml:space="preserve">  carrega no EXIF a latitude, a longitude e o modelo do</w:t>
-      </w:r>
-      <w:r>
-        <w:br/>
-      </w:r>
-      <w:r>
-        <w:rPr>
-          <w:rStyle w:val="VerbatimChar"/>
-        </w:rPr>
-        <w:t xml:space="preserve">  aparelho. Por isso a função registra só campos</w:t>
-      </w:r>
-      <w:r>
-        <w:br/>
-      </w:r>
-      <w:r>
-        <w:rPr>
-          <w:rStyle w:val="VerbatimChar"/>
-        </w:rPr>
-        <w:t xml:space="preserve">  nomeados (operação, estação, resultado) e recusa</w:t>
-      </w:r>
-      <w:r>
-        <w:br/>
-      </w:r>
-      <w:r>
-        <w:rPr>
-          <w:rStyle w:val="VerbatimChar"/>
-        </w:rPr>
-        <w:t xml:space="preserve">  foto com EXIF; a página limpa a foto antes de enviar.</w:t>
-      </w:r>
-    </w:p>
-    <w:p>
-      <w:pPr>
-        <w:pStyle w:val="BodyText"/>
-      </w:pPr>
-      <w:r>
-        <w:t xml:space="preserve">O registro de acesso do próprio API Gateway, que guardaria o IP de cada chamada, fica desligado pelo mesmo motivo.</w:t>
-      </w:r>
-    </w:p>
-    <w:p>
-      <w:pPr>
-        <w:pStyle w:val="BodyText"/>
-      </w:pPr>
-      <w:r>
-        <w:t xml:space="preserve">O RNF-03 acrescenta um cuidado ao critério US-01, cenário 1, da Sprint 1: a foto JPEG de 2 MB tem de chegar sem EXIF. Pela página ela chega, porque a página a limpa; mandada direto à API como saiu da câmera, ela seria recusada, e é isso que o RNF-03 pede.</w:t>
-      </w:r>
-    </w:p>
-    <w:p>
-      <w:pPr>
-        <w:pStyle w:val="Heading3"/>
-      </w:pPr>
-      <w:r>
-        <w:t xml:space="preserve">RNF-04</w:t>
-      </w:r>
-    </w:p>
-    <w:p>
-      <w:pPr>
-        <w:pStyle w:val="SourceCode"/>
-      </w:pPr>
-      <w:r>
-        <w:rPr>
-          <w:rStyle w:val="VerbatimChar"/>
-        </w:rPr>
-        <w:t xml:space="preserve">requisito</w:t>
-      </w:r>
-      <w:r>
-        <w:br/>
-      </w:r>
-      <w:r>
-        <w:rPr>
-          <w:rStyle w:val="VerbatimChar"/>
-        </w:rPr>
-        <w:t xml:space="preserve">  [Segurança] Um mesmo relato deve somar no máximo 1</w:t>
-      </w:r>
-      <w:r>
-        <w:br/>
-      </w:r>
-      <w:r>
-        <w:rPr>
-          <w:rStyle w:val="VerbatimChar"/>
-        </w:rPr>
-        <w:t xml:space="preserve">  confirmação a cada 10 minutos, com 20 confirmações</w:t>
-      </w:r>
-      <w:r>
-        <w:br/>
-      </w:r>
-      <w:r>
-        <w:rPr>
-          <w:rStyle w:val="VerbatimChar"/>
-        </w:rPr>
-        <w:t xml:space="preserve">  disparadas em sequência contra o mesmo relato.</w:t>
-      </w:r>
-      <w:r>
-        <w:br/>
-      </w:r>
-      <w:r>
-        <w:rPr>
-          <w:rStyle w:val="VerbatimChar"/>
-        </w:rPr>
-        <w:t xml:space="preserve"/>
-      </w:r>
-      <w:r>
-        <w:br/>
-      </w:r>
-      <w:r>
-        <w:rPr>
-          <w:rStyle w:val="VerbatimChar"/>
-        </w:rPr>
-        <w:t xml:space="preserve">serviço AWS</w:t>
-      </w:r>
-      <w:r>
-        <w:br/>
-      </w:r>
-      <w:r>
-        <w:rPr>
-          <w:rStyle w:val="VerbatimChar"/>
-        </w:rPr>
-        <w:t xml:space="preserve">  Amazon DynamoDB, com atualização condicional</w:t>
-      </w:r>
-      <w:r>
-        <w:br/>
-      </w:r>
-      <w:r>
-        <w:rPr>
-          <w:rStyle w:val="VerbatimChar"/>
-        </w:rPr>
-        <w:t xml:space="preserve"/>
-      </w:r>
-      <w:r>
-        <w:br/>
-      </w:r>
-      <w:r>
-        <w:rPr>
-          <w:rStyle w:val="VerbatimChar"/>
-        </w:rPr>
-        <w:t xml:space="preserve">pilar do Well-Architected</w:t>
-      </w:r>
-      <w:r>
-        <w:br/>
-      </w:r>
-      <w:r>
-        <w:rPr>
-          <w:rStyle w:val="VerbatimChar"/>
-        </w:rPr>
-        <w:t xml:space="preserve">  2, Segurança</w:t>
-      </w:r>
-      <w:r>
-        <w:br/>
-      </w:r>
-      <w:r>
-        <w:rPr>
-          <w:rStyle w:val="VerbatimChar"/>
-        </w:rPr>
-        <w:t xml:space="preserve"/>
-      </w:r>
-      <w:r>
-        <w:br/>
-      </w:r>
-      <w:r>
-        <w:rPr>
-          <w:rStyle w:val="VerbatimChar"/>
-        </w:rPr>
-        <w:t xml:space="preserve">razão</w:t>
-      </w:r>
-      <w:r>
-        <w:br/>
-      </w:r>
-      <w:r>
-        <w:rPr>
-          <w:rStyle w:val="VerbatimChar"/>
-        </w:rPr>
-        <w:t xml:space="preserve">  Impedir que a mesma pessoa confirme duas vezes exigiria</w:t>
-      </w:r>
-      <w:r>
-        <w:br/>
-      </w:r>
-      <w:r>
-        <w:rPr>
-          <w:rStyle w:val="VerbatimChar"/>
-        </w:rPr>
-        <w:t xml:space="preserve">  saber quem ela é, e o RD-01 proíbe. O que dá para</w:t>
-      </w:r>
-      <w:r>
-        <w:br/>
-      </w:r>
-      <w:r>
-        <w:rPr>
-          <w:rStyle w:val="VerbatimChar"/>
-        </w:rPr>
-        <w:t xml:space="preserve">  limitar sem identificar ninguém é a velocidade: a</w:t>
-      </w:r>
-      <w:r>
-        <w:br/>
-      </w:r>
-      <w:r>
-        <w:rPr>
-          <w:rStyle w:val="VerbatimChar"/>
-        </w:rPr>
-        <w:t xml:space="preserve">  confirmação só é somada se a última tiver mais de 10</w:t>
-      </w:r>
-      <w:r>
-        <w:br/>
-      </w:r>
-      <w:r>
-        <w:rPr>
-          <w:rStyle w:val="VerbatimChar"/>
-        </w:rPr>
-        <w:t xml:space="preserve">  minutos, o que a tabela confere na mesma atualização</w:t>
-      </w:r>
-      <w:r>
-        <w:br/>
-      </w:r>
-      <w:r>
-        <w:rPr>
-          <w:rStyle w:val="VerbatimChar"/>
-        </w:rPr>
-        <w:t xml:space="preserve">  que soma. Cinquenta confirmações falsas, que hoje</w:t>
-      </w:r>
-      <w:r>
-        <w:br/>
-      </w:r>
-      <w:r>
-        <w:rPr>
-          <w:rStyle w:val="VerbatimChar"/>
-        </w:rPr>
-        <w:t xml:space="preserve">  caberiam em um segundo, passam a exigir mais de oito</w:t>
-      </w:r>
-      <w:r>
-        <w:br/>
-      </w:r>
-      <w:r>
-        <w:rPr>
-          <w:rStyle w:val="VerbatimChar"/>
-        </w:rPr>
-        <w:t xml:space="preserve">  horas.</w:t>
-      </w:r>
-    </w:p>
-    <w:p>
-      <w:pPr>
-        <w:pStyle w:val="BodyText"/>
-      </w:pPr>
-      <w:r>
-        <w:t xml:space="preserve">O limite não impede a fraude; ele a torna lenta, e o risco que sobra está declarado na seção 9. Ele também não atrapalha o uso real: duas passageiras que confirmam o mesmo problema em menos de 10 minutos não acrescentam informação, e a segunda recebe a mensagem de que o relato acabou de ser confirmado.</w:t>
-      </w:r>
-    </w:p>
-    <w:p>
-      <w:pPr>
-        <w:pStyle w:val="BodyText"/>
-      </w:pPr>
-      <w:r>
-        <w:t xml:space="preserve">O RNF-04 também acrescenta um dado ao critério US-03, cenário 1, da Sprint 1: para que o relato A passe de 2 para 3 confirmações, a última confirmação dele tem de ter mais de 10 minutos. Isso entra no "Dado que" quando o teste for escrito, na Sprint 5.</w:t>
-      </w:r>
-    </w:p>
-    <w:p>
-      <w:pPr>
-        <w:pStyle w:val="Heading3"/>
-      </w:pPr>
-      <w:r>
-        <w:t xml:space="preserve">1.1 Resumo</w:t>
+        <w:t xml:space="preserve">Os cinco requisitos não funcionais saem dos cinco requisitos funcionais da Sprint 1, um para um: o RNF-01 diz com que qualidade o RF-01 tem de acontecer, o RNF-02 faz o mesmo com o RF-02, e assim por diante. O requisito funcional diz o que o sistema faz; o não funcional diz com que número isso se confere e em que serviço da AWS esse número se apoia.</w:t>
       </w:r>
     </w:p>
     <w:tbl>
@@ -1049,11 +134,9 @@
         <w:tblLook w:firstRow="1" w:lastRow="0" w:firstColumn="0" w:lastColumn="0" w:noHBand="0" w:noVBand="0" w:val="0020"/>
       </w:tblPr>
       <w:tblGrid>
-        <w:gridCol w:w="961"/>
-        <w:gridCol w:w="1604"/>
-        <w:gridCol w:w="2759"/>
-        <w:gridCol w:w="1839"/>
-        <w:gridCol w:w="757"/>
+        <w:gridCol w:w="3032"/>
+        <w:gridCol w:w="1612"/>
+        <w:gridCol w:w="3276"/>
       </w:tblGrid>
       <w:tr>
         <w:trPr>
@@ -1067,60 +150,48 @@
               <w:jc w:val="left"/>
             </w:pPr>
             <w:r>
-              <w:t xml:space="preserve">ID</w:t>
-            </w:r>
-          </w:p>
-        </w:tc>
-        <w:tc>
-          <w:tcPr/>
-          <w:p>
-            <w:pPr>
-              <w:pStyle w:val="Compact"/>
-              <w:jc w:val="left"/>
-            </w:pPr>
-            <w:r>
-              <w:t xml:space="preserve">Categoria</w:t>
-            </w:r>
-          </w:p>
-        </w:tc>
-        <w:tc>
-          <w:tcPr/>
-          <w:p>
-            <w:pPr>
-              <w:pStyle w:val="Compact"/>
-              <w:jc w:val="left"/>
-            </w:pPr>
-            <w:r>
-              <w:t xml:space="preserve">Métrica</w:t>
-            </w:r>
-          </w:p>
-        </w:tc>
-        <w:tc>
-          <w:tcPr/>
-          <w:p>
-            <w:pPr>
-              <w:pStyle w:val="Compact"/>
-              <w:jc w:val="left"/>
-            </w:pPr>
-            <w:r>
-              <w:t xml:space="preserve">Serviço AWS</w:t>
-            </w:r>
-          </w:p>
-        </w:tc>
-        <w:tc>
-          <w:tcPr/>
-          <w:p>
-            <w:pPr>
-              <w:pStyle w:val="Compact"/>
-              <w:jc w:val="left"/>
-            </w:pPr>
-            <w:r>
-              <w:t xml:space="preserve">Pilar</w:t>
-            </w:r>
-          </w:p>
-        </w:tc>
-      </w:tr>
-      <w:tr>
+              <w:t xml:space="preserve">Requisito funcional da Sprint 1</w:t>
+            </w:r>
+          </w:p>
+        </w:tc>
+        <w:tc>
+          <w:tcPr/>
+          <w:p>
+            <w:pPr>
+              <w:pStyle w:val="Compact"/>
+              <w:jc w:val="left"/>
+            </w:pPr>
+            <w:r>
+              <w:t xml:space="preserve">Requisito não funcional</w:t>
+            </w:r>
+          </w:p>
+        </w:tc>
+        <w:tc>
+          <w:tcPr/>
+          <w:p>
+            <w:pPr>
+              <w:pStyle w:val="Compact"/>
+              <w:jc w:val="left"/>
+            </w:pPr>
+            <w:r>
+              <w:t xml:space="preserve">A qualidade cobrada</w:t>
+            </w:r>
+          </w:p>
+        </w:tc>
+      </w:tr>
+      <w:tr>
+        <w:tc>
+          <w:tcPr/>
+          <w:p>
+            <w:pPr>
+              <w:pStyle w:val="Compact"/>
+              <w:jc w:val="left"/>
+            </w:pPr>
+            <w:r>
+              <w:t xml:space="preserve">RF-01, registrar o relato</w:t>
+            </w:r>
+          </w:p>
+        </w:tc>
         <w:tc>
           <w:tcPr/>
           <w:p>
@@ -1141,48 +212,24 @@
               <w:jc w:val="left"/>
             </w:pPr>
             <w:r>
-              <w:t xml:space="preserve">Performance</w:t>
-            </w:r>
-          </w:p>
-        </w:tc>
-        <w:tc>
-          <w:tcPr/>
-          <w:p>
-            <w:pPr>
-              <w:pStyle w:val="Compact"/>
-              <w:jc w:val="left"/>
-            </w:pPr>
-            <w:r>
-              <w:t xml:space="preserve">p95 ≤ 500 ms, até 300 relatos na janela da estação</w:t>
-            </w:r>
-          </w:p>
-        </w:tc>
-        <w:tc>
-          <w:tcPr/>
-          <w:p>
-            <w:pPr>
-              <w:pStyle w:val="Compact"/>
-              <w:jc w:val="left"/>
-            </w:pPr>
-            <w:r>
-              <w:t xml:space="preserve">Amazon DynamoDB</w:t>
-            </w:r>
-          </w:p>
-        </w:tc>
-        <w:tc>
-          <w:tcPr/>
-          <w:p>
-            <w:pPr>
-              <w:pStyle w:val="Compact"/>
-              <w:jc w:val="left"/>
-            </w:pPr>
-            <w:r>
-              <w:t xml:space="preserve">4</w:t>
-            </w:r>
-          </w:p>
-        </w:tc>
-      </w:tr>
-      <w:tr>
+              <w:t xml:space="preserve">o reenvio não duplica o relato</w:t>
+            </w:r>
+          </w:p>
+        </w:tc>
+      </w:tr>
+      <w:tr>
+        <w:tc>
+          <w:tcPr/>
+          <w:p>
+            <w:pPr>
+              <w:pStyle w:val="Compact"/>
+              <w:jc w:val="left"/>
+            </w:pPr>
+            <w:r>
+              <w:t xml:space="preserve">RF-02, guardar a foto no S3</w:t>
+            </w:r>
+          </w:p>
+        </w:tc>
         <w:tc>
           <w:tcPr/>
           <w:p>
@@ -1203,48 +250,24 @@
               <w:jc w:val="left"/>
             </w:pPr>
             <w:r>
-              <w:t xml:space="preserve">Reliability</w:t>
-            </w:r>
-          </w:p>
-        </w:tc>
-        <w:tc>
-          <w:tcPr/>
-          <w:p>
-            <w:pPr>
-              <w:pStyle w:val="Compact"/>
-              <w:jc w:val="left"/>
-            </w:pPr>
-            <w:r>
-              <w:t xml:space="preserve">zero duplicados em 5 reenvios do mesmo pedido</w:t>
-            </w:r>
-          </w:p>
-        </w:tc>
-        <w:tc>
-          <w:tcPr/>
-          <w:p>
-            <w:pPr>
-              <w:pStyle w:val="Compact"/>
-              <w:jc w:val="left"/>
-            </w:pPr>
-            <w:r>
-              <w:t xml:space="preserve">Amazon DynamoDB e Amazon S3</w:t>
-            </w:r>
-          </w:p>
-        </w:tc>
-        <w:tc>
-          <w:tcPr/>
-          <w:p>
-            <w:pPr>
-              <w:pStyle w:val="Compact"/>
-              <w:jc w:val="left"/>
-            </w:pPr>
-            <w:r>
-              <w:t xml:space="preserve">3</w:t>
-            </w:r>
-          </w:p>
-        </w:tc>
-      </w:tr>
-      <w:tr>
+              <w:t xml:space="preserve">o bucket só deixa o público ler a foto</w:t>
+            </w:r>
+          </w:p>
+        </w:tc>
+      </w:tr>
+      <w:tr>
+        <w:tc>
+          <w:tcPr/>
+          <w:p>
+            <w:pPr>
+              <w:pStyle w:val="Compact"/>
+              <w:jc w:val="left"/>
+            </w:pPr>
+            <w:r>
+              <w:t xml:space="preserve">RF-03, listar os relatos da estação</w:t>
+            </w:r>
+          </w:p>
+        </w:tc>
         <w:tc>
           <w:tcPr/>
           <w:p>
@@ -1265,48 +288,24 @@
               <w:jc w:val="left"/>
             </w:pPr>
             <w:r>
-              <w:t xml:space="preserve">Segurança</w:t>
-            </w:r>
-          </w:p>
-        </w:tc>
-        <w:tc>
-          <w:tcPr/>
-          <w:p>
-            <w:pPr>
-              <w:pStyle w:val="Compact"/>
-              <w:jc w:val="left"/>
-            </w:pPr>
-            <w:r>
-              <w:t xml:space="preserve">zero IP, navegador ou EXIF guardados, em 20 relatos e 20 confirmações</w:t>
-            </w:r>
-          </w:p>
-        </w:tc>
-        <w:tc>
-          <w:tcPr/>
-          <w:p>
-            <w:pPr>
-              <w:pStyle w:val="Compact"/>
-              <w:jc w:val="left"/>
-            </w:pPr>
-            <w:r>
-              <w:t xml:space="preserve">AWS Lambda e Amazon CloudWatch Logs</w:t>
-            </w:r>
-          </w:p>
-        </w:tc>
-        <w:tc>
-          <w:tcPr/>
-          <w:p>
-            <w:pPr>
-              <w:pStyle w:val="Compact"/>
-              <w:jc w:val="left"/>
-            </w:pPr>
-            <w:r>
-              <w:t xml:space="preserve">2</w:t>
-            </w:r>
-          </w:p>
-        </w:tc>
-      </w:tr>
-      <w:tr>
+              <w:t xml:space="preserve">a lista chega em até 500 ms</w:t>
+            </w:r>
+          </w:p>
+        </w:tc>
+      </w:tr>
+      <w:tr>
+        <w:tc>
+          <w:tcPr/>
+          <w:p>
+            <w:pPr>
+              <w:pStyle w:val="Compact"/>
+              <w:jc w:val="left"/>
+            </w:pPr>
+            <w:r>
+              <w:t xml:space="preserve">RF-04, somar a confirmação</w:t>
+            </w:r>
+          </w:p>
+        </w:tc>
         <w:tc>
           <w:tcPr/>
           <w:p>
@@ -1327,43 +326,45 @@
               <w:jc w:val="left"/>
             </w:pPr>
             <w:r>
-              <w:t xml:space="preserve">Segurança</w:t>
-            </w:r>
-          </w:p>
-        </w:tc>
-        <w:tc>
-          <w:tcPr/>
-          <w:p>
-            <w:pPr>
-              <w:pStyle w:val="Compact"/>
-              <w:jc w:val="left"/>
-            </w:pPr>
-            <w:r>
-              <w:t xml:space="preserve">no máximo 1 confirmação por relato a cada 10 min</w:t>
-            </w:r>
-          </w:p>
-        </w:tc>
-        <w:tc>
-          <w:tcPr/>
-          <w:p>
-            <w:pPr>
-              <w:pStyle w:val="Compact"/>
-              <w:jc w:val="left"/>
-            </w:pPr>
-            <w:r>
-              <w:t xml:space="preserve">Amazon DynamoDB</w:t>
-            </w:r>
-          </w:p>
-        </w:tc>
-        <w:tc>
-          <w:tcPr/>
-          <w:p>
-            <w:pPr>
-              <w:pStyle w:val="Compact"/>
-              <w:jc w:val="left"/>
-            </w:pPr>
-            <w:r>
-              <w:t xml:space="preserve">2</w:t>
+              <w:t xml:space="preserve">o reenvio não soma a confirmação duas vezes</w:t>
+            </w:r>
+          </w:p>
+        </w:tc>
+      </w:tr>
+      <w:tr>
+        <w:tc>
+          <w:tcPr/>
+          <w:p>
+            <w:pPr>
+              <w:pStyle w:val="Compact"/>
+              <w:jc w:val="left"/>
+            </w:pPr>
+            <w:r>
+              <w:t xml:space="preserve">RF-05, recusar e registrar a recusa</w:t>
+            </w:r>
+          </w:p>
+        </w:tc>
+        <w:tc>
+          <w:tcPr/>
+          <w:p>
+            <w:pPr>
+              <w:pStyle w:val="Compact"/>
+              <w:jc w:val="left"/>
+            </w:pPr>
+            <w:r>
+              <w:t xml:space="preserve">RNF-05</w:t>
+            </w:r>
+          </w:p>
+        </w:tc>
+        <w:tc>
+          <w:tcPr/>
+          <w:p>
+            <w:pPr>
+              <w:pStyle w:val="Compact"/>
+              <w:jc w:val="left"/>
+            </w:pPr>
+            <w:r>
+              <w:t xml:space="preserve">a recusa aparece no registro em até 10 segundos</w:t>
             </w:r>
           </w:p>
         </w:tc>
@@ -1371,10 +372,426 @@
     </w:tbl>
     <w:p>
       <w:pPr>
+        <w:pStyle w:val="Heading3"/>
+      </w:pPr>
+      <w:r>
+        <w:t xml:space="preserve">RNF-01</w:t>
+      </w:r>
+    </w:p>
+    <w:p>
+      <w:pPr>
+        <w:pStyle w:val="SourceCode"/>
+      </w:pPr>
+      <w:r>
+        <w:rPr>
+          <w:rStyle w:val="VerbatimChar"/>
+        </w:rPr>
+        <w:t xml:space="preserve">requisito</w:t>
+      </w:r>
+      <w:r>
+        <w:br/>
+      </w:r>
+      <w:r>
+        <w:rPr>
+          <w:rStyle w:val="VerbatimChar"/>
+        </w:rPr>
+        <w:t xml:space="preserve">  [Reliability] O reenvio de um mesmo relato deve gravar</w:t>
+      </w:r>
+      <w:r>
+        <w:br/>
+      </w:r>
+      <w:r>
+        <w:rPr>
+          <w:rStyle w:val="VerbatimChar"/>
+        </w:rPr>
+        <w:t xml:space="preserve">  zero duplicados: com 5 reenvios seguidos do mesmo</w:t>
+      </w:r>
+      <w:r>
+        <w:br/>
+      </w:r>
+      <w:r>
+        <w:rPr>
+          <w:rStyle w:val="VerbatimChar"/>
+        </w:rPr>
+        <w:t xml:space="preserve">  envio, a estação ganha exatamente 1 relato, com 1</w:t>
+      </w:r>
+      <w:r>
+        <w:br/>
+      </w:r>
+      <w:r>
+        <w:rPr>
+          <w:rStyle w:val="VerbatimChar"/>
+        </w:rPr>
+        <w:t xml:space="preserve">  protocolo e 1 foto.</w:t>
+      </w:r>
+      <w:r>
+        <w:br/>
+      </w:r>
+      <w:r>
+        <w:rPr>
+          <w:rStyle w:val="VerbatimChar"/>
+        </w:rPr>
+        <w:t xml:space="preserve"/>
+      </w:r>
+      <w:r>
+        <w:br/>
+      </w:r>
+      <w:r>
+        <w:rPr>
+          <w:rStyle w:val="VerbatimChar"/>
+        </w:rPr>
+        <w:t xml:space="preserve">serviço AWS</w:t>
+      </w:r>
+      <w:r>
+        <w:br/>
+      </w:r>
+      <w:r>
+        <w:rPr>
+          <w:rStyle w:val="VerbatimChar"/>
+        </w:rPr>
+        <w:t xml:space="preserve">  Amazon DynamoDB, com gravação condicional</w:t>
+      </w:r>
+      <w:r>
+        <w:br/>
+      </w:r>
+      <w:r>
+        <w:rPr>
+          <w:rStyle w:val="VerbatimChar"/>
+        </w:rPr>
+        <w:t xml:space="preserve"/>
+      </w:r>
+      <w:r>
+        <w:br/>
+      </w:r>
+      <w:r>
+        <w:rPr>
+          <w:rStyle w:val="VerbatimChar"/>
+        </w:rPr>
+        <w:t xml:space="preserve">pilar do Well-Architected</w:t>
+      </w:r>
+      <w:r>
+        <w:br/>
+      </w:r>
+      <w:r>
+        <w:rPr>
+          <w:rStyle w:val="VerbatimChar"/>
+        </w:rPr>
+        <w:t xml:space="preserve">  3, Confiabilidade</w:t>
+      </w:r>
+      <w:r>
+        <w:br/>
+      </w:r>
+      <w:r>
+        <w:rPr>
+          <w:rStyle w:val="VerbatimChar"/>
+        </w:rPr>
+        <w:t xml:space="preserve"/>
+      </w:r>
+      <w:r>
+        <w:br/>
+      </w:r>
+      <w:r>
+        <w:rPr>
+          <w:rStyle w:val="VerbatimChar"/>
+        </w:rPr>
+        <w:t xml:space="preserve">razão</w:t>
+      </w:r>
+      <w:r>
+        <w:br/>
+      </w:r>
+      <w:r>
+        <w:rPr>
+          <w:rStyle w:val="VerbatimChar"/>
+        </w:rPr>
+        <w:t xml:space="preserve">  O RF-01 promete um protocolo único por relato. No túnel</w:t>
+      </w:r>
+      <w:r>
+        <w:br/>
+      </w:r>
+      <w:r>
+        <w:rPr>
+          <w:rStyle w:val="VerbatimChar"/>
+        </w:rPr>
+        <w:t xml:space="preserve">  o sinal cai, e o envio pode ter sido gravado com a</w:t>
+      </w:r>
+      <w:r>
+        <w:br/>
+      </w:r>
+      <w:r>
+        <w:rPr>
+          <w:rStyle w:val="VerbatimChar"/>
+        </w:rPr>
+        <w:t xml:space="preserve">  resposta perdida no caminho. Tentar de novo é o certo a</w:t>
+      </w:r>
+      <w:r>
+        <w:br/>
+      </w:r>
+      <w:r>
+        <w:rPr>
+          <w:rStyle w:val="VerbatimChar"/>
+        </w:rPr>
+        <w:t xml:space="preserve">  fazer, e só é seguro se o sistema reconhecer o pedido</w:t>
+      </w:r>
+      <w:r>
+        <w:br/>
+      </w:r>
+      <w:r>
+        <w:rPr>
+          <w:rStyle w:val="VerbatimChar"/>
+        </w:rPr>
+        <w:t xml:space="preserve">  repetido. A página gera um código aleatório para cada</w:t>
+      </w:r>
+      <w:r>
+        <w:br/>
+      </w:r>
+      <w:r>
+        <w:rPr>
+          <w:rStyle w:val="VerbatimChar"/>
+        </w:rPr>
+        <w:t xml:space="preserve">  envio e repete o mesmo código a cada nova tentativa; a</w:t>
+      </w:r>
+      <w:r>
+        <w:br/>
+      </w:r>
+      <w:r>
+        <w:rPr>
+          <w:rStyle w:val="VerbatimChar"/>
+        </w:rPr>
+        <w:t xml:space="preserve">  função deriva dele o protocolo. Se o protocolo já</w:t>
+      </w:r>
+      <w:r>
+        <w:br/>
+      </w:r>
+      <w:r>
+        <w:rPr>
+          <w:rStyle w:val="VerbatimChar"/>
+        </w:rPr>
+        <w:t xml:space="preserve">  existe na tabela, é um reenvio: a função devolve o</w:t>
+      </w:r>
+      <w:r>
+        <w:br/>
+      </w:r>
+      <w:r>
+        <w:rPr>
+          <w:rStyle w:val="VerbatimChar"/>
+        </w:rPr>
+        <w:t xml:space="preserve">  mesmo protocolo sem tocar na foto nem na tabela.</w:t>
+      </w:r>
+    </w:p>
+    <w:p>
+      <w:pPr>
         <w:pStyle w:val="BodyText"/>
       </w:pPr>
       <w:r>
-        <w:t xml:space="preserve">Pilares: 1 Excelência Operacional, 2 Segurança, 3 Confiabilidade, 4 Eficiência de Performance, 5 Otimização de Custos, 6 Sustentabilidade.</w:t>
+        <w:t xml:space="preserve">O protocolo é um resumo do código, os 16 primeiros caracteres do seu SHA-256, e não o próprio código. O protocolo aparece na consulta, porque é por ele que se confirma um relato; o código, não. Se o protocolo fosse o código, quem o lesse na consulta poderia reenviá-lo com outra foto e trocar a foto de um relato alheio (seção 9). E o código identifica o envio, e não quem enviou: é novo a cada relato, e a página o descarta quando recebe a resposta. Por isso ele não fere o RD-01.</w:t>
+      </w:r>
+    </w:p>
+    <w:p>
+      <w:pPr>
+        <w:pStyle w:val="Heading3"/>
+      </w:pPr>
+      <w:r>
+        <w:t xml:space="preserve">RNF-02</w:t>
+      </w:r>
+    </w:p>
+    <w:p>
+      <w:pPr>
+        <w:pStyle w:val="SourceCode"/>
+      </w:pPr>
+      <w:r>
+        <w:rPr>
+          <w:rStyle w:val="VerbatimChar"/>
+        </w:rPr>
+        <w:t xml:space="preserve">requisito</w:t>
+      </w:r>
+      <w:r>
+        <w:br/>
+      </w:r>
+      <w:r>
+        <w:rPr>
+          <w:rStyle w:val="VerbatimChar"/>
+        </w:rPr>
+        <w:t xml:space="preserve">  [Segurança] O bucket de fotos deve permitir ao público</w:t>
+      </w:r>
+      <w:r>
+        <w:br/>
+      </w:r>
+      <w:r>
+        <w:rPr>
+          <w:rStyle w:val="VerbatimChar"/>
+        </w:rPr>
+        <w:t xml:space="preserve">  uma única ação, ler uma foto pelo endereço exato, e</w:t>
+      </w:r>
+      <w:r>
+        <w:br/>
+      </w:r>
+      <w:r>
+        <w:rPr>
+          <w:rStyle w:val="VerbatimChar"/>
+        </w:rPr>
+        <w:t xml:space="preserve">  zero ações de listar, gravar ou apagar, o que se</w:t>
+      </w:r>
+      <w:r>
+        <w:br/>
+      </w:r>
+      <w:r>
+        <w:rPr>
+          <w:rStyle w:val="VerbatimChar"/>
+        </w:rPr>
+        <w:t xml:space="preserve">  confere na política do bucket.</w:t>
+      </w:r>
+      <w:r>
+        <w:br/>
+      </w:r>
+      <w:r>
+        <w:rPr>
+          <w:rStyle w:val="VerbatimChar"/>
+        </w:rPr>
+        <w:t xml:space="preserve"/>
+      </w:r>
+      <w:r>
+        <w:br/>
+      </w:r>
+      <w:r>
+        <w:rPr>
+          <w:rStyle w:val="VerbatimChar"/>
+        </w:rPr>
+        <w:t xml:space="preserve">serviço AWS</w:t>
+      </w:r>
+      <w:r>
+        <w:br/>
+      </w:r>
+      <w:r>
+        <w:rPr>
+          <w:rStyle w:val="VerbatimChar"/>
+        </w:rPr>
+        <w:t xml:space="preserve">  Amazon S3, com a política do bucket</w:t>
+      </w:r>
+      <w:r>
+        <w:br/>
+      </w:r>
+      <w:r>
+        <w:rPr>
+          <w:rStyle w:val="VerbatimChar"/>
+        </w:rPr>
+        <w:t xml:space="preserve"/>
+      </w:r>
+      <w:r>
+        <w:br/>
+      </w:r>
+      <w:r>
+        <w:rPr>
+          <w:rStyle w:val="VerbatimChar"/>
+        </w:rPr>
+        <w:t xml:space="preserve">pilar do Well-Architected</w:t>
+      </w:r>
+      <w:r>
+        <w:br/>
+      </w:r>
+      <w:r>
+        <w:rPr>
+          <w:rStyle w:val="VerbatimChar"/>
+        </w:rPr>
+        <w:t xml:space="preserve">  2, Segurança</w:t>
+      </w:r>
+      <w:r>
+        <w:br/>
+      </w:r>
+      <w:r>
+        <w:rPr>
+          <w:rStyle w:val="VerbatimChar"/>
+        </w:rPr>
+        <w:t xml:space="preserve"/>
+      </w:r>
+      <w:r>
+        <w:br/>
+      </w:r>
+      <w:r>
+        <w:rPr>
+          <w:rStyle w:val="VerbatimChar"/>
+        </w:rPr>
+        <w:t xml:space="preserve">razão</w:t>
+      </w:r>
+      <w:r>
+        <w:br/>
+      </w:r>
+      <w:r>
+        <w:rPr>
+          <w:rStyle w:val="VerbatimChar"/>
+        </w:rPr>
+        <w:t xml:space="preserve">  O RF-02 exige um endereço pelo qual a foto possa ser</w:t>
+      </w:r>
+      <w:r>
+        <w:br/>
+      </w:r>
+      <w:r>
+        <w:rPr>
+          <w:rStyle w:val="VerbatimChar"/>
+        </w:rPr>
+        <w:t xml:space="preserve">  vista, e isso torna o bucket público para leitura.</w:t>
+      </w:r>
+      <w:r>
+        <w:br/>
+      </w:r>
+      <w:r>
+        <w:rPr>
+          <w:rStyle w:val="VerbatimChar"/>
+        </w:rPr>
+        <w:t xml:space="preserve">  Público para ler não pode virar público para o resto.</w:t>
+      </w:r>
+      <w:r>
+        <w:br/>
+      </w:r>
+      <w:r>
+        <w:rPr>
+          <w:rStyle w:val="VerbatimChar"/>
+        </w:rPr>
+        <w:t xml:space="preserve">  Listar entregaria de uma vez as fotos de todas as</w:t>
+      </w:r>
+      <w:r>
+        <w:br/>
+      </w:r>
+      <w:r>
+        <w:rPr>
+          <w:rStyle w:val="VerbatimChar"/>
+        </w:rPr>
+        <w:t xml:space="preserve">  estações, sem passar pela consulta nem pela janela de</w:t>
+      </w:r>
+      <w:r>
+        <w:br/>
+      </w:r>
+      <w:r>
+        <w:rPr>
+          <w:rStyle w:val="VerbatimChar"/>
+        </w:rPr>
+        <w:t xml:space="preserve">  30 dias; gravar permitiria trocar a foto de um relato</w:t>
+      </w:r>
+      <w:r>
+        <w:br/>
+      </w:r>
+      <w:r>
+        <w:rPr>
+          <w:rStyle w:val="VerbatimChar"/>
+        </w:rPr>
+        <w:t xml:space="preserve">  por outra, inclusive por uma foto de pessoa, que o</w:t>
+      </w:r>
+      <w:r>
+        <w:br/>
+      </w:r>
+      <w:r>
+        <w:rPr>
+          <w:rStyle w:val="VerbatimChar"/>
+        </w:rPr>
+        <w:t xml:space="preserve">  RD-02 proíbe; apagar faria a foto sumir. Só a função</w:t>
+      </w:r>
+      <w:r>
+        <w:br/>
+      </w:r>
+      <w:r>
+        <w:rPr>
+          <w:rStyle w:val="VerbatimChar"/>
+        </w:rPr>
+        <w:t xml:space="preserve">  registrar grava no bucket, pelo papel dela no IAM.</w:t>
       </w:r>
     </w:p>
     <w:p>
@@ -1382,7 +799,7 @@
         <w:pStyle w:val="BodyText"/>
       </w:pPr>
       <w:r>
-        <w:t xml:space="preserve">Ter dois requisitos no pilar 2 não é acaso. Num sistema de relatos anônimos sobre segurança, a ameaça vem de dois lados: expor quem relatou (RNF-03) e falsificar o que foi relatado (RNF-04).</w:t>
+        <w:t xml:space="preserve">O endereço de cada foto leva o protocolo, que não se adivinha: quem não recebeu o endereço de uma foto pela consulta não tem como chegar a ela.</w:t>
       </w:r>
     </w:p>
     <w:p>
@@ -1390,15 +807,198 @@
         <w:pStyle w:val="Heading3"/>
       </w:pPr>
       <w:r>
-        <w:t xml:space="preserve">1.2 O pilar não contemplado</w:t>
-      </w:r>
-    </w:p>
-    <w:p>
-      <w:pPr>
-        <w:pStyle w:val="FirstParagraph"/>
-      </w:pPr>
-      <w:r>
-        <w:t xml:space="preserve">Ficaram de fora três pilares: o 1, o 5 e o 6.</w:t>
+        <w:t xml:space="preserve">RNF-03</w:t>
+      </w:r>
+    </w:p>
+    <w:p>
+      <w:pPr>
+        <w:pStyle w:val="SourceCode"/>
+      </w:pPr>
+      <w:r>
+        <w:rPr>
+          <w:rStyle w:val="VerbatimChar"/>
+        </w:rPr>
+        <w:t xml:space="preserve">requisito</w:t>
+      </w:r>
+      <w:r>
+        <w:br/>
+      </w:r>
+      <w:r>
+        <w:rPr>
+          <w:rStyle w:val="VerbatimChar"/>
+        </w:rPr>
+        <w:t xml:space="preserve">  [Performance] A consulta dos relatos de uma estação deve</w:t>
+      </w:r>
+      <w:r>
+        <w:br/>
+      </w:r>
+      <w:r>
+        <w:rPr>
+          <w:rStyle w:val="VerbatimChar"/>
+        </w:rPr>
+        <w:t xml:space="preserve">  responder em no máximo 500 ms no percentil 95, com até</w:t>
+      </w:r>
+      <w:r>
+        <w:br/>
+      </w:r>
+      <w:r>
+        <w:rPr>
+          <w:rStyle w:val="VerbatimChar"/>
+        </w:rPr>
+        <w:t xml:space="preserve">  300 relatos dos últimos 30 dias na estação consultada e</w:t>
+      </w:r>
+      <w:r>
+        <w:br/>
+      </w:r>
+      <w:r>
+        <w:rPr>
+          <w:rStyle w:val="VerbatimChar"/>
+        </w:rPr>
+        <w:t xml:space="preserve">  30 requisições seguidas.</w:t>
+      </w:r>
+      <w:r>
+        <w:br/>
+      </w:r>
+      <w:r>
+        <w:rPr>
+          <w:rStyle w:val="VerbatimChar"/>
+        </w:rPr>
+        <w:t xml:space="preserve"/>
+      </w:r>
+      <w:r>
+        <w:br/>
+      </w:r>
+      <w:r>
+        <w:rPr>
+          <w:rStyle w:val="VerbatimChar"/>
+        </w:rPr>
+        <w:t xml:space="preserve">serviço AWS</w:t>
+      </w:r>
+      <w:r>
+        <w:br/>
+      </w:r>
+      <w:r>
+        <w:rPr>
+          <w:rStyle w:val="VerbatimChar"/>
+        </w:rPr>
+        <w:t xml:space="preserve">  Amazon DynamoDB</w:t>
+      </w:r>
+      <w:r>
+        <w:br/>
+      </w:r>
+      <w:r>
+        <w:rPr>
+          <w:rStyle w:val="VerbatimChar"/>
+        </w:rPr>
+        <w:t xml:space="preserve"/>
+      </w:r>
+      <w:r>
+        <w:br/>
+      </w:r>
+      <w:r>
+        <w:rPr>
+          <w:rStyle w:val="VerbatimChar"/>
+        </w:rPr>
+        <w:t xml:space="preserve">pilar do Well-Architected</w:t>
+      </w:r>
+      <w:r>
+        <w:br/>
+      </w:r>
+      <w:r>
+        <w:rPr>
+          <w:rStyle w:val="VerbatimChar"/>
+        </w:rPr>
+        <w:t xml:space="preserve">  4, Eficiência de Performance</w:t>
+      </w:r>
+      <w:r>
+        <w:br/>
+      </w:r>
+      <w:r>
+        <w:rPr>
+          <w:rStyle w:val="VerbatimChar"/>
+        </w:rPr>
+        <w:t xml:space="preserve"/>
+      </w:r>
+      <w:r>
+        <w:br/>
+      </w:r>
+      <w:r>
+        <w:rPr>
+          <w:rStyle w:val="VerbatimChar"/>
+        </w:rPr>
+        <w:t xml:space="preserve">razão</w:t>
+      </w:r>
+      <w:r>
+        <w:br/>
+      </w:r>
+      <w:r>
+        <w:rPr>
+          <w:rStyle w:val="VerbatimChar"/>
+        </w:rPr>
+        <w:t xml:space="preserve">  A chave de partição é a estação, e a chave de ordenação</w:t>
+      </w:r>
+      <w:r>
+        <w:br/>
+      </w:r>
+      <w:r>
+        <w:rPr>
+          <w:rStyle w:val="VerbatimChar"/>
+        </w:rPr>
+        <w:t xml:space="preserve">  começa pelo dia do envio. A consulta vai direto à</w:t>
+      </w:r>
+      <w:r>
+        <w:br/>
+      </w:r>
+      <w:r>
+        <w:rPr>
+          <w:rStyle w:val="VerbatimChar"/>
+        </w:rPr>
+        <w:t xml:space="preserve">  partição da estação e lê só a fatia dos últimos 30 dias:</w:t>
+      </w:r>
+      <w:r>
+        <w:br/>
+      </w:r>
+      <w:r>
+        <w:rPr>
+          <w:rStyle w:val="VerbatimChar"/>
+        </w:rPr>
+        <w:t xml:space="preserve">  o relato de dois anos atrás nem chega a ser lido. O</w:t>
+      </w:r>
+      <w:r>
+        <w:br/>
+      </w:r>
+      <w:r>
+        <w:rPr>
+          <w:rStyle w:val="VerbatimChar"/>
+        </w:rPr>
+        <w:t xml:space="preserve">  tempo cresce com a janela de uma estação, e não com a</w:t>
+      </w:r>
+      <w:r>
+        <w:br/>
+      </w:r>
+      <w:r>
+        <w:rPr>
+          <w:rStyle w:val="VerbatimChar"/>
+        </w:rPr>
+        <w:t xml:space="preserve">  tabela inteira. E a resposta leva o endereço da foto, e</w:t>
+      </w:r>
+      <w:r>
+        <w:br/>
+      </w:r>
+      <w:r>
+        <w:rPr>
+          <w:rStyle w:val="VerbatimChar"/>
+        </w:rPr>
+        <w:t xml:space="preserve">  não a foto: a lista chega inteira antes de a primeira</w:t>
+      </w:r>
+      <w:r>
+        <w:br/>
+      </w:r>
+      <w:r>
+        <w:rPr>
+          <w:rStyle w:val="VerbatimChar"/>
+        </w:rPr>
+        <w:t xml:space="preserve">  imagem começar a baixar.</w:t>
       </w:r>
     </w:p>
     <w:p>
@@ -1406,7 +1006,414 @@
         <w:pStyle w:val="BodyText"/>
       </w:pPr>
       <w:r>
-        <w:t xml:space="preserve">O pilar 1, Excelência Operacional, não virou requisito porque ninguém opera este sistema no dia a dia: a Sprint 1 deixou a moderação fora do escopo, e não há quem leia os registros para agir sobre um relato. O registro que importa, a recusa sem dado de quem enviou, já é requisito funcional (RF-05), e o ambiente inteiro vai ser criado por script, porque esse é o percurso das Sprints 3 e 4. Sem um operador, um número de tempo até o registro aparecer mediria algo que ninguém usa.</w:t>
+        <w:t xml:space="preserve">De onde vêm os números. A consulta é feita na plataforma, com o sinal fraco, e a parte da espera que vem da rede da estação não é nossa; a parte que é nossa tem de ser pequena para que a soma das duas caiba no tempo de o trem parar. Os 300 relatos equivalem a dez por dia, todo dia, na mesma estação: muito mais do que qualquer estação terá no começo, e o número precisa continuar valendo quando o uso crescer.</w:t>
+      </w:r>
+    </w:p>
+    <w:p>
+      <w:pPr>
+        <w:pStyle w:val="Heading3"/>
+      </w:pPr>
+      <w:r>
+        <w:t xml:space="preserve">RNF-04</w:t>
+      </w:r>
+    </w:p>
+    <w:p>
+      <w:pPr>
+        <w:pStyle w:val="SourceCode"/>
+      </w:pPr>
+      <w:r>
+        <w:rPr>
+          <w:rStyle w:val="VerbatimChar"/>
+        </w:rPr>
+        <w:t xml:space="preserve">requisito</w:t>
+      </w:r>
+      <w:r>
+        <w:br/>
+      </w:r>
+      <w:r>
+        <w:rPr>
+          <w:rStyle w:val="VerbatimChar"/>
+        </w:rPr>
+        <w:t xml:space="preserve">  [Reliability] O reenvio de uma mesma confirmação deve</w:t>
+      </w:r>
+      <w:r>
+        <w:br/>
+      </w:r>
+      <w:r>
+        <w:rPr>
+          <w:rStyle w:val="VerbatimChar"/>
+        </w:rPr>
+        <w:t xml:space="preserve">  somar exatamente 1: com 5 reenvios seguidos da mesma</w:t>
+      </w:r>
+      <w:r>
+        <w:br/>
+      </w:r>
+      <w:r>
+        <w:rPr>
+          <w:rStyle w:val="VerbatimChar"/>
+        </w:rPr>
+        <w:t xml:space="preserve">  confirmação, o relato ganha 1 confirmação, e não 5.</w:t>
+      </w:r>
+      <w:r>
+        <w:br/>
+      </w:r>
+      <w:r>
+        <w:rPr>
+          <w:rStyle w:val="VerbatimChar"/>
+        </w:rPr>
+        <w:t xml:space="preserve"/>
+      </w:r>
+      <w:r>
+        <w:br/>
+      </w:r>
+      <w:r>
+        <w:rPr>
+          <w:rStyle w:val="VerbatimChar"/>
+        </w:rPr>
+        <w:t xml:space="preserve">serviço AWS</w:t>
+      </w:r>
+      <w:r>
+        <w:br/>
+      </w:r>
+      <w:r>
+        <w:rPr>
+          <w:rStyle w:val="VerbatimChar"/>
+        </w:rPr>
+        <w:t xml:space="preserve">  Amazon DynamoDB, com atualização condicional</w:t>
+      </w:r>
+      <w:r>
+        <w:br/>
+      </w:r>
+      <w:r>
+        <w:rPr>
+          <w:rStyle w:val="VerbatimChar"/>
+        </w:rPr>
+        <w:t xml:space="preserve"/>
+      </w:r>
+      <w:r>
+        <w:br/>
+      </w:r>
+      <w:r>
+        <w:rPr>
+          <w:rStyle w:val="VerbatimChar"/>
+        </w:rPr>
+        <w:t xml:space="preserve">pilar do Well-Architected</w:t>
+      </w:r>
+      <w:r>
+        <w:br/>
+      </w:r>
+      <w:r>
+        <w:rPr>
+          <w:rStyle w:val="VerbatimChar"/>
+        </w:rPr>
+        <w:t xml:space="preserve">  3, Confiabilidade</w:t>
+      </w:r>
+      <w:r>
+        <w:br/>
+      </w:r>
+      <w:r>
+        <w:rPr>
+          <w:rStyle w:val="VerbatimChar"/>
+        </w:rPr>
+        <w:t xml:space="preserve"/>
+      </w:r>
+      <w:r>
+        <w:br/>
+      </w:r>
+      <w:r>
+        <w:rPr>
+          <w:rStyle w:val="VerbatimChar"/>
+        </w:rPr>
+        <w:t xml:space="preserve">razão</w:t>
+      </w:r>
+      <w:r>
+        <w:br/>
+      </w:r>
+      <w:r>
+        <w:rPr>
+          <w:rStyle w:val="VerbatimChar"/>
+        </w:rPr>
+        <w:t xml:space="preserve">  O RF-04 soma uma confirmação quando a passageira indica</w:t>
+      </w:r>
+      <w:r>
+        <w:br/>
+      </w:r>
+      <w:r>
+        <w:rPr>
+          <w:rStyle w:val="VerbatimChar"/>
+        </w:rPr>
+        <w:t xml:space="preserve">  que o problema continua. Ela toca em "confirmar" na</w:t>
+      </w:r>
+      <w:r>
+        <w:br/>
+      </w:r>
+      <w:r>
+        <w:rPr>
+          <w:rStyle w:val="VerbatimChar"/>
+        </w:rPr>
+        <w:t xml:space="preserve">  plataforma, o sinal cai, e ela toca de novo. Sem este</w:t>
+      </w:r>
+      <w:r>
+        <w:br/>
+      </w:r>
+      <w:r>
+        <w:rPr>
+          <w:rStyle w:val="VerbatimChar"/>
+        </w:rPr>
+        <w:t xml:space="preserve">  requisito, uma confirmação viraria duas, e a ordem da</w:t>
+      </w:r>
+      <w:r>
+        <w:br/>
+      </w:r>
+      <w:r>
+        <w:rPr>
+          <w:rStyle w:val="VerbatimChar"/>
+        </w:rPr>
+        <w:t xml:space="preserve">  consulta mentiria. A página manda um código para cada</w:t>
+      </w:r>
+      <w:r>
+        <w:br/>
+      </w:r>
+      <w:r>
+        <w:rPr>
+          <w:rStyle w:val="VerbatimChar"/>
+        </w:rPr>
+        <w:t xml:space="preserve">  confirmação; a tabela guarda o código da última</w:t>
+      </w:r>
+      <w:r>
+        <w:br/>
+      </w:r>
+      <w:r>
+        <w:rPr>
+          <w:rStyle w:val="VerbatimChar"/>
+        </w:rPr>
+        <w:t xml:space="preserve">  confirmação somada e só soma se o código for outro, na</w:t>
+      </w:r>
+      <w:r>
+        <w:br/>
+      </w:r>
+      <w:r>
+        <w:rPr>
+          <w:rStyle w:val="VerbatimChar"/>
+        </w:rPr>
+        <w:t xml:space="preserve">  mesma atualização que soma, sem ler o relato antes.</w:t>
+      </w:r>
+    </w:p>
+    <w:p>
+      <w:pPr>
+        <w:pStyle w:val="Heading3"/>
+      </w:pPr>
+      <w:r>
+        <w:t xml:space="preserve">RNF-05</w:t>
+      </w:r>
+    </w:p>
+    <w:p>
+      <w:pPr>
+        <w:pStyle w:val="SourceCode"/>
+      </w:pPr>
+      <w:r>
+        <w:rPr>
+          <w:rStyle w:val="VerbatimChar"/>
+        </w:rPr>
+        <w:t xml:space="preserve">requisito</w:t>
+      </w:r>
+      <w:r>
+        <w:br/>
+      </w:r>
+      <w:r>
+        <w:rPr>
+          <w:rStyle w:val="VerbatimChar"/>
+        </w:rPr>
+        <w:t xml:space="preserve">  [Observabilidade] Toda recusa de relato deve deixar</w:t>
+      </w:r>
+      <w:r>
+        <w:br/>
+      </w:r>
+      <w:r>
+        <w:rPr>
+          <w:rStyle w:val="VerbatimChar"/>
+        </w:rPr>
+        <w:t xml:space="preserve">  exatamente 1 linha no CloudWatch Logs, com o campo</w:t>
+      </w:r>
+      <w:r>
+        <w:br/>
+      </w:r>
+      <w:r>
+        <w:rPr>
+          <w:rStyle w:val="VerbatimChar"/>
+        </w:rPr>
+        <w:t xml:space="preserve">  recusado, visível em no máximo 10 segundos após a</w:t>
+      </w:r>
+      <w:r>
+        <w:br/>
+      </w:r>
+      <w:r>
+        <w:rPr>
+          <w:rStyle w:val="VerbatimChar"/>
+        </w:rPr>
+        <w:t xml:space="preserve">  chamada, conferido com 10 envios inválidos.</w:t>
+      </w:r>
+      <w:r>
+        <w:br/>
+      </w:r>
+      <w:r>
+        <w:rPr>
+          <w:rStyle w:val="VerbatimChar"/>
+        </w:rPr>
+        <w:t xml:space="preserve"/>
+      </w:r>
+      <w:r>
+        <w:br/>
+      </w:r>
+      <w:r>
+        <w:rPr>
+          <w:rStyle w:val="VerbatimChar"/>
+        </w:rPr>
+        <w:t xml:space="preserve">serviço AWS</w:t>
+      </w:r>
+      <w:r>
+        <w:br/>
+      </w:r>
+      <w:r>
+        <w:rPr>
+          <w:rStyle w:val="VerbatimChar"/>
+        </w:rPr>
+        <w:t xml:space="preserve">  Amazon CloudWatch Logs</w:t>
+      </w:r>
+      <w:r>
+        <w:br/>
+      </w:r>
+      <w:r>
+        <w:rPr>
+          <w:rStyle w:val="VerbatimChar"/>
+        </w:rPr>
+        <w:t xml:space="preserve"/>
+      </w:r>
+      <w:r>
+        <w:br/>
+      </w:r>
+      <w:r>
+        <w:rPr>
+          <w:rStyle w:val="VerbatimChar"/>
+        </w:rPr>
+        <w:t xml:space="preserve">pilar do Well-Architected</w:t>
+      </w:r>
+      <w:r>
+        <w:br/>
+      </w:r>
+      <w:r>
+        <w:rPr>
+          <w:rStyle w:val="VerbatimChar"/>
+        </w:rPr>
+        <w:t xml:space="preserve">  1, Excelência Operacional</w:t>
+      </w:r>
+      <w:r>
+        <w:br/>
+      </w:r>
+      <w:r>
+        <w:rPr>
+          <w:rStyle w:val="VerbatimChar"/>
+        </w:rPr>
+        <w:t xml:space="preserve"/>
+      </w:r>
+      <w:r>
+        <w:br/>
+      </w:r>
+      <w:r>
+        <w:rPr>
+          <w:rStyle w:val="VerbatimChar"/>
+        </w:rPr>
+        <w:t xml:space="preserve">razão</w:t>
+      </w:r>
+      <w:r>
+        <w:br/>
+      </w:r>
+      <w:r>
+        <w:rPr>
+          <w:rStyle w:val="VerbatimChar"/>
+        </w:rPr>
+        <w:t xml:space="preserve">  O RF-05 manda registrar a recusa, sem dizer quando nem</w:t>
+      </w:r>
+      <w:r>
+        <w:br/>
+      </w:r>
+      <w:r>
+        <w:rPr>
+          <w:rStyle w:val="VerbatimChar"/>
+        </w:rPr>
+        <w:t xml:space="preserve">  como. Sem número, "registrar" pode ser uma linha que</w:t>
+      </w:r>
+      <w:r>
+        <w:br/>
+      </w:r>
+      <w:r>
+        <w:rPr>
+          <w:rStyle w:val="VerbatimChar"/>
+        </w:rPr>
+        <w:t xml:space="preserve">  aparece minutos depois, duas linhas para a mesma recusa,</w:t>
+      </w:r>
+      <w:r>
+        <w:br/>
+      </w:r>
+      <w:r>
+        <w:rPr>
+          <w:rStyle w:val="VerbatimChar"/>
+        </w:rPr>
+        <w:t xml:space="preserve">  ou nenhuma. É pelo registro que se descobre se a lista</w:t>
+      </w:r>
+      <w:r>
+        <w:br/>
+      </w:r>
+      <w:r>
+        <w:rPr>
+          <w:rStyle w:val="VerbatimChar"/>
+        </w:rPr>
+        <w:t xml:space="preserve">  de estações está recusando um jeito de escrever que as</w:t>
+      </w:r>
+      <w:r>
+        <w:br/>
+      </w:r>
+      <w:r>
+        <w:rPr>
+          <w:rStyle w:val="VerbatimChar"/>
+        </w:rPr>
+        <w:t xml:space="preserve">  passageiras usam: quarenta recusas do campo estação num</w:t>
+      </w:r>
+      <w:r>
+        <w:br/>
+      </w:r>
+      <w:r>
+        <w:rPr>
+          <w:rStyle w:val="VerbatimChar"/>
+        </w:rPr>
+        <w:t xml:space="preserve">  mesmo dia dizem que a lista precisa mudar, e não que</w:t>
+      </w:r>
+      <w:r>
+        <w:br/>
+      </w:r>
+      <w:r>
+        <w:rPr>
+          <w:rStyle w:val="VerbatimChar"/>
+        </w:rPr>
+        <w:t xml:space="preserve">  quarenta passageiras erraram. O registro serve para</w:t>
+      </w:r>
+      <w:r>
+        <w:br/>
+      </w:r>
+      <w:r>
+        <w:rPr>
+          <w:rStyle w:val="VerbatimChar"/>
+        </w:rPr>
+        <w:t xml:space="preserve">  operar e ajustar o sistema, e não para recuperá-lo; por</w:t>
+      </w:r>
+      <w:r>
+        <w:br/>
+      </w:r>
+      <w:r>
+        <w:rPr>
+          <w:rStyle w:val="VerbatimChar"/>
+        </w:rPr>
+        <w:t xml:space="preserve">  isso o pilar 1, e não o 3.</w:t>
       </w:r>
     </w:p>
     <w:p>
@@ -1414,23 +1421,15 @@
         <w:pStyle w:val="BodyText"/>
       </w:pPr>
       <w:r>
-        <w:t xml:space="preserve">O pilar 5, Otimização de Custos, não virou requisito porque em ambiente emulado não existe fatura, e qualquer número de custo seria inventado. Mesmo sem ele, o desenho escolhe serviços cobrados por uso: parado, o Lambda não custa nada, e o DynamoDB em modo sob demanda cobra só o que é lido, gravado e guardado. E a página reduz a foto antes de enviar, o que diminui o que se transfere e o que se guarda.</w:t>
-      </w:r>
-    </w:p>
-    <w:p>
-      <w:pPr>
-        <w:pStyle w:val="BodyText"/>
-      </w:pPr>
-      <w:r>
-        <w:t xml:space="preserve">O pilar 6, Sustentabilidade, fica de fora pela mesma razão: sem medir o consumo de máquina, o número seria inventado. O passo de sustentabilidade que este desenho deixa para depois é não guardar o que ninguém usa: relatos com mais de 30 dias não aparecem em nenhuma consulta, mas continuam na tabela, porque a confirmação precisa dizer que o relato expirou (US-03, cenário 2). Apagá-los depois de um prazo maior caberia ao TTL do próprio DynamoDB, sem dar a nenhuma função permissão de excluir, e fica para quando houver volume que justifique.</w:t>
-      </w:r>
-    </w:p>
-    <w:p>
-      <w:pPr>
-        <w:pStyle w:val="BodyText"/>
-      </w:pPr>
-      <w:r>
-        <w:t xml:space="preserve">Das cinco preocupações do FURPS da Sprint 1, duas viraram requisito não funcional aqui. As outras três foram para outro lugar:</w:t>
+        <w:t xml:space="preserve">A linha leva o nome do campo recusado, e não o valor: o valor é texto escrito por quem enviou, e o registro não guarda nada de quem enviou, como o próprio RF-05 exige.</w:t>
+      </w:r>
+    </w:p>
+    <w:p>
+      <w:pPr>
+        <w:pStyle w:val="Heading3"/>
+      </w:pPr>
+      <w:r>
+        <w:t xml:space="preserve">1.1 Resumo</w:t>
       </w:r>
     </w:p>
     <w:tbl>
@@ -1441,8 +1440,11 @@
         <w:tblLook w:firstRow="1" w:lastRow="0" w:firstColumn="0" w:lastColumn="0" w:noHBand="0" w:noVBand="0" w:val="0020"/>
       </w:tblPr>
       <w:tblGrid>
-        <w:gridCol w:w="4338"/>
-        <w:gridCol w:w="3582"/>
+        <w:gridCol w:w="956"/>
+        <w:gridCol w:w="2022"/>
+        <w:gridCol w:w="2568"/>
+        <w:gridCol w:w="1624"/>
+        <w:gridCol w:w="750"/>
       </w:tblGrid>
       <w:tr>
         <w:trPr>
@@ -1456,6 +1458,449 @@
               <w:jc w:val="left"/>
             </w:pPr>
             <w:r>
+              <w:t xml:space="preserve">ID</w:t>
+            </w:r>
+          </w:p>
+        </w:tc>
+        <w:tc>
+          <w:tcPr/>
+          <w:p>
+            <w:pPr>
+              <w:pStyle w:val="Compact"/>
+              <w:jc w:val="left"/>
+            </w:pPr>
+            <w:r>
+              <w:t xml:space="preserve">Categoria</w:t>
+            </w:r>
+          </w:p>
+        </w:tc>
+        <w:tc>
+          <w:tcPr/>
+          <w:p>
+            <w:pPr>
+              <w:pStyle w:val="Compact"/>
+              <w:jc w:val="left"/>
+            </w:pPr>
+            <w:r>
+              <w:t xml:space="preserve">Métrica</w:t>
+            </w:r>
+          </w:p>
+        </w:tc>
+        <w:tc>
+          <w:tcPr/>
+          <w:p>
+            <w:pPr>
+              <w:pStyle w:val="Compact"/>
+              <w:jc w:val="left"/>
+            </w:pPr>
+            <w:r>
+              <w:t xml:space="preserve">Serviço AWS</w:t>
+            </w:r>
+          </w:p>
+        </w:tc>
+        <w:tc>
+          <w:tcPr/>
+          <w:p>
+            <w:pPr>
+              <w:pStyle w:val="Compact"/>
+              <w:jc w:val="left"/>
+            </w:pPr>
+            <w:r>
+              <w:t xml:space="preserve">Pilar</w:t>
+            </w:r>
+          </w:p>
+        </w:tc>
+      </w:tr>
+      <w:tr>
+        <w:tc>
+          <w:tcPr/>
+          <w:p>
+            <w:pPr>
+              <w:pStyle w:val="Compact"/>
+              <w:jc w:val="left"/>
+            </w:pPr>
+            <w:r>
+              <w:t xml:space="preserve">RNF-01</w:t>
+            </w:r>
+          </w:p>
+        </w:tc>
+        <w:tc>
+          <w:tcPr/>
+          <w:p>
+            <w:pPr>
+              <w:pStyle w:val="Compact"/>
+              <w:jc w:val="left"/>
+            </w:pPr>
+            <w:r>
+              <w:t xml:space="preserve">Reliability</w:t>
+            </w:r>
+          </w:p>
+        </w:tc>
+        <w:tc>
+          <w:tcPr/>
+          <w:p>
+            <w:pPr>
+              <w:pStyle w:val="Compact"/>
+              <w:jc w:val="left"/>
+            </w:pPr>
+            <w:r>
+              <w:t xml:space="preserve">zero duplicados em 5 reenvios do mesmo relato</w:t>
+            </w:r>
+          </w:p>
+        </w:tc>
+        <w:tc>
+          <w:tcPr/>
+          <w:p>
+            <w:pPr>
+              <w:pStyle w:val="Compact"/>
+              <w:jc w:val="left"/>
+            </w:pPr>
+            <w:r>
+              <w:t xml:space="preserve">Amazon DynamoDB</w:t>
+            </w:r>
+          </w:p>
+        </w:tc>
+        <w:tc>
+          <w:tcPr/>
+          <w:p>
+            <w:pPr>
+              <w:pStyle w:val="Compact"/>
+              <w:jc w:val="left"/>
+            </w:pPr>
+            <w:r>
+              <w:t xml:space="preserve">3</w:t>
+            </w:r>
+          </w:p>
+        </w:tc>
+      </w:tr>
+      <w:tr>
+        <w:tc>
+          <w:tcPr/>
+          <w:p>
+            <w:pPr>
+              <w:pStyle w:val="Compact"/>
+              <w:jc w:val="left"/>
+            </w:pPr>
+            <w:r>
+              <w:t xml:space="preserve">RNF-02</w:t>
+            </w:r>
+          </w:p>
+        </w:tc>
+        <w:tc>
+          <w:tcPr/>
+          <w:p>
+            <w:pPr>
+              <w:pStyle w:val="Compact"/>
+              <w:jc w:val="left"/>
+            </w:pPr>
+            <w:r>
+              <w:t xml:space="preserve">Segurança</w:t>
+            </w:r>
+          </w:p>
+        </w:tc>
+        <w:tc>
+          <w:tcPr/>
+          <w:p>
+            <w:pPr>
+              <w:pStyle w:val="Compact"/>
+              <w:jc w:val="left"/>
+            </w:pPr>
+            <w:r>
+              <w:t xml:space="preserve">1 ação pública, ler pelo endereço, e 0 de listar, gravar ou apagar</w:t>
+            </w:r>
+          </w:p>
+        </w:tc>
+        <w:tc>
+          <w:tcPr/>
+          <w:p>
+            <w:pPr>
+              <w:pStyle w:val="Compact"/>
+              <w:jc w:val="left"/>
+            </w:pPr>
+            <w:r>
+              <w:t xml:space="preserve">Amazon S3</w:t>
+            </w:r>
+          </w:p>
+        </w:tc>
+        <w:tc>
+          <w:tcPr/>
+          <w:p>
+            <w:pPr>
+              <w:pStyle w:val="Compact"/>
+              <w:jc w:val="left"/>
+            </w:pPr>
+            <w:r>
+              <w:t xml:space="preserve">2</w:t>
+            </w:r>
+          </w:p>
+        </w:tc>
+      </w:tr>
+      <w:tr>
+        <w:tc>
+          <w:tcPr/>
+          <w:p>
+            <w:pPr>
+              <w:pStyle w:val="Compact"/>
+              <w:jc w:val="left"/>
+            </w:pPr>
+            <w:r>
+              <w:t xml:space="preserve">RNF-03</w:t>
+            </w:r>
+          </w:p>
+        </w:tc>
+        <w:tc>
+          <w:tcPr/>
+          <w:p>
+            <w:pPr>
+              <w:pStyle w:val="Compact"/>
+              <w:jc w:val="left"/>
+            </w:pPr>
+            <w:r>
+              <w:t xml:space="preserve">Performance</w:t>
+            </w:r>
+          </w:p>
+        </w:tc>
+        <w:tc>
+          <w:tcPr/>
+          <w:p>
+            <w:pPr>
+              <w:pStyle w:val="Compact"/>
+              <w:jc w:val="left"/>
+            </w:pPr>
+            <w:r>
+              <w:t xml:space="preserve">p95 ≤ 500 ms, até 300 relatos na janela da estação</w:t>
+            </w:r>
+          </w:p>
+        </w:tc>
+        <w:tc>
+          <w:tcPr/>
+          <w:p>
+            <w:pPr>
+              <w:pStyle w:val="Compact"/>
+              <w:jc w:val="left"/>
+            </w:pPr>
+            <w:r>
+              <w:t xml:space="preserve">Amazon DynamoDB</w:t>
+            </w:r>
+          </w:p>
+        </w:tc>
+        <w:tc>
+          <w:tcPr/>
+          <w:p>
+            <w:pPr>
+              <w:pStyle w:val="Compact"/>
+              <w:jc w:val="left"/>
+            </w:pPr>
+            <w:r>
+              <w:t xml:space="preserve">4</w:t>
+            </w:r>
+          </w:p>
+        </w:tc>
+      </w:tr>
+      <w:tr>
+        <w:tc>
+          <w:tcPr/>
+          <w:p>
+            <w:pPr>
+              <w:pStyle w:val="Compact"/>
+              <w:jc w:val="left"/>
+            </w:pPr>
+            <w:r>
+              <w:t xml:space="preserve">RNF-04</w:t>
+            </w:r>
+          </w:p>
+        </w:tc>
+        <w:tc>
+          <w:tcPr/>
+          <w:p>
+            <w:pPr>
+              <w:pStyle w:val="Compact"/>
+              <w:jc w:val="left"/>
+            </w:pPr>
+            <w:r>
+              <w:t xml:space="preserve">Reliability</w:t>
+            </w:r>
+          </w:p>
+        </w:tc>
+        <w:tc>
+          <w:tcPr/>
+          <w:p>
+            <w:pPr>
+              <w:pStyle w:val="Compact"/>
+              <w:jc w:val="left"/>
+            </w:pPr>
+            <w:r>
+              <w:t xml:space="preserve">1 confirmação somada em 5 reenvios da mesma confirmação</w:t>
+            </w:r>
+          </w:p>
+        </w:tc>
+        <w:tc>
+          <w:tcPr/>
+          <w:p>
+            <w:pPr>
+              <w:pStyle w:val="Compact"/>
+              <w:jc w:val="left"/>
+            </w:pPr>
+            <w:r>
+              <w:t xml:space="preserve">Amazon DynamoDB</w:t>
+            </w:r>
+          </w:p>
+        </w:tc>
+        <w:tc>
+          <w:tcPr/>
+          <w:p>
+            <w:pPr>
+              <w:pStyle w:val="Compact"/>
+              <w:jc w:val="left"/>
+            </w:pPr>
+            <w:r>
+              <w:t xml:space="preserve">3</w:t>
+            </w:r>
+          </w:p>
+        </w:tc>
+      </w:tr>
+      <w:tr>
+        <w:tc>
+          <w:tcPr/>
+          <w:p>
+            <w:pPr>
+              <w:pStyle w:val="Compact"/>
+              <w:jc w:val="left"/>
+            </w:pPr>
+            <w:r>
+              <w:t xml:space="preserve">RNF-05</w:t>
+            </w:r>
+          </w:p>
+        </w:tc>
+        <w:tc>
+          <w:tcPr/>
+          <w:p>
+            <w:pPr>
+              <w:pStyle w:val="Compact"/>
+              <w:jc w:val="left"/>
+            </w:pPr>
+            <w:r>
+              <w:t xml:space="preserve">Observabilidade</w:t>
+            </w:r>
+          </w:p>
+        </w:tc>
+        <w:tc>
+          <w:tcPr/>
+          <w:p>
+            <w:pPr>
+              <w:pStyle w:val="Compact"/>
+              <w:jc w:val="left"/>
+            </w:pPr>
+            <w:r>
+              <w:t xml:space="preserve">1 linha por recusa, visível em ≤ 10 s</w:t>
+            </w:r>
+          </w:p>
+        </w:tc>
+        <w:tc>
+          <w:tcPr/>
+          <w:p>
+            <w:pPr>
+              <w:pStyle w:val="Compact"/>
+              <w:jc w:val="left"/>
+            </w:pPr>
+            <w:r>
+              <w:t xml:space="preserve">Amazon CloudWatch Logs</w:t>
+            </w:r>
+          </w:p>
+        </w:tc>
+        <w:tc>
+          <w:tcPr/>
+          <w:p>
+            <w:pPr>
+              <w:pStyle w:val="Compact"/>
+              <w:jc w:val="left"/>
+            </w:pPr>
+            <w:r>
+              <w:t xml:space="preserve">1</w:t>
+            </w:r>
+          </w:p>
+        </w:tc>
+      </w:tr>
+    </w:tbl>
+    <w:p>
+      <w:pPr>
+        <w:pStyle w:val="BodyText"/>
+      </w:pPr>
+      <w:r>
+        <w:t xml:space="preserve">Pilares: 1 Excelência Operacional, 2 Segurança, 3 Confiabilidade, 4 Eficiência de Performance, 5 Otimização de Custos, 6 Sustentabilidade.</w:t>
+      </w:r>
+    </w:p>
+    <w:p>
+      <w:pPr>
+        <w:pStyle w:val="BodyText"/>
+      </w:pPr>
+      <w:r>
+        <w:t xml:space="preserve">Ter dois requisitos no pilar 3 não é acaso: os dois caminhos que gravam, o relato e a confirmação, atravessam o mesmo túnel sem sinal.</w:t>
+      </w:r>
+    </w:p>
+    <w:p>
+      <w:pPr>
+        <w:pStyle w:val="Heading3"/>
+      </w:pPr>
+      <w:r>
+        <w:t xml:space="preserve">1.2 O pilar não contemplado</w:t>
+      </w:r>
+    </w:p>
+    <w:p>
+      <w:pPr>
+        <w:pStyle w:val="FirstParagraph"/>
+      </w:pPr>
+      <w:r>
+        <w:t xml:space="preserve">Ficaram de fora dois pilares: o 5 e o 6.</w:t>
+      </w:r>
+    </w:p>
+    <w:p>
+      <w:pPr>
+        <w:pStyle w:val="BodyText"/>
+      </w:pPr>
+      <w:r>
+        <w:t xml:space="preserve">O pilar 5, Otimização de Custos, não virou requisito porque em ambiente emulado não existe fatura, e qualquer número de custo seria inventado. Mesmo sem ele, o desenho escolhe serviços cobrados por uso: parado, o Lambda não custa nada, e o DynamoDB em modo sob demanda cobra só o que é lido, gravado e guardado. E a página reduz a foto antes de enviar, o que diminui o que se transfere e o que se guarda.</w:t>
+      </w:r>
+    </w:p>
+    <w:p>
+      <w:pPr>
+        <w:pStyle w:val="BodyText"/>
+      </w:pPr>
+      <w:r>
+        <w:t xml:space="preserve">O pilar 6, Sustentabilidade, fica de fora pela mesma razão: sem medir o consumo de máquina, o número seria inventado. O passo de sustentabilidade que este desenho deixa para depois é não guardar o que ninguém usa: relatos com mais de 30 dias não aparecem em nenhuma consulta, mas continuam na tabela, porque a confirmação precisa dizer que o relato expirou (US-03, cenário 2). Apagá-los depois de um prazo maior caberia ao TTL do próprio DynamoDB, sem dar a nenhuma função permissão de excluir, e fica para quando houver volume que justifique.</w:t>
+      </w:r>
+    </w:p>
+    <w:p>
+      <w:pPr>
+        <w:pStyle w:val="BodyText"/>
+      </w:pPr>
+      <w:r>
+        <w:t xml:space="preserve">As preocupações do FURPS da Sprint 1 também foram para algum lugar:</w:t>
+      </w:r>
+    </w:p>
+    <w:tbl>
+      <w:tblPr>
+        <w:tblStyle w:val="Table"/>
+        <w:tblW w:type="pct" w:w="5000"/>
+        <w:jc w:val="left"/>
+        <w:tblLook w:firstRow="1" w:lastRow="0" w:firstColumn="0" w:lastColumn="0" w:noHBand="0" w:noVBand="0" w:val="0020"/>
+      </w:tblPr>
+      <w:tblGrid>
+        <w:gridCol w:w="4505"/>
+        <w:gridCol w:w="3415"/>
+      </w:tblGrid>
+      <w:tr>
+        <w:trPr>
+          <w:tblHeader w:val="true"/>
+        </w:trPr>
+        <w:tc>
+          <w:tcPr/>
+          <w:p>
+            <w:pPr>
+              <w:pStyle w:val="Compact"/>
+              <w:jc w:val="left"/>
+            </w:pPr>
+            <w:r>
               <w:t xml:space="preserve">FURPS</w:t>
             </w:r>
           </w:p>
@@ -1520,7 +1965,7 @@
               <w:jc w:val="left"/>
             </w:pPr>
             <w:r>
-              <w:t xml:space="preserve">vira o desenho da página na Sprint 4; não há número que se confira no LocalStack</w:t>
+              <w:t xml:space="preserve">vira o desenho da página na Sprint 4</w:t>
             </w:r>
           </w:p>
         </w:tc>
@@ -1546,7 +1991,7 @@
               <w:jc w:val="left"/>
             </w:pPr>
             <w:r>
-              <w:t xml:space="preserve">RNF-02</w:t>
+              <w:t xml:space="preserve">RNF-01 e RNF-04</w:t>
             </w:r>
           </w:p>
         </w:tc>
@@ -1572,7 +2017,7 @@
               <w:jc w:val="left"/>
             </w:pPr>
             <w:r>
-              <w:t xml:space="preserve">RNF-01</w:t>
+              <w:t xml:space="preserve">RNF-03</w:t>
             </w:r>
           </w:p>
         </w:tc>
@@ -1604,6 +2049,14 @@
         </w:tc>
       </w:tr>
     </w:tbl>
+    <w:p>
+      <w:pPr>
+        <w:pStyle w:val="BodyText"/>
+      </w:pPr>
+      <w:r>
+        <w:t xml:space="preserve">Duas proteções que o desenho tem não são requisitos não funcionais, porque não são a qualidade de um dos cinco requisitos funcionais: são decisões, e estão na seção 9. A primeira é o anonimato no registro e nas fotos: o RD-01 já é a regra, e o desenho a garante nos pontos em que ela quebraria sem ninguém perceber, o IP que chega à função e o EXIF que vem na foto. A segunda é o limite de uma confirmação a cada 10 minutos por relato, que é a resposta ao risco de confirmações repetidas que a seção 8 da Sprint 1 deixou declarado.</w:t>
+      </w:r>
+    </w:p>
     <w:p>
       <w:pPr>
         <w:pStyle w:val="Heading2"/>
@@ -1915,7 +2368,7 @@
         <w:t xml:space="preserve">consultar</w:t>
       </w:r>
       <w:r>
-        <w:t xml:space="preserve"> não pode assinar um endereço temporário, porque o RF-03 a limita a ler a tabela. O que o navegador consegue fazer ali é ler um arquivo cujo endereço ele já recebeu. Ele não consegue listar o bucket, nem gravar, nem apagar, e o que ele lê não tem dado de ninguém (RD-02 e RNF-03).</w:t>
+        <w:t xml:space="preserve"> não pode assinar um endereço temporário, porque o RF-03 a limita a ler a tabela. O que o navegador consegue fazer ali é ler um arquivo cujo endereço ele já recebeu. Ele não consegue listar o bucket, nem gravar, nem apagar (RNF-02), e o que ele lê não tem dado de ninguém (RD-02 e a limpeza da foto, seção 9).</w:t>
       </w:r>
     </w:p>
     <w:p>
@@ -1934,8 +2387,8 @@
         <w:tblLook w:firstRow="1" w:lastRow="0" w:firstColumn="0" w:lastColumn="0" w:noHBand="0" w:noVBand="0" w:val="0020"/>
       </w:tblPr>
       <w:tblGrid>
-        <w:gridCol w:w="1610"/>
-        <w:gridCol w:w="6310"/>
+        <w:gridCol w:w="1614"/>
+        <w:gridCol w:w="6306"/>
       </w:tblGrid>
       <w:tr>
         <w:trPr>
@@ -2092,7 +2545,7 @@
               <w:jc w:val="left"/>
             </w:pPr>
             <w:r>
-              <w:t xml:space="preserve">Por duas razões do cenário. Entre a chegada da foto ao bucket e a limpeza, a foto ficaria guardada com a localização do aparelho no EXIF, o que o RD-01 e o RNF-03 não permitem nem por alguns segundos. E a passageira enviaria o relato sem receber, na mesma resposta, o protocolo ou o campo recusado, que a US-01 cobra nos dois cenários.</w:t>
+              <w:t xml:space="preserve">Por duas razões do cenário. Entre a chegada da foto ao bucket e a limpeza, a foto ficaria guardada com a localização do aparelho no EXIF, o que o RD-01 não permite nem por alguns segundos. E a passageira enviaria o relato sem receber, na mesma resposta, o protocolo ou o campo recusado, que a US-01 cobra nos dois cenários.</w:t>
             </w:r>
           </w:p>
         </w:tc>
@@ -2305,7 +2758,7 @@
         <w:t xml:space="preserve">Event Sourcing.</w:t>
       </w:r>
       <w:r>
-        <w:t xml:space="preserve"> Hoje o relato guarda o estado atual: quantas confirmações recebeu e quando foi a última. A soma esconde o ritmo. Um relato com 9 confirmações pode tê-las recebido todas na primeira semana e nenhuma depois, e o problema pode já ter sido consertado; ou pode ter recebido uma por semana, o que diz que ele continua. Para quem decide por onde andar, essa diferença importa mais do que o total. Com Event Sourcing, cada confirmação seria guardada como um acontecimento, com a data, sem apagar nenhum, e o número exibido seria a soma deles. A consulta poderia mostrar "confirmado 3 vezes na última semana", e uma rajada de confirmações no mesmo dia, o sinal de fraude que o RNF-04 só desacelera, ficaria visível.</w:t>
+        <w:t xml:space="preserve"> Hoje o relato guarda o estado atual: quantas confirmações recebeu e quando foi a última. A soma esconde o ritmo. Um relato com 9 confirmações pode tê-las recebido todas na primeira semana e nenhuma depois, e o problema pode já ter sido consertado; ou pode ter recebido uma por semana, o que diz que ele continua. Para quem decide por onde andar, essa diferença importa mais do que o total. Com Event Sourcing, cada confirmação seria guardada como um acontecimento, com a data, sem apagar nenhum, e o número exibido seria a soma deles. A consulta poderia mostrar "confirmado 3 vezes na última semana", e uma rajada de confirmações no mesmo dia, o sinal de fraude que o limite de 10 minutos só desacelera, ficaria visível.</w:t>
       </w:r>
     </w:p>
     <w:p>
@@ -2331,7 +2784,7 @@
         <w:t xml:space="preserve">consultar</w:t>
       </w:r>
       <w:r>
-        <w:t xml:space="preserve">, que passaria a somá-los. Não entra no desenho porque a consulta passaria a ler um item por confirmação, além de um por relato, e o RNF-01 foi escrito para 300 relatos, não para 300 relatos e milhares de confirmações. O que o desenho atual já consegue mostrar é a data da última confirmação; o ritmo, não.</w:t>
+        <w:t xml:space="preserve">, que passaria a somá-los. Não entra no desenho porque a consulta passaria a ler um item por confirmação, além de um por relato, e o RNF-03 foi escrito para 300 relatos, não para 300 relatos e milhares de confirmações. O que o desenho atual já consegue mostrar é a data da última confirmação; o ritmo, não.</w:t>
       </w:r>
     </w:p>
     <w:p>
@@ -2384,10 +2837,10 @@
         <w:tblLook w:firstRow="1" w:lastRow="0" w:firstColumn="0" w:lastColumn="0" w:noHBand="0" w:noVBand="0" w:val="0020"/>
       </w:tblPr>
       <w:tblGrid>
-        <w:gridCol w:w="1251"/>
-        <w:gridCol w:w="1982"/>
-        <w:gridCol w:w="3318"/>
-        <w:gridCol w:w="1369"/>
+        <w:gridCol w:w="1246"/>
+        <w:gridCol w:w="1975"/>
+        <w:gridCol w:w="3340"/>
+        <w:gridCol w:w="1359"/>
       </w:tblGrid>
       <w:tr>
         <w:trPr>
@@ -2475,19 +2928,19 @@
               <w:jc w:val="left"/>
             </w:pPr>
             <w:r>
-              <w:t xml:space="preserve">Mostra o formulário, a consulta e o botão de confirmar; limpa e reduz a foto e gera o código de envio antes de enviar</w:t>
-            </w:r>
-          </w:p>
-        </w:tc>
-        <w:tc>
-          <w:tcPr/>
-          <w:p>
-            <w:pPr>
-              <w:pStyle w:val="Compact"/>
-              <w:jc w:val="left"/>
-            </w:pPr>
-            <w:r>
-              <w:t xml:space="preserve">US-01, US-02, US-03, RNF-02, RNF-03</w:t>
+              <w:t xml:space="preserve">Mostra o formulário, a consulta e o botão de confirmar; limpa e reduz a foto e gera o código de cada envio e de cada confirmação</w:t>
+            </w:r>
+          </w:p>
+        </w:tc>
+        <w:tc>
+          <w:tcPr/>
+          <w:p>
+            <w:pPr>
+              <w:pStyle w:val="Compact"/>
+              <w:jc w:val="left"/>
+            </w:pPr>
+            <w:r>
+              <w:t xml:space="preserve">US-01, US-02, US-03, RNF-01, RNF-04</w:t>
             </w:r>
           </w:p>
         </w:tc>
@@ -2667,7 +3120,7 @@
               <w:jc w:val="left"/>
             </w:pPr>
             <w:r>
-              <w:t xml:space="preserve">RF-01, RF-02, RF-05, RNF-02, RNF-03</w:t>
+              <w:t xml:space="preserve">RF-01, RF-02, RF-05, RNF-01, RNF-05</w:t>
             </w:r>
           </w:p>
         </w:tc>
@@ -2726,7 +3179,7 @@
               <w:jc w:val="left"/>
             </w:pPr>
             <w:r>
-              <w:t xml:space="preserve">RF-03, RNF-01</w:t>
+              <w:t xml:space="preserve">RF-03, RNF-03</w:t>
             </w:r>
           </w:p>
         </w:tc>
@@ -2764,19 +3217,19 @@
               <w:jc w:val="left"/>
             </w:pPr>
             <w:r>
-              <w:t xml:space="preserve">Soma 1 confirmação, só se o relato tiver até 30 dias e a última tiver mais de 10 minutos</w:t>
-            </w:r>
-          </w:p>
-        </w:tc>
-        <w:tc>
-          <w:tcPr/>
-          <w:p>
-            <w:pPr>
-              <w:pStyle w:val="Compact"/>
-              <w:jc w:val="left"/>
-            </w:pPr>
-            <w:r>
-              <w:t xml:space="preserve">RF-04, RNF-02, RNF-04</w:t>
+              <w:t xml:space="preserve">Soma 1 confirmação, só se o relato tiver até 30 dias e o código da confirmação for novo</w:t>
+            </w:r>
+          </w:p>
+        </w:tc>
+        <w:tc>
+          <w:tcPr/>
+          <w:p>
+            <w:pPr>
+              <w:pStyle w:val="Compact"/>
+              <w:jc w:val="left"/>
+            </w:pPr>
+            <w:r>
+              <w:t xml:space="preserve">RF-04, RNF-04</w:t>
             </w:r>
           </w:p>
         </w:tc>
@@ -2841,7 +3294,7 @@
               <w:jc w:val="left"/>
             </w:pPr>
             <w:r>
-              <w:t xml:space="preserve">RF-01, RF-03, RF-04, RNF-01</w:t>
+              <w:t xml:space="preserve">RF-01, RF-03, RF-04, RNF-03</w:t>
             </w:r>
           </w:p>
         </w:tc>
@@ -2894,7 +3347,7 @@
               <w:t xml:space="preserve">fotos/&lt;estacao_id&gt;/&lt;protocolo&gt;.jpg</w:t>
             </w:r>
             <w:r>
-              <w:t xml:space="preserve">, com leitura pelo endereço exato</w:t>
+              <w:t xml:space="preserve">; o público só lê, pelo endereço exato</w:t>
             </w:r>
           </w:p>
         </w:tc>
@@ -2953,19 +3406,28 @@
               <w:t xml:space="preserve">consultar</w:t>
             </w:r>
             <w:r>
-              <w:t xml:space="preserve"> só lê</w:t>
-            </w:r>
-          </w:p>
-        </w:tc>
-        <w:tc>
-          <w:tcPr/>
-          <w:p>
-            <w:pPr>
-              <w:pStyle w:val="Compact"/>
-              <w:jc w:val="left"/>
-            </w:pPr>
-            <w:r>
-              <w:t xml:space="preserve">RF-03</w:t>
+              <w:t xml:space="preserve"> só lê, e só a </w:t>
+            </w:r>
+            <w:r>
+              <w:rPr>
+                <w:rStyle w:val="VerbatimChar"/>
+              </w:rPr>
+              <w:t xml:space="preserve">registrar</w:t>
+            </w:r>
+            <w:r>
+              <w:t xml:space="preserve"> grava no bucket</w:t>
+            </w:r>
+          </w:p>
+        </w:tc>
+        <w:tc>
+          <w:tcPr/>
+          <w:p>
+            <w:pPr>
+              <w:pStyle w:val="Compact"/>
+              <w:jc w:val="left"/>
+            </w:pPr>
+            <w:r>
+              <w:t xml:space="preserve">RF-03, RNF-02</w:t>
             </w:r>
           </w:p>
         </w:tc>
@@ -3015,7 +3477,7 @@
               <w:jc w:val="left"/>
             </w:pPr>
             <w:r>
-              <w:t xml:space="preserve">RF-05, RNF-03</w:t>
+              <w:t xml:space="preserve">RF-05, RNF-05</w:t>
             </w:r>
           </w:p>
         </w:tc>
@@ -3034,7 +3496,7 @@
         <w:pStyle w:val="FirstParagraph"/>
       </w:pPr>
       <w:r>
-        <w:t xml:space="preserve">A passageira escolhe a estação na lista, o tipo de problema e a faixa de horário, escreve a descrição, tira ou escolhe a foto e toca em "Enviar relato". Antes de enviar, a página faz duas coisas: redesenha a foto, o que tira dela os metadados EXIF e a reduz para no máximo 1600 pixels no lado maior (RNF-03), e gera um código aleatório para aquele envio, que ela repete se precisar tentar de novo (RNF-02). Envia tudo em um único POST para a rota </w:t>
+        <w:t xml:space="preserve">A passageira escolhe a estação na lista, o tipo de problema e a faixa de horário, escreve a descrição, tira ou escolhe a foto e toca em "Enviar relato". Antes de enviar, a página faz duas coisas: redesenha a foto, o que tira dela os metadados EXIF e a reduz para no máximo 1600 pixels no lado maior (RD-01, seção 9), e gera um código aleatório para aquele envio, que ela repete se precisar tentar de novo (RNF-01). Envia tudo em um único POST para a rota </w:t>
       </w:r>
       <w:r>
         <w:rPr>
@@ -3060,7 +3522,7 @@
         <w:t xml:space="preserve">registrar</w:t>
       </w:r>
       <w:r>
-        <w:t xml:space="preserve">. Ela confere, nesta ordem, a estação na lista aceita, o tipo de problema, a faixa de horário, a foto (presente, com até 2 MB e sem EXIF) e a descrição, se houver, com até 500 caracteres. No primeiro campo recusado, devolve 400 dizendo qual foi, e imprime uma linha com a operação e o nome do campo recusado. O valor recusado não vai para o registro: é texto escrito por quem enviou, e o registro não guarda nada de quem enviou (RF-05 e RNF-03).</w:t>
+        <w:t xml:space="preserve">. Ela confere, nesta ordem, a estação na lista aceita, o tipo de problema, a faixa de horário, a foto (presente, com até 2 MB e sem EXIF) e a descrição, se houver, com até 500 caracteres. No primeiro campo recusado, devolve 400 dizendo qual foi, e imprime uma linha com a operação e o nome do campo recusado, sem o valor e sem nada de quem enviou (RF-05 e RNF-05).</w:t>
       </w:r>
     </w:p>
     <w:p>
@@ -3068,7 +3530,7 @@
         <w:pStyle w:val="BodyText"/>
       </w:pPr>
       <w:r>
-        <w:t xml:space="preserve">Com tudo válido, a função deriva o protocolo do código de envio e confere se ele já existe na tabela. Se existir, é um reenvio: a função não toca na foto nem na tabela e devolve o mesmo protocolo (RNF-02). Se não existir, a foto vai primeiro: ela é gravada no S3, em </w:t>
+        <w:t xml:space="preserve">Com tudo válido, a função deriva o protocolo do código de envio e confere se ele já existe na tabela. Se existir, é um reenvio: a função não toca na foto nem na tabela e devolve o mesmo protocolo (RNF-01). Se não existir, a foto vai primeiro: ela é gravada no S3, em </w:t>
       </w:r>
       <w:r>
         <w:rPr>
@@ -3129,7 +3591,7 @@
         <w:t xml:space="preserve">confirmar</w:t>
       </w:r>
       <w:r>
-        <w:t xml:space="preserve">, que soma 1 ao relato numa única atualização condicional: a soma só acontece se o relato tiver até 30 dias (RF-04), se a última confirmação tiver mais de 10 minutos (RNF-04) e se o código daquela confirmação não for o da última somada (RNF-02). Se a condição falhar, a função lê o relato para dizer o porquê: expirou, foi confirmado há pouco, ou aquela mesma confirmação já tinha sido somada, e então é um reenvio e a resposta é de sucesso.</w:t>
+        <w:t xml:space="preserve">, que soma 1 ao relato numa única atualização condicional: a soma só acontece se o relato tiver até 30 dias (RF-04), se o código daquela confirmação não for o da última somada (RNF-04) e se a última confirmação tiver mais de 10 minutos (seção 9). Se a condição falhar, a função lê o relato para dizer o porquê: expirou, foi confirmado há pouco, ou aquela mesma confirmação já tinha sido somada, e então é um reenvio e a resposta é de sucesso.</w:t>
       </w:r>
     </w:p>
     <w:p>
@@ -3463,7 +3925,7 @@
               <w:jc w:val="left"/>
             </w:pPr>
             <w:r>
-              <w:t xml:space="preserve">Relatar, consultar e confirmar continuam funcionando; o que se perde é a prova do RF-05 e do RNF-03 durante a queda</w:t>
+              <w:t xml:space="preserve">Relatar, consultar e confirmar continuam funcionando; o que se perde é a prova do RF-05 e do RNF-05 durante a queda</w:t>
             </w:r>
           </w:p>
         </w:tc>
@@ -3493,10 +3955,10 @@
         <w:tblLook w:firstRow="1" w:lastRow="0" w:firstColumn="0" w:lastColumn="0" w:noHBand="0" w:noVBand="0" w:val="0020"/>
       </w:tblPr>
       <w:tblGrid>
-        <w:gridCol w:w="1046"/>
-        <w:gridCol w:w="2679"/>
-        <w:gridCol w:w="2766"/>
-        <w:gridCol w:w="1429"/>
+        <w:gridCol w:w="1045"/>
+        <w:gridCol w:w="2677"/>
+        <w:gridCol w:w="2758"/>
+        <w:gridCol w:w="1440"/>
       </w:tblGrid>
       <w:tr>
         <w:trPr>
@@ -4088,7 +4550,7 @@
               <w:jc w:val="left"/>
             </w:pPr>
             <w:r>
-              <w:t xml:space="preserve">não: só depois da primeira confirmação (RNF-04)</w:t>
+              <w:t xml:space="preserve">não: só depois da primeira confirmação (limite de 10 minutos, seção 9)</w:t>
             </w:r>
           </w:p>
         </w:tc>
@@ -4141,7 +4603,7 @@
               <w:jc w:val="left"/>
             </w:pPr>
             <w:r>
-              <w:t xml:space="preserve">não: só depois da primeira confirmação (RNF-02)</w:t>
+              <w:t xml:space="preserve">não: só depois da primeira confirmação (RNF-04)</w:t>
             </w:r>
           </w:p>
         </w:tc>
@@ -4676,7 +5138,7 @@
               <w:jc w:val="left"/>
             </w:pPr>
             <w:r>
-              <w:t xml:space="preserve">Uma foto chega a 2 MB, e um item do DynamoDB aceita no máximo 400 KB. A tabela guarda só o caminho. O protocolo no nome faz o reenvio regravar a mesma foto, em vez de criar outra (RNF-02)</w:t>
+              <w:t xml:space="preserve">Uma foto chega a 2 MB, e um item do DynamoDB aceita no máximo 400 KB. A tabela guarda só o caminho. O protocolo no nome faz o reenvio regravar a mesma foto, em vez de criar outra (RNF-01)</w:t>
             </w:r>
           </w:p>
         </w:tc>
@@ -4813,10 +5275,10 @@
         <w:tblLook w:firstRow="1" w:lastRow="0" w:firstColumn="0" w:lastColumn="0" w:noHBand="0" w:noVBand="0" w:val="0020"/>
       </w:tblPr>
       <w:tblGrid>
-        <w:gridCol w:w="1090"/>
-        <w:gridCol w:w="4611"/>
-        <w:gridCol w:w="740"/>
-        <w:gridCol w:w="1479"/>
+        <w:gridCol w:w="1077"/>
+        <w:gridCol w:w="4646"/>
+        <w:gridCol w:w="734"/>
+        <w:gridCol w:w="1463"/>
       </w:tblGrid>
       <w:tr>
         <w:trPr>
@@ -5180,6 +5642,206 @@
               <w:jc w:val="left"/>
             </w:pPr>
             <w:r>
+              <w:t xml:space="preserve">RNF-02</w:t>
+            </w:r>
+          </w:p>
+        </w:tc>
+        <w:tc>
+          <w:tcPr/>
+          <w:p>
+            <w:pPr>
+              <w:pStyle w:val="Compact"/>
+              <w:jc w:val="left"/>
+            </w:pPr>
+            <w:r>
+              <w:t xml:space="preserve">O público só lê a foto: zero ações de listar, gravar ou apagar no bucket</w:t>
+            </w:r>
+          </w:p>
+        </w:tc>
+        <w:tc>
+          <w:tcPr/>
+          <w:p>
+            <w:pPr>
+              <w:pStyle w:val="Compact"/>
+              <w:jc w:val="left"/>
+            </w:pPr>
+            <w:r>
+              <w:t xml:space="preserve">RNF</w:t>
+            </w:r>
+          </w:p>
+        </w:tc>
+        <w:tc>
+          <w:tcPr/>
+          <w:p>
+            <w:pPr>
+              <w:pStyle w:val="Compact"/>
+              <w:jc w:val="left"/>
+            </w:pPr>
+            <w:r>
+              <w:t xml:space="preserve">Alta</w:t>
+            </w:r>
+          </w:p>
+        </w:tc>
+      </w:tr>
+      <w:tr>
+        <w:tc>
+          <w:tcPr/>
+          <w:p>
+            <w:pPr>
+              <w:pStyle w:val="Compact"/>
+              <w:jc w:val="left"/>
+            </w:pPr>
+            <w:r>
+              <w:t xml:space="preserve">RF-04</w:t>
+            </w:r>
+          </w:p>
+        </w:tc>
+        <w:tc>
+          <w:tcPr/>
+          <w:p>
+            <w:pPr>
+              <w:pStyle w:val="Compact"/>
+              <w:jc w:val="left"/>
+            </w:pPr>
+            <w:r>
+              <w:t xml:space="preserve">Somar uma confirmação a um relato de até 30 dias</w:t>
+            </w:r>
+          </w:p>
+        </w:tc>
+        <w:tc>
+          <w:tcPr/>
+          <w:p>
+            <w:pPr>
+              <w:pStyle w:val="Compact"/>
+              <w:jc w:val="left"/>
+            </w:pPr>
+            <w:r>
+              <w:t xml:space="preserve">RF</w:t>
+            </w:r>
+          </w:p>
+        </w:tc>
+        <w:tc>
+          <w:tcPr/>
+          <w:p>
+            <w:pPr>
+              <w:pStyle w:val="Compact"/>
+              <w:jc w:val="left"/>
+            </w:pPr>
+            <w:r>
+              <w:t xml:space="preserve">Média</w:t>
+            </w:r>
+          </w:p>
+        </w:tc>
+      </w:tr>
+      <w:tr>
+        <w:tc>
+          <w:tcPr/>
+          <w:p>
+            <w:pPr>
+              <w:pStyle w:val="Compact"/>
+              <w:jc w:val="left"/>
+            </w:pPr>
+            <w:r>
+              <w:t xml:space="preserve">US-03</w:t>
+            </w:r>
+          </w:p>
+        </w:tc>
+        <w:tc>
+          <w:tcPr/>
+          <w:p>
+            <w:pPr>
+              <w:pStyle w:val="Compact"/>
+              <w:jc w:val="left"/>
+            </w:pPr>
+            <w:r>
+              <w:t xml:space="preserve">A passageira confirma um relato existente</w:t>
+            </w:r>
+          </w:p>
+        </w:tc>
+        <w:tc>
+          <w:tcPr/>
+          <w:p>
+            <w:pPr>
+              <w:pStyle w:val="Compact"/>
+              <w:jc w:val="left"/>
+            </w:pPr>
+            <w:r>
+              <w:t xml:space="preserve">US</w:t>
+            </w:r>
+          </w:p>
+        </w:tc>
+        <w:tc>
+          <w:tcPr/>
+          <w:p>
+            <w:pPr>
+              <w:pStyle w:val="Compact"/>
+              <w:jc w:val="left"/>
+            </w:pPr>
+            <w:r>
+              <w:t xml:space="preserve">Média</w:t>
+            </w:r>
+          </w:p>
+        </w:tc>
+      </w:tr>
+      <w:tr>
+        <w:tc>
+          <w:tcPr/>
+          <w:p>
+            <w:pPr>
+              <w:pStyle w:val="Compact"/>
+              <w:jc w:val="left"/>
+            </w:pPr>
+            <w:r>
+              <w:t xml:space="preserve">RNF-01</w:t>
+            </w:r>
+          </w:p>
+        </w:tc>
+        <w:tc>
+          <w:tcPr/>
+          <w:p>
+            <w:pPr>
+              <w:pStyle w:val="Compact"/>
+              <w:jc w:val="left"/>
+            </w:pPr>
+            <w:r>
+              <w:t xml:space="preserve">Zero relatos duplicados em 5 reenvios do mesmo relato</w:t>
+            </w:r>
+          </w:p>
+        </w:tc>
+        <w:tc>
+          <w:tcPr/>
+          <w:p>
+            <w:pPr>
+              <w:pStyle w:val="Compact"/>
+              <w:jc w:val="left"/>
+            </w:pPr>
+            <w:r>
+              <w:t xml:space="preserve">RNF</w:t>
+            </w:r>
+          </w:p>
+        </w:tc>
+        <w:tc>
+          <w:tcPr/>
+          <w:p>
+            <w:pPr>
+              <w:pStyle w:val="Compact"/>
+              <w:jc w:val="left"/>
+            </w:pPr>
+            <w:r>
+              <w:t xml:space="preserve">Média</w:t>
+            </w:r>
+          </w:p>
+        </w:tc>
+      </w:tr>
+      <w:tr>
+        <w:tc>
+          <w:tcPr/>
+          <w:p>
+            <w:pPr>
+              <w:pStyle w:val="Compact"/>
+              <w:jc w:val="left"/>
+            </w:pPr>
+            <w:r>
               <w:t xml:space="preserve">RNF-03</w:t>
             </w:r>
           </w:p>
@@ -5192,7 +5854,7 @@
               <w:jc w:val="left"/>
             </w:pPr>
             <w:r>
-              <w:t xml:space="preserve">Zero IP, navegador ou EXIF guardados</w:t>
+              <w:t xml:space="preserve">Consulta da estação em até 500 ms no p95</w:t>
             </w:r>
           </w:p>
         </w:tc>
@@ -5216,56 +5878,6 @@
               <w:jc w:val="left"/>
             </w:pPr>
             <w:r>
-              <w:t xml:space="preserve">Alta</w:t>
-            </w:r>
-          </w:p>
-        </w:tc>
-      </w:tr>
-      <w:tr>
-        <w:tc>
-          <w:tcPr/>
-          <w:p>
-            <w:pPr>
-              <w:pStyle w:val="Compact"/>
-              <w:jc w:val="left"/>
-            </w:pPr>
-            <w:r>
-              <w:t xml:space="preserve">RF-04</w:t>
-            </w:r>
-          </w:p>
-        </w:tc>
-        <w:tc>
-          <w:tcPr/>
-          <w:p>
-            <w:pPr>
-              <w:pStyle w:val="Compact"/>
-              <w:jc w:val="left"/>
-            </w:pPr>
-            <w:r>
-              <w:t xml:space="preserve">Somar uma confirmação a um relato de até 30 dias</w:t>
-            </w:r>
-          </w:p>
-        </w:tc>
-        <w:tc>
-          <w:tcPr/>
-          <w:p>
-            <w:pPr>
-              <w:pStyle w:val="Compact"/>
-              <w:jc w:val="left"/>
-            </w:pPr>
-            <w:r>
-              <w:t xml:space="preserve">RF</w:t>
-            </w:r>
-          </w:p>
-        </w:tc>
-        <w:tc>
-          <w:tcPr/>
-          <w:p>
-            <w:pPr>
-              <w:pStyle w:val="Compact"/>
-              <w:jc w:val="left"/>
-            </w:pPr>
-            <w:r>
               <w:t xml:space="preserve">Média</w:t>
             </w:r>
           </w:p>
@@ -5280,31 +5892,31 @@
               <w:jc w:val="left"/>
             </w:pPr>
             <w:r>
-              <w:t xml:space="preserve">US-03</w:t>
-            </w:r>
-          </w:p>
-        </w:tc>
-        <w:tc>
-          <w:tcPr/>
-          <w:p>
-            <w:pPr>
-              <w:pStyle w:val="Compact"/>
-              <w:jc w:val="left"/>
-            </w:pPr>
-            <w:r>
-              <w:t xml:space="preserve">A passageira confirma um relato existente</w:t>
-            </w:r>
-          </w:p>
-        </w:tc>
-        <w:tc>
-          <w:tcPr/>
-          <w:p>
-            <w:pPr>
-              <w:pStyle w:val="Compact"/>
-              <w:jc w:val="left"/>
-            </w:pPr>
-            <w:r>
-              <w:t xml:space="preserve">US</w:t>
+              <w:t xml:space="preserve">RNF-04</w:t>
+            </w:r>
+          </w:p>
+        </w:tc>
+        <w:tc>
+          <w:tcPr/>
+          <w:p>
+            <w:pPr>
+              <w:pStyle w:val="Compact"/>
+              <w:jc w:val="left"/>
+            </w:pPr>
+            <w:r>
+              <w:t xml:space="preserve">Uma confirmação somada em 5 reenvios da mesma confirmação</w:t>
+            </w:r>
+          </w:p>
+        </w:tc>
+        <w:tc>
+          <w:tcPr/>
+          <w:p>
+            <w:pPr>
+              <w:pStyle w:val="Compact"/>
+              <w:jc w:val="left"/>
+            </w:pPr>
+            <w:r>
+              <w:t xml:space="preserve">RNF</w:t>
             </w:r>
           </w:p>
         </w:tc>
@@ -5330,119 +5942,19 @@
               <w:jc w:val="left"/>
             </w:pPr>
             <w:r>
-              <w:t xml:space="preserve">RNF-01</w:t>
-            </w:r>
-          </w:p>
-        </w:tc>
-        <w:tc>
-          <w:tcPr/>
-          <w:p>
-            <w:pPr>
-              <w:pStyle w:val="Compact"/>
-              <w:jc w:val="left"/>
-            </w:pPr>
-            <w:r>
-              <w:t xml:space="preserve">Consulta da estação em até 500 ms no p95</w:t>
-            </w:r>
-          </w:p>
-        </w:tc>
-        <w:tc>
-          <w:tcPr/>
-          <w:p>
-            <w:pPr>
-              <w:pStyle w:val="Compact"/>
-              <w:jc w:val="left"/>
-            </w:pPr>
-            <w:r>
-              <w:t xml:space="preserve">RNF</w:t>
-            </w:r>
-          </w:p>
-        </w:tc>
-        <w:tc>
-          <w:tcPr/>
-          <w:p>
-            <w:pPr>
-              <w:pStyle w:val="Compact"/>
-              <w:jc w:val="left"/>
-            </w:pPr>
-            <w:r>
-              <w:t xml:space="preserve">Média</w:t>
-            </w:r>
-          </w:p>
-        </w:tc>
-      </w:tr>
-      <w:tr>
-        <w:tc>
-          <w:tcPr/>
-          <w:p>
-            <w:pPr>
-              <w:pStyle w:val="Compact"/>
-              <w:jc w:val="left"/>
-            </w:pPr>
-            <w:r>
-              <w:t xml:space="preserve">RNF-02</w:t>
-            </w:r>
-          </w:p>
-        </w:tc>
-        <w:tc>
-          <w:tcPr/>
-          <w:p>
-            <w:pPr>
-              <w:pStyle w:val="Compact"/>
-              <w:jc w:val="left"/>
-            </w:pPr>
-            <w:r>
-              <w:t xml:space="preserve">Zero duplicados em 5 reenvios do mesmo pedido</w:t>
-            </w:r>
-          </w:p>
-        </w:tc>
-        <w:tc>
-          <w:tcPr/>
-          <w:p>
-            <w:pPr>
-              <w:pStyle w:val="Compact"/>
-              <w:jc w:val="left"/>
-            </w:pPr>
-            <w:r>
-              <w:t xml:space="preserve">RNF</w:t>
-            </w:r>
-          </w:p>
-        </w:tc>
-        <w:tc>
-          <w:tcPr/>
-          <w:p>
-            <w:pPr>
-              <w:pStyle w:val="Compact"/>
-              <w:jc w:val="left"/>
-            </w:pPr>
-            <w:r>
-              <w:t xml:space="preserve">Média</w:t>
-            </w:r>
-          </w:p>
-        </w:tc>
-      </w:tr>
-      <w:tr>
-        <w:tc>
-          <w:tcPr/>
-          <w:p>
-            <w:pPr>
-              <w:pStyle w:val="Compact"/>
-              <w:jc w:val="left"/>
-            </w:pPr>
-            <w:r>
-              <w:t xml:space="preserve">RNF-04</w:t>
-            </w:r>
-          </w:p>
-        </w:tc>
-        <w:tc>
-          <w:tcPr/>
-          <w:p>
-            <w:pPr>
-              <w:pStyle w:val="Compact"/>
-              <w:jc w:val="left"/>
-            </w:pPr>
-            <w:r>
-              <w:t xml:space="preserve">No máximo 1 confirmação por relato a cada 10 minutos</w:t>
+              <w:t xml:space="preserve">RNF-05</w:t>
+            </w:r>
+          </w:p>
+        </w:tc>
+        <w:tc>
+          <w:tcPr/>
+          <w:p>
+            <w:pPr>
+              <w:pStyle w:val="Compact"/>
+              <w:jc w:val="left"/>
+            </w:pPr>
+            <w:r>
+              <w:t xml:space="preserve">Uma linha por recusa no CloudWatch Logs, visível em até 10 segundos</w:t>
             </w:r>
           </w:p>
         </w:tc>
@@ -5567,7 +6079,7 @@
               <w:jc w:val="left"/>
             </w:pPr>
             <w:r>
-              <w:t xml:space="preserve">4</w:t>
+              <w:t xml:space="preserve">5</w:t>
             </w:r>
           </w:p>
         </w:tc>
@@ -5604,7 +6116,7 @@
         <w:pStyle w:val="BodyText"/>
       </w:pPr>
       <w:r>
-        <w:t xml:space="preserve">Pouco mais da metade ficou em alta. A prioridade dos requisitos funcionais é a mesma da Sprint 1: o que lá era essencial aqui é alta, e o que era importante aqui é média. A US-03 e o RF-04 falam da mesma coisa, confirmar um relato, e por isso estão na mesma prioridade.</w:t>
+        <w:t xml:space="preserve">Pouco mais da metade ficou em alta. A prioridade dos requisitos funcionais é a mesma da Sprint 1: o que lá era essencial aqui é alta, e o que era importante aqui é média. A US-03 e o RF-04 falam da mesma coisa, confirmar um relato, e por isso estão na mesma prioridade; o RNF-04, que é a qualidade do RF-04, está com eles.</w:t>
       </w:r>
     </w:p>
     <w:p>
@@ -5612,7 +6124,7 @@
         <w:pStyle w:val="BodyText"/>
       </w:pPr>
       <w:r>
-        <w:t xml:space="preserve">O RNF-03 é o único não funcional em alta, e é porque ele é o RD-01 com número. Sem ele o sistema funciona, mas guarda o IP de quem relatou um lugar onde se sentiu insegura; e um sistema que faz isso não pode ser posto no ar, por melhor que funcione.</w:t>
+        <w:t xml:space="preserve">O RNF-02 é o único não funcional em alta. Sem ele o sistema funciona, mas com um bucket que qualquer pessoa pode listar e regravar: as fotos de todas as estações saem de uma vez, e a foto de um relato pode ser trocada por uma foto de pessoa. Um sistema assim não pode ser posto no ar, por melhor que funcione.</w:t>
       </w:r>
     </w:p>
     <w:p>
@@ -5620,7 +6132,7 @@
         <w:pStyle w:val="BodyText"/>
       </w:pPr>
       <w:r>
-        <w:t xml:space="preserve">O RNF-01 ficou em média, e não em alta: sem ele a consulta continua respondendo, só mais devagar. Ele não custa código, porque quem o sustenta é a chave de partição da seção 6.2; custa só a medição da Sprint 5. O RNF-02 ficou em média porque o sistema funciona sem ele, mas uma estação com relatos duplicados mostra uma ordem errada.</w:t>
+        <w:t xml:space="preserve">O RNF-01 e o RNF-03 ficaram em média, embora a qualidade que cobram seja de requisitos em alta: sem eles o sistema funciona, só pior. Sem o RNF-01, um reenvio duplica o relato e a estação mostra uma ordem errada; sem o RNF-03, a consulta responde, só mais devagar. O RNF-03 não custa código, porque quem o sustenta é a chave de partição da seção 6.2; custa só a medição da Sprint 5.</w:t>
       </w:r>
     </w:p>
     <w:p>
@@ -5628,7 +6140,7 @@
         <w:pStyle w:val="BodyText"/>
       </w:pPr>
       <w:r>
-        <w:t xml:space="preserve">O RNF-04 ficou em baixa porque protege a ordem da lista contra uma fraude que ainda não aconteceu, e que ele só desacelera. No primeiro dia, com poucas passageiras, ninguém sente a falta dele.</w:t>
+        <w:t xml:space="preserve">O RNF-05 ficou em baixa porque serve a quem opera o sistema, e não a quem usa: a recusa em si, o RF-05, está em alta; o prazo de 10 segundos para ela aparecer no registro, a passageira nunca sente.</w:t>
       </w:r>
     </w:p>
     <w:p>
@@ -5655,8 +6167,8 @@
         <w:tblLook w:firstRow="1" w:lastRow="0" w:firstColumn="0" w:lastColumn="0" w:noHBand="0" w:noVBand="0" w:val="0020"/>
       </w:tblPr>
       <w:tblGrid>
-        <w:gridCol w:w="1808"/>
-        <w:gridCol w:w="6112"/>
+        <w:gridCol w:w="1807"/>
+        <w:gridCol w:w="6113"/>
       </w:tblGrid>
       <w:tr>
         <w:trPr>
@@ -5708,7 +6220,7 @@
               <w:jc w:val="left"/>
             </w:pPr>
             <w:r>
-              <w:t xml:space="preserve">Os doze itens do backlog. Na Sprint 3, o caminho da gravação: RF-01, RF-02, RF-05, o RNF-02 do relato e o RNF-03 na função. Na Sprint 4, o que depende de haver o que listar e de existir a página, nesta ordem: RF-04, US-03, o RNF-02 da confirmação e o RNF-04; depois RF-03, US-02 e RNF-01; e a US-01, que só se completa com a página.</w:t>
+              <w:t xml:space="preserve">Os treze itens do backlog. Na Sprint 3, o caminho da gravação: RF-01, RF-02, RF-05, RNF-01, RNF-02 e RNF-05. Na Sprint 4, o que depende de haver o que listar e de existir a página, nesta ordem: RF-04, US-03 e RNF-04; depois RF-03, US-02 e RNF-03; e a US-01, que só se completa com a página.</w:t>
             </w:r>
           </w:p>
         </w:tc>
@@ -5769,7 +6281,7 @@
               <w:t xml:space="preserve">confirmar</w:t>
             </w:r>
             <w:r>
-              <w:t xml:space="preserve">, que o roteiro não ensina, e a razão está logo abaixo desta tabela. O RNF-01 não custa código, só medição. O RNF-02 e o RNF-04 custam poucas linhas: condições na gravação, que a própria tabela confere.</w:t>
+              <w:t xml:space="preserve">, que o roteiro não ensina, e a razão está logo abaixo desta tabela. O RNF-03 não custa código, só medição. O RNF-01 e o RNF-04 custam poucas linhas: condições na gravação, que a própria tabela confere. O RNF-05 é uma linha de registro por recusa.</w:t>
             </w:r>
           </w:p>
         </w:tc>
@@ -5816,9 +6328,9 @@
         <w:tblLook w:firstRow="1" w:lastRow="0" w:firstColumn="0" w:lastColumn="0" w:noHBand="0" w:noVBand="0" w:val="0020"/>
       </w:tblPr>
       <w:tblGrid>
-        <w:gridCol w:w="2065"/>
-        <w:gridCol w:w="2174"/>
-        <w:gridCol w:w="3681"/>
+        <w:gridCol w:w="2008"/>
+        <w:gridCol w:w="2458"/>
+        <w:gridCol w:w="3454"/>
       </w:tblGrid>
       <w:tr>
         <w:trPr>
@@ -5955,7 +6467,7 @@
               <w:jc w:val="left"/>
             </w:pPr>
             <w:r>
-              <w:t xml:space="preserve">Recorte de implementação: os doze itens</w:t>
+              <w:t xml:space="preserve">Recorte de implementação: os treze itens</w:t>
             </w:r>
           </w:p>
         </w:tc>
@@ -5993,6 +6505,205 @@
               <w:jc w:val="left"/>
             </w:pPr>
             <w:r>
+              <w:t xml:space="preserve">Os RNFs são a qualidade dos cinco RFs da Sprint 1, um para um</w:t>
+            </w:r>
+          </w:p>
+        </w:tc>
+        <w:tc>
+          <w:tcPr/>
+          <w:p>
+            <w:pPr>
+              <w:pStyle w:val="Compact"/>
+              <w:jc w:val="left"/>
+            </w:pPr>
+            <w:r>
+              <w:t xml:space="preserve">Escolher os RNFs pelas categorias de nuvem, como Segurança e Observabilidade, independentemente dos RFs</w:t>
+            </w:r>
+          </w:p>
+        </w:tc>
+        <w:tc>
+          <w:tcPr/>
+          <w:p>
+            <w:pPr>
+              <w:pStyle w:val="Compact"/>
+              <w:jc w:val="left"/>
+            </w:pPr>
+            <w:r>
+              <w:t xml:space="preserve">Com um RNF por RF, nenhum requisito funcional fica sem número que o confira, e cada número tem um dono no código. O anonimato e o limite de confirmações, que não são a qualidade de um RF só, ficaram como decisões nesta tabela.</w:t>
+            </w:r>
+          </w:p>
+        </w:tc>
+      </w:tr>
+      <w:tr>
+        <w:tc>
+          <w:tcPr/>
+          <w:p>
+            <w:pPr>
+              <w:pStyle w:val="Compact"/>
+              <w:jc w:val="left"/>
+            </w:pPr>
+            <w:r>
+              <w:t xml:space="preserve">O registro de cada função leva só campos nomeados, e o registro de acesso do API Gateway fica desligado</w:t>
+            </w:r>
+          </w:p>
+        </w:tc>
+        <w:tc>
+          <w:tcPr/>
+          <w:p>
+            <w:pPr>
+              <w:pStyle w:val="Compact"/>
+              <w:jc w:val="left"/>
+            </w:pPr>
+            <w:r>
+              <w:t xml:space="preserve">Registrar o evento inteiro, com </w:t>
+            </w:r>
+            <w:r>
+              <w:rPr>
+                <w:rStyle w:val="VerbatimChar"/>
+              </w:rPr>
+              <w:t xml:space="preserve">print(event)</w:t>
+            </w:r>
+            <w:r>
+              <w:t xml:space="preserve">, e ligar o registro de acesso do API Gateway</w:t>
+            </w:r>
+          </w:p>
+        </w:tc>
+        <w:tc>
+          <w:tcPr/>
+          <w:p>
+            <w:pPr>
+              <w:pStyle w:val="Compact"/>
+              <w:jc w:val="left"/>
+            </w:pPr>
+            <w:r>
+              <w:t xml:space="preserve">O evento que o API Gateway entrega à função traz o IP e o navegador de quem chamou, e o registro de acesso guarda o IP de cada chamada. As duas coisas gravariam no CloudWatch quem relatou, e o RD-01 seria quebrado sem ninguém perceber.</w:t>
+            </w:r>
+          </w:p>
+        </w:tc>
+      </w:tr>
+      <w:tr>
+        <w:tc>
+          <w:tcPr/>
+          <w:p>
+            <w:pPr>
+              <w:pStyle w:val="Compact"/>
+              <w:jc w:val="left"/>
+            </w:pPr>
+            <w:r>
+              <w:t xml:space="preserve">A página limpa a foto, e a função só confere</w:t>
+            </w:r>
+          </w:p>
+        </w:tc>
+        <w:tc>
+          <w:tcPr/>
+          <w:p>
+            <w:pPr>
+              <w:pStyle w:val="Compact"/>
+              <w:jc w:val="left"/>
+            </w:pPr>
+            <w:r>
+              <w:t xml:space="preserve">A função limpa a foto, com uma biblioteca de imagens</w:t>
+            </w:r>
+          </w:p>
+        </w:tc>
+        <w:tc>
+          <w:tcPr/>
+          <w:p>
+            <w:pPr>
+              <w:pStyle w:val="Compact"/>
+              <w:jc w:val="left"/>
+            </w:pPr>
+            <w:r>
+              <w:t xml:space="preserve">A foto do celular carrega no EXIF a latitude, a longitude e o modelo do aparelho (RD-01). A biblioteca precisaria ser empacotada com a função, o que o percurso das Sprints 3 e 4 não cobre. A página já precisa redesenhar a foto para reduzi-la, e redesenhar tira o EXIF de graça. A função não confia nisso: confere a ausência do EXIF e recusa a foto que o tiver.</w:t>
+            </w:r>
+          </w:p>
+        </w:tc>
+      </w:tr>
+      <w:tr>
+        <w:tc>
+          <w:tcPr/>
+          <w:p>
+            <w:pPr>
+              <w:pStyle w:val="Compact"/>
+              <w:jc w:val="left"/>
+            </w:pPr>
+            <w:r>
+              <w:t xml:space="preserve">Contra confirmações repetidas, um intervalo de 10 minutos por relato</w:t>
+            </w:r>
+          </w:p>
+        </w:tc>
+        <w:tc>
+          <w:tcPr/>
+          <w:p>
+            <w:pPr>
+              <w:pStyle w:val="Compact"/>
+              <w:jc w:val="left"/>
+            </w:pPr>
+            <w:r>
+              <w:t xml:space="preserve">Exigir conta, ou guardar um identificador do aparelho, para que cada pessoa confirme uma vez</w:t>
+            </w:r>
+          </w:p>
+        </w:tc>
+        <w:tc>
+          <w:tcPr/>
+          <w:p>
+            <w:pPr>
+              <w:pStyle w:val="Compact"/>
+              <w:jc w:val="left"/>
+            </w:pPr>
+            <w:r>
+              <w:t xml:space="preserve">As duas identificam quem participa e contrariam o RD-01. O intervalo não impede a fraude: torna-a lenta. Cinquenta confirmações falsas, que caberiam em um segundo, passam a exigir mais de oito horas. Quem quiser inflar um relato ainda consegue, com paciência; esse é o risco que a Sprint 1 declarou e que sobra, escrito aqui. Para que o critério US-03, cenário 1, passe, a última confirmação do relato A tem de ter mais de 10 minutos.</w:t>
+            </w:r>
+          </w:p>
+        </w:tc>
+      </w:tr>
+      <w:tr>
+        <w:tc>
+          <w:tcPr/>
+          <w:p>
+            <w:pPr>
+              <w:pStyle w:val="Compact"/>
+              <w:jc w:val="left"/>
+            </w:pPr>
+            <w:r>
+              <w:t xml:space="preserve">O protocolo é derivado do código de envio, por um hash</w:t>
+            </w:r>
+          </w:p>
+        </w:tc>
+        <w:tc>
+          <w:tcPr/>
+          <w:p>
+            <w:pPr>
+              <w:pStyle w:val="Compact"/>
+              <w:jc w:val="left"/>
+            </w:pPr>
+            <w:r>
+              <w:t xml:space="preserve">O protocolo é o próprio código gerado pela página</w:t>
+            </w:r>
+          </w:p>
+        </w:tc>
+        <w:tc>
+          <w:tcPr/>
+          <w:p>
+            <w:pPr>
+              <w:pStyle w:val="Compact"/>
+              <w:jc w:val="left"/>
+            </w:pPr>
+            <w:r>
+              <w:t xml:space="preserve">O protocolo aparece na consulta. Se ele fosse o código, quem o lesse poderia reenviá-lo num outro dia, com outra foto, e a foto nova seria gravada no endereço da foto do relato original. Com o hash, conhecer o protocolo não permite chegar ao código.</w:t>
+            </w:r>
+          </w:p>
+        </w:tc>
+      </w:tr>
+      <w:tr>
+        <w:tc>
+          <w:tcPr/>
+          <w:p>
+            <w:pPr>
+              <w:pStyle w:val="Compact"/>
+              <w:jc w:val="left"/>
+            </w:pPr>
+            <w:r>
               <w:t xml:space="preserve">A chave de ordenação começa pelo dia do envio</w:t>
             </w:r>
           </w:p>
@@ -6018,120 +6729,6 @@
             </w:pPr>
             <w:r>
               <w:t xml:space="preserve">O filtro é aplicado depois de ler: a consulta leria todos os relatos que a estação já teve, desde o primeiro dia, e o tempo cresceria para sempre. O preço desta decisão é um defeito conhecido: um reenvio que atravesse a meia-noite em UTC, 21h em Brasília, cai em outro dia, ganha outra chave e duplica o relato. A janela é de segundos, e fica declarada aqui.</w:t>
-            </w:r>
-          </w:p>
-        </w:tc>
-      </w:tr>
-      <w:tr>
-        <w:tc>
-          <w:tcPr/>
-          <w:p>
-            <w:pPr>
-              <w:pStyle w:val="Compact"/>
-              <w:jc w:val="left"/>
-            </w:pPr>
-            <w:r>
-              <w:t xml:space="preserve">O protocolo é derivado do código de envio, por um hash</w:t>
-            </w:r>
-          </w:p>
-        </w:tc>
-        <w:tc>
-          <w:tcPr/>
-          <w:p>
-            <w:pPr>
-              <w:pStyle w:val="Compact"/>
-              <w:jc w:val="left"/>
-            </w:pPr>
-            <w:r>
-              <w:t xml:space="preserve">O protocolo é o próprio código gerado pela página</w:t>
-            </w:r>
-          </w:p>
-        </w:tc>
-        <w:tc>
-          <w:tcPr/>
-          <w:p>
-            <w:pPr>
-              <w:pStyle w:val="Compact"/>
-              <w:jc w:val="left"/>
-            </w:pPr>
-            <w:r>
-              <w:t xml:space="preserve">O protocolo aparece na consulta. Se ele fosse o código, quem o lesse poderia reenviá-lo num outro dia, com outra foto, e a foto nova seria gravada no endereço da foto do relato original. Com o hash, conhecer o protocolo não permite chegar ao código.</w:t>
-            </w:r>
-          </w:p>
-        </w:tc>
-      </w:tr>
-      <w:tr>
-        <w:tc>
-          <w:tcPr/>
-          <w:p>
-            <w:pPr>
-              <w:pStyle w:val="Compact"/>
-              <w:jc w:val="left"/>
-            </w:pPr>
-            <w:r>
-              <w:t xml:space="preserve">Contra confirmações repetidas, um intervalo de 10 minutos por relato</w:t>
-            </w:r>
-          </w:p>
-        </w:tc>
-        <w:tc>
-          <w:tcPr/>
-          <w:p>
-            <w:pPr>
-              <w:pStyle w:val="Compact"/>
-              <w:jc w:val="left"/>
-            </w:pPr>
-            <w:r>
-              <w:t xml:space="preserve">Exigir conta, ou guardar um identificador do aparelho, para que cada pessoa confirme uma vez</w:t>
-            </w:r>
-          </w:p>
-        </w:tc>
-        <w:tc>
-          <w:tcPr/>
-          <w:p>
-            <w:pPr>
-              <w:pStyle w:val="Compact"/>
-              <w:jc w:val="left"/>
-            </w:pPr>
-            <w:r>
-              <w:t xml:space="preserve">As duas identificam quem participa e contrariam o RD-01. O intervalo não impede a fraude: torna-a lenta. Quem quiser inflar um relato ainda consegue, com paciência; esse é o risco que sobra, e ele está escrito.</w:t>
-            </w:r>
-          </w:p>
-        </w:tc>
-      </w:tr>
-      <w:tr>
-        <w:tc>
-          <w:tcPr/>
-          <w:p>
-            <w:pPr>
-              <w:pStyle w:val="Compact"/>
-              <w:jc w:val="left"/>
-            </w:pPr>
-            <w:r>
-              <w:t xml:space="preserve">A página limpa a foto, e a função só confere</w:t>
-            </w:r>
-          </w:p>
-        </w:tc>
-        <w:tc>
-          <w:tcPr/>
-          <w:p>
-            <w:pPr>
-              <w:pStyle w:val="Compact"/>
-              <w:jc w:val="left"/>
-            </w:pPr>
-            <w:r>
-              <w:t xml:space="preserve">A função limpa a foto, com uma biblioteca de imagens</w:t>
-            </w:r>
-          </w:p>
-        </w:tc>
-        <w:tc>
-          <w:tcPr/>
-          <w:p>
-            <w:pPr>
-              <w:pStyle w:val="Compact"/>
-              <w:jc w:val="left"/>
-            </w:pPr>
-            <w:r>
-              <w:t xml:space="preserve">A biblioteca precisaria ser empacotada com a função, o que o percurso das Sprints 3 e 4 não cobre. A página já precisa redesenhar a foto para reduzi-la, e redesenhar tira o EXIF de graça. A função não confia nisso: confere a ausência do EXIF e recusa a foto que o tiver.</w:t>
             </w:r>
           </w:p>
         </w:tc>
@@ -6184,7 +6781,7 @@
               <w:t xml:space="preserve">consultar</w:t>
             </w:r>
             <w:r>
-              <w:t xml:space="preserve"> tenha permissão no S3, e o RF-03 a limita a ler a tabela. A foto já é conteúdo público por definição (RF-02), e não carrega dado de ninguém (RNF-03). O que não é público é listar o bucket, gravar ou apagar.</w:t>
+              <w:t xml:space="preserve"> tenha permissão no S3, e o RF-03 a limita a ler a tabela. A foto já é conteúdo público por definição (RF-02). O que não é público é listar o bucket, gravar ou apagar (RNF-02).</w:t>
             </w:r>
           </w:p>
         </w:tc>
@@ -6408,7 +7005,15 @@
         <w:pStyle w:val="FirstParagraph"/>
       </w:pPr>
       <w:r>
-        <w:t xml:space="preserve">Pendente: registrado aqui depois do retorno da equipe revisora.</w:t>
+        <w:t xml:space="preserve">Ajuste após a orientação da professora (15/10/2026): os requisitos não funcionais passaram de quatro para cinco, um para cada requisito funcional da Sprint 1. O anonimato no registro e nas fotos e o limite de uma confirmação a cada 10 minutos, que eram requisitos não funcionais, passaram a decisões da seção 9, e o pilar 1 passou a ter requisito (RNF-05). Versão do documento: 1.1.</w:t>
+      </w:r>
+    </w:p>
+    <w:p>
+      <w:pPr>
+        <w:pStyle w:val="BodyText"/>
+      </w:pPr>
+      <w:r>
+        <w:t xml:space="preserve">Ajustes da revisão cruzada: pendente, registrados aqui depois do retorno da equipe revisora.</w:t>
       </w:r>
     </w:p>
     <w:sectPr>

</xml_diff>

<commit_message>
docs: imagem do diagrama, no documento e no Word
Co-Authored-By: Claude Opus 5.5 <noreply@anthropic.com>
</commit_message>
<xml_diff>
--- a/docs/02-arquitetura.docx
+++ b/docs/02-arquitetura.docx
@@ -2800,7 +2800,7 @@
         <w:pStyle w:val="FirstParagraph"/>
       </w:pPr>
       <w:r>
-        <w:t xml:space="preserve">O diagrama foi feito no Lucidchart e está em </w:t>
+        <w:t xml:space="preserve">O diagrama está abaixo e no arquivo </w:t>
       </w:r>
       <w:r>
         <w:rPr>
@@ -2809,7 +2809,7 @@
         <w:t xml:space="preserve">docs/diagrama.png</w:t>
       </w:r>
       <w:r>
-        <w:t xml:space="preserve">. A mesma versão, em Mermaid, está em </w:t>
+        <w:t xml:space="preserve">. O código que o desenha, em Mermaid, está em </w:t>
       </w:r>
       <w:r>
         <w:rPr>
@@ -2818,7 +2818,57 @@
         <w:t xml:space="preserve">docs/diagrama.md</w:t>
       </w:r>
       <w:r>
-        <w:t xml:space="preserve">, que o GitHub desenha ao abrir.</w:t>
+        <w:t xml:space="preserve">, com a explicação de como ler as setas.</w:t>
+      </w:r>
+    </w:p>
+    <w:p>
+      <w:pPr>
+        <w:pStyle w:val="CaptionedFigure"/>
+      </w:pPr>
+      <w:r>
+        <w:drawing>
+          <wp:inline distT="0" distB="0" distL="0" distR="0">
+            <wp:extent cx="5486400" cy="3103734"/>
+            <wp:effectExtent l="0" t="0" r="0" b="0"/>
+            <wp:docPr id="1" name="Figura 1" descr="Diagrama de arquitetura de ponta a ponta do CPTM SOS · Relatos por estação"/>
+            <wp:cNvGraphicFramePr>
+              <a:graphicFrameLocks noChangeAspect="1"/>
+            </wp:cNvGraphicFramePr>
+            <a:graphic>
+              <a:graphicData uri="http://schemas.openxmlformats.org/drawingml/2006/picture">
+                <pic:pic>
+                  <pic:nvPicPr>
+                    <pic:cNvPr id="0" name="diagrama.png"/>
+                    <pic:cNvPicPr/>
+                  </pic:nvPicPr>
+                  <pic:blipFill>
+                    <a:blip r:embed="rIdImg1"/>
+                    <a:stretch>
+                      <a:fillRect/>
+                    </a:stretch>
+                  </pic:blipFill>
+                  <pic:spPr bwMode="auto">
+                    <a:xfrm>
+                      <a:off x="0" y="0"/>
+                      <a:ext cx="5486400" cy="3103734"/>
+                    </a:xfrm>
+                    <a:prstGeom prst="rect">
+                      <a:avLst/>
+                    </a:prstGeom>
+                  </pic:spPr>
+                </pic:pic>
+              </a:graphicData>
+            </a:graphic>
+          </wp:inline>
+        </w:drawing>
+      </w:r>
+    </w:p>
+    <w:p>
+      <w:pPr>
+        <w:pStyle w:val="ImageCaption"/>
+      </w:pPr>
+      <w:r>
+        <w:t xml:space="preserve">Diagrama de arquitetura de ponta a ponta do CPTM SOS · Relatos por estação</w:t>
       </w:r>
     </w:p>
     <w:p>

</xml_diff>

<commit_message>
docs: arquitetura responde às promessas da Sprint 1
O documento passa a dizer que os RNFs partiram dos RFs por orientação da
professora, e não do FURPS, como a Sprint 1 previa; que o risco de
confirmações repetidas voltou como decisão; e que o critério US-01,
cenário 1, precisa de foto sem EXIF.

Co-Authored-By: Claude Opus 5.5 <noreply@anthropic.com>
</commit_message>
<xml_diff>
--- a/docs/02-arquitetura.docx
+++ b/docs/02-arquitetura.docx
@@ -1875,7 +1875,7 @@
         <w:pStyle w:val="BodyText"/>
       </w:pPr>
       <w:r>
-        <w:t xml:space="preserve">As preocupações do FURPS da Sprint 1 também foram para algum lugar:</w:t>
+        <w:t xml:space="preserve">A Sprint 1 dizia que as cinco linhas do FURPS virariam os requisitos não funcionais desta sprint. Por orientação da professora, os requisitos não funcionais partiram dos cinco requisitos funcionais, e não do FURPS; mas nenhuma das cinco preocupações ficou para trás:</w:t>
       </w:r>
     </w:p>
     <w:tbl>
@@ -2054,7 +2054,7 @@
         <w:pStyle w:val="BodyText"/>
       </w:pPr>
       <w:r>
-        <w:t xml:space="preserve">Duas proteções que o desenho tem não são requisitos não funcionais, porque não são a qualidade de um dos cinco requisitos funcionais: são decisões, e estão na seção 9. A primeira é o anonimato no registro e nas fotos: o RD-01 já é a regra, e o desenho a garante nos pontos em que ela quebraria sem ninguém perceber, o IP que chega à função e o EXIF que vem na foto. A segunda é o limite de uma confirmação a cada 10 minutos por relato, que é a resposta ao risco de confirmações repetidas que a seção 8 da Sprint 1 deixou declarado.</w:t>
+        <w:t xml:space="preserve">Duas proteções que o desenho tem não são requisitos não funcionais, porque não são a qualidade de um dos cinco requisitos funcionais: são decisões, e estão na seção 9. A primeira é o anonimato no registro e nas fotos: o RD-01 já é a regra, e o desenho a garante nos pontos em que ela quebraria sem ninguém perceber, o IP que chega à função e o EXIF que vem na foto. A segunda é o limite de uma confirmação a cada 10 minutos por relato, que é a resposta ao risco de confirmações repetidas que a seção 8 da Sprint 1 deixou declarado. A Sprint 1 dizia que esse risco voltaria como requisito não funcional; com os requisitos não funcionais presos aos requisitos funcionais, ele voltou como decisão, e o limite continua no desenho.</w:t>
       </w:r>
     </w:p>
     <w:p>
@@ -6378,9 +6378,9 @@
         <w:tblLook w:firstRow="1" w:lastRow="0" w:firstColumn="0" w:lastColumn="0" w:noHBand="0" w:noVBand="0" w:val="0020"/>
       </w:tblPr>
       <w:tblGrid>
-        <w:gridCol w:w="2008"/>
-        <w:gridCol w:w="2458"/>
-        <w:gridCol w:w="3454"/>
+        <w:gridCol w:w="1992"/>
+        <w:gridCol w:w="2437"/>
+        <w:gridCol w:w="3491"/>
       </w:tblGrid>
       <w:tr>
         <w:trPr>
@@ -6664,7 +6664,7 @@
               <w:jc w:val="left"/>
             </w:pPr>
             <w:r>
-              <w:t xml:space="preserve">A foto do celular carrega no EXIF a latitude, a longitude e o modelo do aparelho (RD-01). A biblioteca precisaria ser empacotada com a função, o que o percurso das Sprints 3 e 4 não cobre. A página já precisa redesenhar a foto para reduzi-la, e redesenhar tira o EXIF de graça. A função não confia nisso: confere a ausência do EXIF e recusa a foto que o tiver.</w:t>
+              <w:t xml:space="preserve">A foto do celular carrega no EXIF a latitude, a longitude e o modelo do aparelho (RD-01). A biblioteca precisaria ser empacotada com a função, o que o percurso das Sprints 3 e 4 não cobre. A página já precisa redesenhar a foto para reduzi-la, e redesenhar tira o EXIF de graça. A função não confia nisso: confere a ausência do EXIF e recusa a foto que o tiver. Por isso, no critério US-01, cenário 1, a foto JPEG de 2 MB tem de chegar sem EXIF: pela página ela chega; mandada direto à API como saiu da câmera, seria recusada.</w:t>
             </w:r>
           </w:p>
         </w:tc>

</xml_diff>

<commit_message>
docs: Word da arquitetura na versão 1.2
O commit anterior levou o Word da versão 1.1; este é o gerado a partir
do docs/02-arquitetura.md atual.

Co-Authored-By: Claude Opus 5.5 <noreply@anthropic.com>
</commit_message>
<xml_diff>
--- a/docs/02-arquitetura.docx
+++ b/docs/02-arquitetura.docx
@@ -84,13 +84,13 @@
         <w:br/>
       </w:r>
       <w:r>
-        <w:t xml:space="preserve">Data: 15/10/2026</w:t>
-      </w:r>
-      <w:r>
-        <w:br/>
-      </w:r>
-      <w:r>
-        <w:t xml:space="preserve">Versão: 1.1</w:t>
+        <w:t xml:space="preserve">Data: 22/10/2026</w:t>
+      </w:r>
+      <w:r>
+        <w:br/>
+      </w:r>
+      <w:r>
+        <w:t xml:space="preserve">Versão: 1.2</w:t>
       </w:r>
     </w:p>
     <w:p>
@@ -123,7 +123,7 @@
         <w:pStyle w:val="BodyText"/>
       </w:pPr>
       <w:r>
-        <w:t xml:space="preserve">Os cinco requisitos não funcionais saem dos cinco requisitos funcionais da Sprint 1, um para um: o RNF-01 diz com que qualidade o RF-01 tem de acontecer, o RNF-02 faz o mesmo com o RF-02, e assim por diante. O requisito funcional diz o que o sistema faz; o não funcional diz com que número isso se confere e em que serviço da AWS esse número se apoia.</w:t>
+        <w:t xml:space="preserve">Os cinco requisitos não funcionais saem dos cinco requisitos funcionais da Sprint 1, um para um: o RNF-01 diz com que qualidade o RF-01 tem de acontecer, e assim por diante.</w:t>
       </w:r>
     </w:p>
     <w:tbl>
@@ -503,79 +503,342 @@
         <w:rPr>
           <w:rStyle w:val="VerbatimChar"/>
         </w:rPr>
-        <w:t xml:space="preserve">  O RF-01 promete um protocolo único por relato. No túnel</w:t>
-      </w:r>
-      <w:r>
-        <w:br/>
-      </w:r>
-      <w:r>
-        <w:rPr>
-          <w:rStyle w:val="VerbatimChar"/>
-        </w:rPr>
-        <w:t xml:space="preserve">  o sinal cai, e o envio pode ter sido gravado com a</w:t>
-      </w:r>
-      <w:r>
-        <w:br/>
-      </w:r>
-      <w:r>
-        <w:rPr>
-          <w:rStyle w:val="VerbatimChar"/>
-        </w:rPr>
-        <w:t xml:space="preserve">  resposta perdida no caminho. Tentar de novo é o certo a</w:t>
-      </w:r>
-      <w:r>
-        <w:br/>
-      </w:r>
-      <w:r>
-        <w:rPr>
-          <w:rStyle w:val="VerbatimChar"/>
-        </w:rPr>
-        <w:t xml:space="preserve">  fazer, e só é seguro se o sistema reconhecer o pedido</w:t>
-      </w:r>
-      <w:r>
-        <w:br/>
-      </w:r>
-      <w:r>
-        <w:rPr>
-          <w:rStyle w:val="VerbatimChar"/>
-        </w:rPr>
-        <w:t xml:space="preserve">  repetido. A página gera um código aleatório para cada</w:t>
-      </w:r>
-      <w:r>
-        <w:br/>
-      </w:r>
-      <w:r>
-        <w:rPr>
-          <w:rStyle w:val="VerbatimChar"/>
-        </w:rPr>
-        <w:t xml:space="preserve">  envio e repete o mesmo código a cada nova tentativa; a</w:t>
-      </w:r>
-      <w:r>
-        <w:br/>
-      </w:r>
-      <w:r>
-        <w:rPr>
-          <w:rStyle w:val="VerbatimChar"/>
-        </w:rPr>
-        <w:t xml:space="preserve">  função deriva dele o protocolo. Se o protocolo já</w:t>
-      </w:r>
-      <w:r>
-        <w:br/>
-      </w:r>
-      <w:r>
-        <w:rPr>
-          <w:rStyle w:val="VerbatimChar"/>
-        </w:rPr>
-        <w:t xml:space="preserve">  existe na tabela, é um reenvio: a função devolve o</w:t>
-      </w:r>
-      <w:r>
-        <w:br/>
-      </w:r>
-      <w:r>
-        <w:rPr>
-          <w:rStyle w:val="VerbatimChar"/>
-        </w:rPr>
-        <w:t xml:space="preserve">  mesmo protocolo sem tocar na foto nem na tabela.</w:t>
+        <w:t xml:space="preserve">  No túnel o sinal cai e a passageira reenvia. A página</w:t>
+      </w:r>
+      <w:r>
+        <w:br/>
+      </w:r>
+      <w:r>
+        <w:rPr>
+          <w:rStyle w:val="VerbatimChar"/>
+        </w:rPr>
+        <w:t xml:space="preserve">  repete o mesmo código a cada tentativa, e a gravação</w:t>
+      </w:r>
+      <w:r>
+        <w:br/>
+      </w:r>
+      <w:r>
+        <w:rPr>
+          <w:rStyle w:val="VerbatimChar"/>
+        </w:rPr>
+        <w:t xml:space="preserve">  condicional recusa um segundo relato com o mesmo</w:t>
+      </w:r>
+      <w:r>
+        <w:br/>
+      </w:r>
+      <w:r>
+        <w:rPr>
+          <w:rStyle w:val="VerbatimChar"/>
+        </w:rPr>
+        <w:t xml:space="preserve">  protocolo.</w:t>
+      </w:r>
+    </w:p>
+    <w:p>
+      <w:pPr>
+        <w:pStyle w:val="Heading3"/>
+      </w:pPr>
+      <w:r>
+        <w:t xml:space="preserve">RNF-02</w:t>
+      </w:r>
+    </w:p>
+    <w:p>
+      <w:pPr>
+        <w:pStyle w:val="SourceCode"/>
+      </w:pPr>
+      <w:r>
+        <w:rPr>
+          <w:rStyle w:val="VerbatimChar"/>
+        </w:rPr>
+        <w:t xml:space="preserve">requisito</w:t>
+      </w:r>
+      <w:r>
+        <w:br/>
+      </w:r>
+      <w:r>
+        <w:rPr>
+          <w:rStyle w:val="VerbatimChar"/>
+        </w:rPr>
+        <w:t xml:space="preserve">  [Segurança] O bucket de fotos deve permitir ao público</w:t>
+      </w:r>
+      <w:r>
+        <w:br/>
+      </w:r>
+      <w:r>
+        <w:rPr>
+          <w:rStyle w:val="VerbatimChar"/>
+        </w:rPr>
+        <w:t xml:space="preserve">  uma única ação, ler uma foto pelo endereço exato, e</w:t>
+      </w:r>
+      <w:r>
+        <w:br/>
+      </w:r>
+      <w:r>
+        <w:rPr>
+          <w:rStyle w:val="VerbatimChar"/>
+        </w:rPr>
+        <w:t xml:space="preserve">  zero ações de listar, gravar ou apagar, o que se</w:t>
+      </w:r>
+      <w:r>
+        <w:br/>
+      </w:r>
+      <w:r>
+        <w:rPr>
+          <w:rStyle w:val="VerbatimChar"/>
+        </w:rPr>
+        <w:t xml:space="preserve">  confere na política do bucket.</w:t>
+      </w:r>
+      <w:r>
+        <w:br/>
+      </w:r>
+      <w:r>
+        <w:rPr>
+          <w:rStyle w:val="VerbatimChar"/>
+        </w:rPr>
+        <w:t xml:space="preserve"/>
+      </w:r>
+      <w:r>
+        <w:br/>
+      </w:r>
+      <w:r>
+        <w:rPr>
+          <w:rStyle w:val="VerbatimChar"/>
+        </w:rPr>
+        <w:t xml:space="preserve">serviço AWS</w:t>
+      </w:r>
+      <w:r>
+        <w:br/>
+      </w:r>
+      <w:r>
+        <w:rPr>
+          <w:rStyle w:val="VerbatimChar"/>
+        </w:rPr>
+        <w:t xml:space="preserve">  Amazon S3, com a política do bucket</w:t>
+      </w:r>
+      <w:r>
+        <w:br/>
+      </w:r>
+      <w:r>
+        <w:rPr>
+          <w:rStyle w:val="VerbatimChar"/>
+        </w:rPr>
+        <w:t xml:space="preserve"/>
+      </w:r>
+      <w:r>
+        <w:br/>
+      </w:r>
+      <w:r>
+        <w:rPr>
+          <w:rStyle w:val="VerbatimChar"/>
+        </w:rPr>
+        <w:t xml:space="preserve">pilar do Well-Architected</w:t>
+      </w:r>
+      <w:r>
+        <w:br/>
+      </w:r>
+      <w:r>
+        <w:rPr>
+          <w:rStyle w:val="VerbatimChar"/>
+        </w:rPr>
+        <w:t xml:space="preserve">  2, Segurança</w:t>
+      </w:r>
+      <w:r>
+        <w:br/>
+      </w:r>
+      <w:r>
+        <w:rPr>
+          <w:rStyle w:val="VerbatimChar"/>
+        </w:rPr>
+        <w:t xml:space="preserve"/>
+      </w:r>
+      <w:r>
+        <w:br/>
+      </w:r>
+      <w:r>
+        <w:rPr>
+          <w:rStyle w:val="VerbatimChar"/>
+        </w:rPr>
+        <w:t xml:space="preserve">razão</w:t>
+      </w:r>
+      <w:r>
+        <w:br/>
+      </w:r>
+      <w:r>
+        <w:rPr>
+          <w:rStyle w:val="VerbatimChar"/>
+        </w:rPr>
+        <w:t xml:space="preserve">  O RF-02 torna o bucket público para leitura, e isso</w:t>
+      </w:r>
+      <w:r>
+        <w:br/>
+      </w:r>
+      <w:r>
+        <w:rPr>
+          <w:rStyle w:val="VerbatimChar"/>
+        </w:rPr>
+        <w:t xml:space="preserve">  não pode virar público para listar, trocar ou apagar</w:t>
+      </w:r>
+      <w:r>
+        <w:br/>
+      </w:r>
+      <w:r>
+        <w:rPr>
+          <w:rStyle w:val="VerbatimChar"/>
+        </w:rPr>
+        <w:t xml:space="preserve">  fotos. Só a função registrar grava nele.</w:t>
+      </w:r>
+    </w:p>
+    <w:p>
+      <w:pPr>
+        <w:pStyle w:val="Heading3"/>
+      </w:pPr>
+      <w:r>
+        <w:t xml:space="preserve">RNF-03</w:t>
+      </w:r>
+    </w:p>
+    <w:p>
+      <w:pPr>
+        <w:pStyle w:val="SourceCode"/>
+      </w:pPr>
+      <w:r>
+        <w:rPr>
+          <w:rStyle w:val="VerbatimChar"/>
+        </w:rPr>
+        <w:t xml:space="preserve">requisito</w:t>
+      </w:r>
+      <w:r>
+        <w:br/>
+      </w:r>
+      <w:r>
+        <w:rPr>
+          <w:rStyle w:val="VerbatimChar"/>
+        </w:rPr>
+        <w:t xml:space="preserve">  [Performance] A consulta dos relatos de uma estação deve</w:t>
+      </w:r>
+      <w:r>
+        <w:br/>
+      </w:r>
+      <w:r>
+        <w:rPr>
+          <w:rStyle w:val="VerbatimChar"/>
+        </w:rPr>
+        <w:t xml:space="preserve">  responder em no máximo 500 ms no percentil 95, com até</w:t>
+      </w:r>
+      <w:r>
+        <w:br/>
+      </w:r>
+      <w:r>
+        <w:rPr>
+          <w:rStyle w:val="VerbatimChar"/>
+        </w:rPr>
+        <w:t xml:space="preserve">  300 relatos dos últimos 30 dias na estação consultada e</w:t>
+      </w:r>
+      <w:r>
+        <w:br/>
+      </w:r>
+      <w:r>
+        <w:rPr>
+          <w:rStyle w:val="VerbatimChar"/>
+        </w:rPr>
+        <w:t xml:space="preserve">  30 requisições seguidas.</w:t>
+      </w:r>
+      <w:r>
+        <w:br/>
+      </w:r>
+      <w:r>
+        <w:rPr>
+          <w:rStyle w:val="VerbatimChar"/>
+        </w:rPr>
+        <w:t xml:space="preserve"/>
+      </w:r>
+      <w:r>
+        <w:br/>
+      </w:r>
+      <w:r>
+        <w:rPr>
+          <w:rStyle w:val="VerbatimChar"/>
+        </w:rPr>
+        <w:t xml:space="preserve">serviço AWS</w:t>
+      </w:r>
+      <w:r>
+        <w:br/>
+      </w:r>
+      <w:r>
+        <w:rPr>
+          <w:rStyle w:val="VerbatimChar"/>
+        </w:rPr>
+        <w:t xml:space="preserve">  Amazon DynamoDB</w:t>
+      </w:r>
+      <w:r>
+        <w:br/>
+      </w:r>
+      <w:r>
+        <w:rPr>
+          <w:rStyle w:val="VerbatimChar"/>
+        </w:rPr>
+        <w:t xml:space="preserve"/>
+      </w:r>
+      <w:r>
+        <w:br/>
+      </w:r>
+      <w:r>
+        <w:rPr>
+          <w:rStyle w:val="VerbatimChar"/>
+        </w:rPr>
+        <w:t xml:space="preserve">pilar do Well-Architected</w:t>
+      </w:r>
+      <w:r>
+        <w:br/>
+      </w:r>
+      <w:r>
+        <w:rPr>
+          <w:rStyle w:val="VerbatimChar"/>
+        </w:rPr>
+        <w:t xml:space="preserve">  4, Eficiência de Performance</w:t>
+      </w:r>
+      <w:r>
+        <w:br/>
+      </w:r>
+      <w:r>
+        <w:rPr>
+          <w:rStyle w:val="VerbatimChar"/>
+        </w:rPr>
+        <w:t xml:space="preserve"/>
+      </w:r>
+      <w:r>
+        <w:br/>
+      </w:r>
+      <w:r>
+        <w:rPr>
+          <w:rStyle w:val="VerbatimChar"/>
+        </w:rPr>
+        <w:t xml:space="preserve">razão</w:t>
+      </w:r>
+      <w:r>
+        <w:br/>
+      </w:r>
+      <w:r>
+        <w:rPr>
+          <w:rStyle w:val="VerbatimChar"/>
+        </w:rPr>
+        <w:t xml:space="preserve">  A chave por estação e pelo dia faz a consulta ler só</w:t>
+      </w:r>
+      <w:r>
+        <w:br/>
+      </w:r>
+      <w:r>
+        <w:rPr>
+          <w:rStyle w:val="VerbatimChar"/>
+        </w:rPr>
+        <w:t xml:space="preserve">  os últimos 30 dias de uma estação, e não a tabela</w:t>
+      </w:r>
+      <w:r>
+        <w:br/>
+      </w:r>
+      <w:r>
+        <w:rPr>
+          <w:rStyle w:val="VerbatimChar"/>
+        </w:rPr>
+        <w:t xml:space="preserve">  inteira.</w:t>
       </w:r>
     </w:p>
     <w:p>
@@ -583,7 +846,7 @@
         <w:pStyle w:val="BodyText"/>
       </w:pPr>
       <w:r>
-        <w:t xml:space="preserve">O protocolo é um resumo do código, os 16 primeiros caracteres do seu SHA-256, e não o próprio código. O protocolo aparece na consulta, porque é por ele que se confirma um relato; o código, não. Se o protocolo fosse o código, quem o lesse na consulta poderia reenviá-lo com outra foto e trocar a foto de um relato alheio (seção 9). E o código identifica o envio, e não quem enviou: é novo a cada relato, e a página o descarta quando recebe a resposta. Por isso ele não fere o RD-01.</w:t>
+        <w:t xml:space="preserve">Os números: 500 ms porque a consulta é feita com o trem chegando; 300 relatos são dez por dia, na mesma estação, durante 30 dias.</w:t>
       </w:r>
     </w:p>
     <w:p>
@@ -591,7 +854,7 @@
         <w:pStyle w:val="Heading3"/>
       </w:pPr>
       <w:r>
-        <w:t xml:space="preserve">RNF-02</w:t>
+        <w:t xml:space="preserve">RNF-04</w:t>
       </w:r>
     </w:p>
     <w:p>
@@ -611,34 +874,25 @@
         <w:rPr>
           <w:rStyle w:val="VerbatimChar"/>
         </w:rPr>
-        <w:t xml:space="preserve">  [Segurança] O bucket de fotos deve permitir ao público</w:t>
-      </w:r>
-      <w:r>
-        <w:br/>
-      </w:r>
-      <w:r>
-        <w:rPr>
-          <w:rStyle w:val="VerbatimChar"/>
-        </w:rPr>
-        <w:t xml:space="preserve">  uma única ação, ler uma foto pelo endereço exato, e</w:t>
-      </w:r>
-      <w:r>
-        <w:br/>
-      </w:r>
-      <w:r>
-        <w:rPr>
-          <w:rStyle w:val="VerbatimChar"/>
-        </w:rPr>
-        <w:t xml:space="preserve">  zero ações de listar, gravar ou apagar, o que se</w:t>
-      </w:r>
-      <w:r>
-        <w:br/>
-      </w:r>
-      <w:r>
-        <w:rPr>
-          <w:rStyle w:val="VerbatimChar"/>
-        </w:rPr>
-        <w:t xml:space="preserve">  confere na política do bucket.</w:t>
+        <w:t xml:space="preserve">  [Reliability] O reenvio de uma mesma confirmação deve</w:t>
+      </w:r>
+      <w:r>
+        <w:br/>
+      </w:r>
+      <w:r>
+        <w:rPr>
+          <w:rStyle w:val="VerbatimChar"/>
+        </w:rPr>
+        <w:t xml:space="preserve">  somar exatamente 1: com 5 reenvios seguidos da mesma</w:t>
+      </w:r>
+      <w:r>
+        <w:br/>
+      </w:r>
+      <w:r>
+        <w:rPr>
+          <w:rStyle w:val="VerbatimChar"/>
+        </w:rPr>
+        <w:t xml:space="preserve">  confirmação, o relato ganha 1 confirmação, e não 5.</w:t>
       </w:r>
       <w:r>
         <w:br/>
@@ -665,7 +919,7 @@
         <w:rPr>
           <w:rStyle w:val="VerbatimChar"/>
         </w:rPr>
-        <w:t xml:space="preserve">  Amazon S3, com a política do bucket</w:t>
+        <w:t xml:space="preserve">  Amazon DynamoDB, com atualização condicional</w:t>
       </w:r>
       <w:r>
         <w:br/>
@@ -692,7 +946,7 @@
         <w:rPr>
           <w:rStyle w:val="VerbatimChar"/>
         </w:rPr>
-        <w:t xml:space="preserve">  2, Segurança</w:t>
+        <w:t xml:space="preserve">  3, Confiabilidade</w:t>
       </w:r>
       <w:r>
         <w:br/>
@@ -719,87 +973,25 @@
         <w:rPr>
           <w:rStyle w:val="VerbatimChar"/>
         </w:rPr>
-        <w:t xml:space="preserve">  O RF-02 exige um endereço pelo qual a foto possa ser</w:t>
-      </w:r>
-      <w:r>
-        <w:br/>
-      </w:r>
-      <w:r>
-        <w:rPr>
-          <w:rStyle w:val="VerbatimChar"/>
-        </w:rPr>
-        <w:t xml:space="preserve">  vista, e isso torna o bucket público para leitura.</w:t>
-      </w:r>
-      <w:r>
-        <w:br/>
-      </w:r>
-      <w:r>
-        <w:rPr>
-          <w:rStyle w:val="VerbatimChar"/>
-        </w:rPr>
-        <w:t xml:space="preserve">  Público para ler não pode virar público para o resto.</w:t>
-      </w:r>
-      <w:r>
-        <w:br/>
-      </w:r>
-      <w:r>
-        <w:rPr>
-          <w:rStyle w:val="VerbatimChar"/>
-        </w:rPr>
-        <w:t xml:space="preserve">  Listar entregaria de uma vez as fotos de todas as</w:t>
-      </w:r>
-      <w:r>
-        <w:br/>
-      </w:r>
-      <w:r>
-        <w:rPr>
-          <w:rStyle w:val="VerbatimChar"/>
-        </w:rPr>
-        <w:t xml:space="preserve">  estações, sem passar pela consulta nem pela janela de</w:t>
-      </w:r>
-      <w:r>
-        <w:br/>
-      </w:r>
-      <w:r>
-        <w:rPr>
-          <w:rStyle w:val="VerbatimChar"/>
-        </w:rPr>
-        <w:t xml:space="preserve">  30 dias; gravar permitiria trocar a foto de um relato</w:t>
-      </w:r>
-      <w:r>
-        <w:br/>
-      </w:r>
-      <w:r>
-        <w:rPr>
-          <w:rStyle w:val="VerbatimChar"/>
-        </w:rPr>
-        <w:t xml:space="preserve">  por outra, inclusive por uma foto de pessoa, que o</w:t>
-      </w:r>
-      <w:r>
-        <w:br/>
-      </w:r>
-      <w:r>
-        <w:rPr>
-          <w:rStyle w:val="VerbatimChar"/>
-        </w:rPr>
-        <w:t xml:space="preserve">  RD-02 proíbe; apagar faria a foto sumir. Só a função</w:t>
-      </w:r>
-      <w:r>
-        <w:br/>
-      </w:r>
-      <w:r>
-        <w:rPr>
-          <w:rStyle w:val="VerbatimChar"/>
-        </w:rPr>
-        <w:t xml:space="preserve">  registrar grava no bucket, pelo papel dela no IAM.</w:t>
-      </w:r>
-    </w:p>
-    <w:p>
-      <w:pPr>
-        <w:pStyle w:val="BodyText"/>
-      </w:pPr>
-      <w:r>
-        <w:t xml:space="preserve">O endereço de cada foto leva o protocolo, que não se adivinha: quem não recebeu o endereço de uma foto pela consulta não tem como chegar a ela.</w:t>
+        <w:t xml:space="preserve">  A passageira toca em confirmar, o sinal cai e ela toca</w:t>
+      </w:r>
+      <w:r>
+        <w:br/>
+      </w:r>
+      <w:r>
+        <w:rPr>
+          <w:rStyle w:val="VerbatimChar"/>
+        </w:rPr>
+        <w:t xml:space="preserve">  de novo. A tabela guarda o código da última</w:t>
+      </w:r>
+      <w:r>
+        <w:br/>
+      </w:r>
+      <w:r>
+        <w:rPr>
+          <w:rStyle w:val="VerbatimChar"/>
+        </w:rPr>
+        <w:t xml:space="preserve">  confirmação e só soma se o código for outro.</w:t>
       </w:r>
     </w:p>
     <w:p>
@@ -807,7 +999,7 @@
         <w:pStyle w:val="Heading3"/>
       </w:pPr>
       <w:r>
-        <w:t xml:space="preserve">RNF-03</w:t>
+        <w:t xml:space="preserve">RNF-05</w:t>
       </w:r>
     </w:p>
     <w:p>
@@ -827,34 +1019,34 @@
         <w:rPr>
           <w:rStyle w:val="VerbatimChar"/>
         </w:rPr>
-        <w:t xml:space="preserve">  [Performance] A consulta dos relatos de uma estação deve</w:t>
-      </w:r>
-      <w:r>
-        <w:br/>
-      </w:r>
-      <w:r>
-        <w:rPr>
-          <w:rStyle w:val="VerbatimChar"/>
-        </w:rPr>
-        <w:t xml:space="preserve">  responder em no máximo 500 ms no percentil 95, com até</w:t>
-      </w:r>
-      <w:r>
-        <w:br/>
-      </w:r>
-      <w:r>
-        <w:rPr>
-          <w:rStyle w:val="VerbatimChar"/>
-        </w:rPr>
-        <w:t xml:space="preserve">  300 relatos dos últimos 30 dias na estação consultada e</w:t>
-      </w:r>
-      <w:r>
-        <w:br/>
-      </w:r>
-      <w:r>
-        <w:rPr>
-          <w:rStyle w:val="VerbatimChar"/>
-        </w:rPr>
-        <w:t xml:space="preserve">  30 requisições seguidas.</w:t>
+        <w:t xml:space="preserve">  [Observabilidade] Toda recusa de relato deve deixar</w:t>
+      </w:r>
+      <w:r>
+        <w:br/>
+      </w:r>
+      <w:r>
+        <w:rPr>
+          <w:rStyle w:val="VerbatimChar"/>
+        </w:rPr>
+        <w:t xml:space="preserve">  exatamente 1 linha no CloudWatch Logs, com o campo</w:t>
+      </w:r>
+      <w:r>
+        <w:br/>
+      </w:r>
+      <w:r>
+        <w:rPr>
+          <w:rStyle w:val="VerbatimChar"/>
+        </w:rPr>
+        <w:t xml:space="preserve">  recusado, visível em no máximo 10 segundos após a</w:t>
+      </w:r>
+      <w:r>
+        <w:br/>
+      </w:r>
+      <w:r>
+        <w:rPr>
+          <w:rStyle w:val="VerbatimChar"/>
+        </w:rPr>
+        <w:t xml:space="preserve">  chamada, conferido com 10 envios inválidos.</w:t>
       </w:r>
       <w:r>
         <w:br/>
@@ -881,7 +1073,7 @@
         <w:rPr>
           <w:rStyle w:val="VerbatimChar"/>
         </w:rPr>
-        <w:t xml:space="preserve">  Amazon DynamoDB</w:t>
+        <w:t xml:space="preserve">  Amazon CloudWatch Logs</w:t>
       </w:r>
       <w:r>
         <w:br/>
@@ -908,7 +1100,7 @@
         <w:rPr>
           <w:rStyle w:val="VerbatimChar"/>
         </w:rPr>
-        <w:t xml:space="preserve">  4, Eficiência de Performance</w:t>
+        <w:t xml:space="preserve">  1, Excelência Operacional</w:t>
       </w:r>
       <w:r>
         <w:br/>
@@ -935,493 +1127,25 @@
         <w:rPr>
           <w:rStyle w:val="VerbatimChar"/>
         </w:rPr>
-        <w:t xml:space="preserve">  A chave de partição é a estação, e a chave de ordenação</w:t>
-      </w:r>
-      <w:r>
-        <w:br/>
-      </w:r>
-      <w:r>
-        <w:rPr>
-          <w:rStyle w:val="VerbatimChar"/>
-        </w:rPr>
-        <w:t xml:space="preserve">  começa pelo dia do envio. A consulta vai direto à</w:t>
-      </w:r>
-      <w:r>
-        <w:br/>
-      </w:r>
-      <w:r>
-        <w:rPr>
-          <w:rStyle w:val="VerbatimChar"/>
-        </w:rPr>
-        <w:t xml:space="preserve">  partição da estação e lê só a fatia dos últimos 30 dias:</w:t>
-      </w:r>
-      <w:r>
-        <w:br/>
-      </w:r>
-      <w:r>
-        <w:rPr>
-          <w:rStyle w:val="VerbatimChar"/>
-        </w:rPr>
-        <w:t xml:space="preserve">  o relato de dois anos atrás nem chega a ser lido. O</w:t>
-      </w:r>
-      <w:r>
-        <w:br/>
-      </w:r>
-      <w:r>
-        <w:rPr>
-          <w:rStyle w:val="VerbatimChar"/>
-        </w:rPr>
-        <w:t xml:space="preserve">  tempo cresce com a janela de uma estação, e não com a</w:t>
-      </w:r>
-      <w:r>
-        <w:br/>
-      </w:r>
-      <w:r>
-        <w:rPr>
-          <w:rStyle w:val="VerbatimChar"/>
-        </w:rPr>
-        <w:t xml:space="preserve">  tabela inteira. E a resposta leva o endereço da foto, e</w:t>
-      </w:r>
-      <w:r>
-        <w:br/>
-      </w:r>
-      <w:r>
-        <w:rPr>
-          <w:rStyle w:val="VerbatimChar"/>
-        </w:rPr>
-        <w:t xml:space="preserve">  não a foto: a lista chega inteira antes de a primeira</w:t>
-      </w:r>
-      <w:r>
-        <w:br/>
-      </w:r>
-      <w:r>
-        <w:rPr>
-          <w:rStyle w:val="VerbatimChar"/>
-        </w:rPr>
-        <w:t xml:space="preserve">  imagem começar a baixar.</w:t>
-      </w:r>
-    </w:p>
-    <w:p>
-      <w:pPr>
-        <w:pStyle w:val="BodyText"/>
-      </w:pPr>
-      <w:r>
-        <w:t xml:space="preserve">De onde vêm os números. A consulta é feita na plataforma, com o sinal fraco, e a parte da espera que vem da rede da estação não é nossa; a parte que é nossa tem de ser pequena para que a soma das duas caiba no tempo de o trem parar. Os 300 relatos equivalem a dez por dia, todo dia, na mesma estação: muito mais do que qualquer estação terá no começo, e o número precisa continuar valendo quando o uso crescer.</w:t>
-      </w:r>
-    </w:p>
-    <w:p>
-      <w:pPr>
-        <w:pStyle w:val="Heading3"/>
-      </w:pPr>
-      <w:r>
-        <w:t xml:space="preserve">RNF-04</w:t>
-      </w:r>
-    </w:p>
-    <w:p>
-      <w:pPr>
-        <w:pStyle w:val="SourceCode"/>
-      </w:pPr>
-      <w:r>
-        <w:rPr>
-          <w:rStyle w:val="VerbatimChar"/>
-        </w:rPr>
-        <w:t xml:space="preserve">requisito</w:t>
-      </w:r>
-      <w:r>
-        <w:br/>
-      </w:r>
-      <w:r>
-        <w:rPr>
-          <w:rStyle w:val="VerbatimChar"/>
-        </w:rPr>
-        <w:t xml:space="preserve">  [Reliability] O reenvio de uma mesma confirmação deve</w:t>
-      </w:r>
-      <w:r>
-        <w:br/>
-      </w:r>
-      <w:r>
-        <w:rPr>
-          <w:rStyle w:val="VerbatimChar"/>
-        </w:rPr>
-        <w:t xml:space="preserve">  somar exatamente 1: com 5 reenvios seguidos da mesma</w:t>
-      </w:r>
-      <w:r>
-        <w:br/>
-      </w:r>
-      <w:r>
-        <w:rPr>
-          <w:rStyle w:val="VerbatimChar"/>
-        </w:rPr>
-        <w:t xml:space="preserve">  confirmação, o relato ganha 1 confirmação, e não 5.</w:t>
-      </w:r>
-      <w:r>
-        <w:br/>
-      </w:r>
-      <w:r>
-        <w:rPr>
-          <w:rStyle w:val="VerbatimChar"/>
-        </w:rPr>
-        <w:t xml:space="preserve"/>
-      </w:r>
-      <w:r>
-        <w:br/>
-      </w:r>
-      <w:r>
-        <w:rPr>
-          <w:rStyle w:val="VerbatimChar"/>
-        </w:rPr>
-        <w:t xml:space="preserve">serviço AWS</w:t>
-      </w:r>
-      <w:r>
-        <w:br/>
-      </w:r>
-      <w:r>
-        <w:rPr>
-          <w:rStyle w:val="VerbatimChar"/>
-        </w:rPr>
-        <w:t xml:space="preserve">  Amazon DynamoDB, com atualização condicional</w:t>
-      </w:r>
-      <w:r>
-        <w:br/>
-      </w:r>
-      <w:r>
-        <w:rPr>
-          <w:rStyle w:val="VerbatimChar"/>
-        </w:rPr>
-        <w:t xml:space="preserve"/>
-      </w:r>
-      <w:r>
-        <w:br/>
-      </w:r>
-      <w:r>
-        <w:rPr>
-          <w:rStyle w:val="VerbatimChar"/>
-        </w:rPr>
-        <w:t xml:space="preserve">pilar do Well-Architected</w:t>
-      </w:r>
-      <w:r>
-        <w:br/>
-      </w:r>
-      <w:r>
-        <w:rPr>
-          <w:rStyle w:val="VerbatimChar"/>
-        </w:rPr>
-        <w:t xml:space="preserve">  3, Confiabilidade</w:t>
-      </w:r>
-      <w:r>
-        <w:br/>
-      </w:r>
-      <w:r>
-        <w:rPr>
-          <w:rStyle w:val="VerbatimChar"/>
-        </w:rPr>
-        <w:t xml:space="preserve"/>
-      </w:r>
-      <w:r>
-        <w:br/>
-      </w:r>
-      <w:r>
-        <w:rPr>
-          <w:rStyle w:val="VerbatimChar"/>
-        </w:rPr>
-        <w:t xml:space="preserve">razão</w:t>
-      </w:r>
-      <w:r>
-        <w:br/>
-      </w:r>
-      <w:r>
-        <w:rPr>
-          <w:rStyle w:val="VerbatimChar"/>
-        </w:rPr>
-        <w:t xml:space="preserve">  O RF-04 soma uma confirmação quando a passageira indica</w:t>
-      </w:r>
-      <w:r>
-        <w:br/>
-      </w:r>
-      <w:r>
-        <w:rPr>
-          <w:rStyle w:val="VerbatimChar"/>
-        </w:rPr>
-        <w:t xml:space="preserve">  que o problema continua. Ela toca em "confirmar" na</w:t>
-      </w:r>
-      <w:r>
-        <w:br/>
-      </w:r>
-      <w:r>
-        <w:rPr>
-          <w:rStyle w:val="VerbatimChar"/>
-        </w:rPr>
-        <w:t xml:space="preserve">  plataforma, o sinal cai, e ela toca de novo. Sem este</w:t>
-      </w:r>
-      <w:r>
-        <w:br/>
-      </w:r>
-      <w:r>
-        <w:rPr>
-          <w:rStyle w:val="VerbatimChar"/>
-        </w:rPr>
-        <w:t xml:space="preserve">  requisito, uma confirmação viraria duas, e a ordem da</w:t>
-      </w:r>
-      <w:r>
-        <w:br/>
-      </w:r>
-      <w:r>
-        <w:rPr>
-          <w:rStyle w:val="VerbatimChar"/>
-        </w:rPr>
-        <w:t xml:space="preserve">  consulta mentiria. A página manda um código para cada</w:t>
-      </w:r>
-      <w:r>
-        <w:br/>
-      </w:r>
-      <w:r>
-        <w:rPr>
-          <w:rStyle w:val="VerbatimChar"/>
-        </w:rPr>
-        <w:t xml:space="preserve">  confirmação; a tabela guarda o código da última</w:t>
-      </w:r>
-      <w:r>
-        <w:br/>
-      </w:r>
-      <w:r>
-        <w:rPr>
-          <w:rStyle w:val="VerbatimChar"/>
-        </w:rPr>
-        <w:t xml:space="preserve">  confirmação somada e só soma se o código for outro, na</w:t>
-      </w:r>
-      <w:r>
-        <w:br/>
-      </w:r>
-      <w:r>
-        <w:rPr>
-          <w:rStyle w:val="VerbatimChar"/>
-        </w:rPr>
-        <w:t xml:space="preserve">  mesma atualização que soma, sem ler o relato antes.</w:t>
-      </w:r>
-    </w:p>
-    <w:p>
-      <w:pPr>
-        <w:pStyle w:val="Heading3"/>
-      </w:pPr>
-      <w:r>
-        <w:t xml:space="preserve">RNF-05</w:t>
-      </w:r>
-    </w:p>
-    <w:p>
-      <w:pPr>
-        <w:pStyle w:val="SourceCode"/>
-      </w:pPr>
-      <w:r>
-        <w:rPr>
-          <w:rStyle w:val="VerbatimChar"/>
-        </w:rPr>
-        <w:t xml:space="preserve">requisito</w:t>
-      </w:r>
-      <w:r>
-        <w:br/>
-      </w:r>
-      <w:r>
-        <w:rPr>
-          <w:rStyle w:val="VerbatimChar"/>
-        </w:rPr>
-        <w:t xml:space="preserve">  [Observabilidade] Toda recusa de relato deve deixar</w:t>
-      </w:r>
-      <w:r>
-        <w:br/>
-      </w:r>
-      <w:r>
-        <w:rPr>
-          <w:rStyle w:val="VerbatimChar"/>
-        </w:rPr>
-        <w:t xml:space="preserve">  exatamente 1 linha no CloudWatch Logs, com o campo</w:t>
-      </w:r>
-      <w:r>
-        <w:br/>
-      </w:r>
-      <w:r>
-        <w:rPr>
-          <w:rStyle w:val="VerbatimChar"/>
-        </w:rPr>
-        <w:t xml:space="preserve">  recusado, visível em no máximo 10 segundos após a</w:t>
-      </w:r>
-      <w:r>
-        <w:br/>
-      </w:r>
-      <w:r>
-        <w:rPr>
-          <w:rStyle w:val="VerbatimChar"/>
-        </w:rPr>
-        <w:t xml:space="preserve">  chamada, conferido com 10 envios inválidos.</w:t>
-      </w:r>
-      <w:r>
-        <w:br/>
-      </w:r>
-      <w:r>
-        <w:rPr>
-          <w:rStyle w:val="VerbatimChar"/>
-        </w:rPr>
-        <w:t xml:space="preserve"/>
-      </w:r>
-      <w:r>
-        <w:br/>
-      </w:r>
-      <w:r>
-        <w:rPr>
-          <w:rStyle w:val="VerbatimChar"/>
-        </w:rPr>
-        <w:t xml:space="preserve">serviço AWS</w:t>
-      </w:r>
-      <w:r>
-        <w:br/>
-      </w:r>
-      <w:r>
-        <w:rPr>
-          <w:rStyle w:val="VerbatimChar"/>
-        </w:rPr>
-        <w:t xml:space="preserve">  Amazon CloudWatch Logs</w:t>
-      </w:r>
-      <w:r>
-        <w:br/>
-      </w:r>
-      <w:r>
-        <w:rPr>
-          <w:rStyle w:val="VerbatimChar"/>
-        </w:rPr>
-        <w:t xml:space="preserve"/>
-      </w:r>
-      <w:r>
-        <w:br/>
-      </w:r>
-      <w:r>
-        <w:rPr>
-          <w:rStyle w:val="VerbatimChar"/>
-        </w:rPr>
-        <w:t xml:space="preserve">pilar do Well-Architected</w:t>
-      </w:r>
-      <w:r>
-        <w:br/>
-      </w:r>
-      <w:r>
-        <w:rPr>
-          <w:rStyle w:val="VerbatimChar"/>
-        </w:rPr>
-        <w:t xml:space="preserve">  1, Excelência Operacional</w:t>
-      </w:r>
-      <w:r>
-        <w:br/>
-      </w:r>
-      <w:r>
-        <w:rPr>
-          <w:rStyle w:val="VerbatimChar"/>
-        </w:rPr>
-        <w:t xml:space="preserve"/>
-      </w:r>
-      <w:r>
-        <w:br/>
-      </w:r>
-      <w:r>
-        <w:rPr>
-          <w:rStyle w:val="VerbatimChar"/>
-        </w:rPr>
-        <w:t xml:space="preserve">razão</w:t>
-      </w:r>
-      <w:r>
-        <w:br/>
-      </w:r>
-      <w:r>
-        <w:rPr>
-          <w:rStyle w:val="VerbatimChar"/>
-        </w:rPr>
-        <w:t xml:space="preserve">  O RF-05 manda registrar a recusa, sem dizer quando nem</w:t>
-      </w:r>
-      <w:r>
-        <w:br/>
-      </w:r>
-      <w:r>
-        <w:rPr>
-          <w:rStyle w:val="VerbatimChar"/>
-        </w:rPr>
-        <w:t xml:space="preserve">  como. Sem número, "registrar" pode ser uma linha que</w:t>
-      </w:r>
-      <w:r>
-        <w:br/>
-      </w:r>
-      <w:r>
-        <w:rPr>
-          <w:rStyle w:val="VerbatimChar"/>
-        </w:rPr>
-        <w:t xml:space="preserve">  aparece minutos depois, duas linhas para a mesma recusa,</w:t>
-      </w:r>
-      <w:r>
-        <w:br/>
-      </w:r>
-      <w:r>
-        <w:rPr>
-          <w:rStyle w:val="VerbatimChar"/>
-        </w:rPr>
-        <w:t xml:space="preserve">  ou nenhuma. É pelo registro que se descobre se a lista</w:t>
-      </w:r>
-      <w:r>
-        <w:br/>
-      </w:r>
-      <w:r>
-        <w:rPr>
-          <w:rStyle w:val="VerbatimChar"/>
-        </w:rPr>
-        <w:t xml:space="preserve">  de estações está recusando um jeito de escrever que as</w:t>
-      </w:r>
-      <w:r>
-        <w:br/>
-      </w:r>
-      <w:r>
-        <w:rPr>
-          <w:rStyle w:val="VerbatimChar"/>
-        </w:rPr>
-        <w:t xml:space="preserve">  passageiras usam: quarenta recusas do campo estação num</w:t>
-      </w:r>
-      <w:r>
-        <w:br/>
-      </w:r>
-      <w:r>
-        <w:rPr>
-          <w:rStyle w:val="VerbatimChar"/>
-        </w:rPr>
-        <w:t xml:space="preserve">  mesmo dia dizem que a lista precisa mudar, e não que</w:t>
-      </w:r>
-      <w:r>
-        <w:br/>
-      </w:r>
-      <w:r>
-        <w:rPr>
-          <w:rStyle w:val="VerbatimChar"/>
-        </w:rPr>
-        <w:t xml:space="preserve">  quarenta passageiras erraram. O registro serve para</w:t>
-      </w:r>
-      <w:r>
-        <w:br/>
-      </w:r>
-      <w:r>
-        <w:rPr>
-          <w:rStyle w:val="VerbatimChar"/>
-        </w:rPr>
-        <w:t xml:space="preserve">  operar e ajustar o sistema, e não para recuperá-lo; por</w:t>
-      </w:r>
-      <w:r>
-        <w:br/>
-      </w:r>
-      <w:r>
-        <w:rPr>
-          <w:rStyle w:val="VerbatimChar"/>
-        </w:rPr>
-        <w:t xml:space="preserve">  isso o pilar 1, e não o 3.</w:t>
-      </w:r>
-    </w:p>
-    <w:p>
-      <w:pPr>
-        <w:pStyle w:val="BodyText"/>
-      </w:pPr>
-      <w:r>
-        <w:t xml:space="preserve">A linha leva o nome do campo recusado, e não o valor: o valor é texto escrito por quem enviou, e o registro não guarda nada de quem enviou, como o próprio RF-05 exige.</w:t>
+        <w:t xml:space="preserve">  É pelo registro que se descobre, por exemplo, que a</w:t>
+      </w:r>
+      <w:r>
+        <w:br/>
+      </w:r>
+      <w:r>
+        <w:rPr>
+          <w:rStyle w:val="VerbatimChar"/>
+        </w:rPr>
+        <w:t xml:space="preserve">  lista de estações recusa um nome que as passageiras</w:t>
+      </w:r>
+      <w:r>
+        <w:br/>
+      </w:r>
+      <w:r>
+        <w:rPr>
+          <w:rStyle w:val="VerbatimChar"/>
+        </w:rPr>
+        <w:t xml:space="preserve">  usam. Ele serve para operar e ajustar o sistema.</w:t>
       </w:r>
     </w:p>
     <w:p>
@@ -1851,7 +1575,7 @@
         <w:pStyle w:val="FirstParagraph"/>
       </w:pPr>
       <w:r>
-        <w:t xml:space="preserve">Ficaram de fora dois pilares: o 5 e o 6.</w:t>
+        <w:t xml:space="preserve">Ficaram de fora os pilares 5 e 6. O 5, Otimização de Custos, porque em ambiente emulado não existe fatura, e qualquer número de custo seria inventado; mesmo assim, o desenho só usa serviços cobrados por uso, o Lambda e o DynamoDB sob demanda. O 6, Sustentabilidade, pela mesma razão: sem medir o consumo de máquina, o número seria inventado.</w:t>
       </w:r>
     </w:p>
     <w:p>
@@ -1859,23 +1583,7 @@
         <w:pStyle w:val="BodyText"/>
       </w:pPr>
       <w:r>
-        <w:t xml:space="preserve">O pilar 5, Otimização de Custos, não virou requisito porque em ambiente emulado não existe fatura, e qualquer número de custo seria inventado. Mesmo sem ele, o desenho escolhe serviços cobrados por uso: parado, o Lambda não custa nada, e o DynamoDB em modo sob demanda cobra só o que é lido, gravado e guardado. E a página reduz a foto antes de enviar, o que diminui o que se transfere e o que se guarda.</w:t>
-      </w:r>
-    </w:p>
-    <w:p>
-      <w:pPr>
-        <w:pStyle w:val="BodyText"/>
-      </w:pPr>
-      <w:r>
-        <w:t xml:space="preserve">O pilar 6, Sustentabilidade, fica de fora pela mesma razão: sem medir o consumo de máquina, o número seria inventado. O passo de sustentabilidade que este desenho deixa para depois é não guardar o que ninguém usa: relatos com mais de 30 dias não aparecem em nenhuma consulta, mas continuam na tabela, porque a confirmação precisa dizer que o relato expirou (US-03, cenário 2). Apagá-los depois de um prazo maior caberia ao TTL do próprio DynamoDB, sem dar a nenhuma função permissão de excluir, e fica para quando houver volume que justifique.</w:t>
-      </w:r>
-    </w:p>
-    <w:p>
-      <w:pPr>
-        <w:pStyle w:val="BodyText"/>
-      </w:pPr>
-      <w:r>
-        <w:t xml:space="preserve">A Sprint 1 dizia que as cinco linhas do FURPS virariam os requisitos não funcionais desta sprint. Por orientação da professora, os requisitos não funcionais partiram dos cinco requisitos funcionais, e não do FURPS; mas nenhuma das cinco preocupações ficou para trás:</w:t>
+        <w:t xml:space="preserve">A Sprint 1 dizia que as cinco linhas do FURPS virariam os requisitos não funcionais desta sprint. Por orientação da professora, eles partiram dos cinco requisitos funcionais; nenhuma preocupação do FURPS ficou para trás:</w:t>
       </w:r>
     </w:p>
     <w:tbl>
@@ -2054,7 +1762,7 @@
         <w:pStyle w:val="BodyText"/>
       </w:pPr>
       <w:r>
-        <w:t xml:space="preserve">Duas proteções que o desenho tem não são requisitos não funcionais, porque não são a qualidade de um dos cinco requisitos funcionais: são decisões, e estão na seção 9. A primeira é o anonimato no registro e nas fotos: o RD-01 já é a regra, e o desenho a garante nos pontos em que ela quebraria sem ninguém perceber, o IP que chega à função e o EXIF que vem na foto. A segunda é o limite de uma confirmação a cada 10 minutos por relato, que é a resposta ao risco de confirmações repetidas que a seção 8 da Sprint 1 deixou declarado. A Sprint 1 dizia que esse risco voltaria como requisito não funcional; com os requisitos não funcionais presos aos requisitos funcionais, ele voltou como decisão, e o limite continua no desenho.</w:t>
+        <w:t xml:space="preserve">O anonimato no registro e nas fotos e o limite de confirmações não são a qualidade de um requisito funcional só, e por isso viraram decisões (seção 9). A Sprint 1 dizia que o risco de confirmações repetidas voltaria como requisito não funcional; ele voltou como decisão.</w:t>
       </w:r>
     </w:p>
     <w:p>
@@ -3546,7 +3254,7 @@
         <w:pStyle w:val="FirstParagraph"/>
       </w:pPr>
       <w:r>
-        <w:t xml:space="preserve">A passageira escolhe a estação na lista, o tipo de problema e a faixa de horário, escreve a descrição, tira ou escolhe a foto e toca em "Enviar relato". Antes de enviar, a página faz duas coisas: redesenha a foto, o que tira dela os metadados EXIF e a reduz para no máximo 1600 pixels no lado maior (RD-01, seção 9), e gera um código aleatório para aquele envio, que ela repete se precisar tentar de novo (RNF-01). Envia tudo em um único POST para a rota </w:t>
+        <w:t xml:space="preserve">A passageira escolhe a estação, o tipo de problema e a faixa de horário, escreve a descrição, tira a foto e toca em "Enviar relato". A página redesenha a foto, o que tira dela o EXIF e a reduz para no máximo 1600 pixels (RD-01); gera um código aleatório para aquele envio, que repete se precisar tentar de novo (RNF-01); e envia tudo em um único POST para a rota </w:t>
       </w:r>
       <w:r>
         <w:rPr>
@@ -3555,7 +3263,7 @@
         <w:t xml:space="preserve">/relatos</w:t>
       </w:r>
       <w:r>
-        <w:t xml:space="preserve"> do API Gateway, com a foto em base64.</w:t>
+        <w:t xml:space="preserve">, com a foto em base64.</w:t>
       </w:r>
     </w:p>
     <w:p>
@@ -3572,7 +3280,7 @@
         <w:t xml:space="preserve">registrar</w:t>
       </w:r>
       <w:r>
-        <w:t xml:space="preserve">. Ela confere, nesta ordem, a estação na lista aceita, o tipo de problema, a faixa de horário, a foto (presente, com até 2 MB e sem EXIF) e a descrição, se houver, com até 500 caracteres. No primeiro campo recusado, devolve 400 dizendo qual foi, e imprime uma linha com a operação e o nome do campo recusado, sem o valor e sem nada de quem enviou (RF-05 e RNF-05).</w:t>
+        <w:t xml:space="preserve">. Ela confere a estação na lista aceita, o tipo, a faixa e a foto, presente e com até 2 MB. No primeiro campo recusado, devolve 400 dizendo qual foi e imprime uma linha com o nome do campo, sem o valor e sem nada de quem enviou (RF-05 e RNF-05).</w:t>
       </w:r>
     </w:p>
     <w:p>
@@ -3580,7 +3288,7 @@
         <w:pStyle w:val="BodyText"/>
       </w:pPr>
       <w:r>
-        <w:t xml:space="preserve">Com tudo válido, a função deriva o protocolo do código de envio e confere se ele já existe na tabela. Se existir, é um reenvio: a função não toca na foto nem na tabela e devolve o mesmo protocolo (RNF-01). Se não existir, a foto vai primeiro: ela é gravada no S3, em </w:t>
+        <w:t xml:space="preserve">Com tudo válido, a função deriva o protocolo do código e confere se ele já existe na tabela. Se existir, é um reenvio, e ela devolve o mesmo protocolo sem gravar nada (RNF-01). Se não, grava primeiro a foto no S3, em </w:t>
       </w:r>
       <w:r>
         <w:rPr>
@@ -3589,7 +3297,7 @@
         <w:t xml:space="preserve">fotos/&lt;estacao_id&gt;/&lt;protocolo&gt;.jpg</w:t>
       </w:r>
       <w:r>
-        <w:t xml:space="preserve">. Só depois o relato é gravado na tabela, com 0 confirmações, numa gravação condicional que só acontece se o protocolo ainda não existir, o que cobre dois reenvios que cheguem ao mesmo tempo. A ordem é a preocupação de Reliability do FURPS da Sprint 1: não pode existir relato listado apontando para uma foto que nunca subiu. O pior caso no sentido contrário é uma foto sem relato, que nenhuma consulta mostra; e, se a passageira reenviar, a mesma foto é regravada no mesmo endereço.</w:t>
+        <w:t xml:space="preserve">, e depois o relato na tabela, com 0 confirmações, numa gravação condicional. A ordem é a preocupação de Reliability do FURPS da Sprint 1: não pode existir relato apontando para uma foto que nunca subiu. A função devolve 201 com o protocolo e o endereço da foto.</w:t>
       </w:r>
     </w:p>
     <w:p>
@@ -3597,7 +3305,7 @@
         <w:pStyle w:val="BodyText"/>
       </w:pPr>
       <w:r>
-        <w:t xml:space="preserve">Com o relato gravado, a função imprime a linha de registro e devolve 201 com o protocolo e o endereço da foto. A página mostra o protocolo e recarrega a consulta da estação: um GET em </w:t>
+        <w:t xml:space="preserve">A página recarrega a consulta: um GET em </w:t>
       </w:r>
       <w:r>
         <w:rPr>
@@ -3606,7 +3314,7 @@
         <w:t xml:space="preserve">/relatos?estacao=BRS</w:t>
       </w:r>
       <w:r>
-        <w:t xml:space="preserve">, que chega à função </w:t>
+        <w:t xml:space="preserve"> chega à função </w:t>
       </w:r>
       <w:r>
         <w:rPr>
@@ -3615,7 +3323,7 @@
         <w:t xml:space="preserve">consultar</w:t>
       </w:r>
       <w:r>
-        <w:t xml:space="preserve">. Ela faz um </w:t>
+        <w:t xml:space="preserve">, que faz um </w:t>
       </w:r>
       <w:r>
         <w:rPr>
@@ -3624,7 +3332,7 @@
         <w:t xml:space="preserve">query</w:t>
       </w:r>
       <w:r>
-        <w:t xml:space="preserve"> na partição da estação, só com as chaves de ordenação a partir do dia de 30 dias atrás; descarta o que passou de 30 dias na hora exata; ordena por confirmações e, no empate, do mais recente para o mais antigo; e devolve a lista com o endereço de cada foto. Se a lista vier vazia, a página mostra "Nenhum relato nos últimos 30 dias. Isso não quer dizer que a estação seja segura."</w:t>
+        <w:t xml:space="preserve"> na partição da estação a partir do dia de 30 dias atrás, descarta o que passou de 30 dias na hora exata, ordena por confirmações e, no empate, do mais recente para o mais antigo, e devolve a lista. Se ela vier vazia, a página mostra "Nenhum relato nos últimos 30 dias. Isso não quer dizer que a estação seja segura."</w:t>
       </w:r>
     </w:p>
     <w:p>
@@ -3632,7 +3340,7 @@
         <w:pStyle w:val="BodyText"/>
       </w:pPr>
       <w:r>
-        <w:t xml:space="preserve">A confirmação faz o mesmo caminho até a função </w:t>
+        <w:t xml:space="preserve">A confirmação chega à função </w:t>
       </w:r>
       <w:r>
         <w:rPr>
@@ -3641,7 +3349,15 @@
         <w:t xml:space="preserve">confirmar</w:t>
       </w:r>
       <w:r>
-        <w:t xml:space="preserve">, que soma 1 ao relato numa única atualização condicional: a soma só acontece se o relato tiver até 30 dias (RF-04), se o código daquela confirmação não for o da última somada (RNF-04) e se a última confirmação tiver mais de 10 minutos (seção 9). Se a condição falhar, a função lê o relato para dizer o porquê: expirou, foi confirmado há pouco, ou aquela mesma confirmação já tinha sido somada, e então é um reenvio e a resposta é de sucesso.</w:t>
+        <w:t xml:space="preserve">, que soma 1 ao relato numa atualização condicional, só se ele tiver até 30 dias (RF-04); se tiver mais, a resposta diz que o relato expirou.</w:t>
+      </w:r>
+    </w:p>
+    <w:p>
+      <w:pPr>
+        <w:pStyle w:val="BodyText"/>
+      </w:pPr>
+      <w:r>
+        <w:t xml:space="preserve">Ficam especificados e fora do recorte das Sprints 3 e 4 (seção 8): a conferência do código da confirmação (RNF-04), o limite de uma confirmação a cada 10 minutos e a conferência do EXIF na função.</w:t>
       </w:r>
     </w:p>
     <w:p>
@@ -4005,10 +3721,10 @@
         <w:tblLook w:firstRow="1" w:lastRow="0" w:firstColumn="0" w:lastColumn="0" w:noHBand="0" w:noVBand="0" w:val="0020"/>
       </w:tblPr>
       <w:tblGrid>
-        <w:gridCol w:w="1045"/>
-        <w:gridCol w:w="2677"/>
-        <w:gridCol w:w="2758"/>
-        <w:gridCol w:w="1440"/>
+        <w:gridCol w:w="1038"/>
+        <w:gridCol w:w="2666"/>
+        <w:gridCol w:w="2707"/>
+        <w:gridCol w:w="1509"/>
       </w:tblGrid>
       <w:tr>
         <w:trPr>
@@ -4600,7 +4316,7 @@
               <w:jc w:val="left"/>
             </w:pPr>
             <w:r>
-              <w:t xml:space="preserve">não: só depois da primeira confirmação (limite de 10 minutos, seção 9)</w:t>
+              <w:t xml:space="preserve">não: gravado a cada confirmação</w:t>
             </w:r>
           </w:p>
         </w:tc>
@@ -4653,7 +4369,7 @@
               <w:jc w:val="left"/>
             </w:pPr>
             <w:r>
-              <w:t xml:space="preserve">não: só depois da primeira confirmação (RNF-04)</w:t>
+              <w:t xml:space="preserve">não: só com o RNF-04, especificado e fora do recorte (seção 8)</w:t>
             </w:r>
           </w:p>
         </w:tc>
@@ -5033,6 +4749,41 @@
       </w:r>
       <w:r>
         <w:t xml:space="preserve">. Ele entra no fim da chave de ordenação, o que dá à chave a unicidade de que ela precisa.</w:t>
+      </w:r>
+    </w:p>
+    <w:p>
+      <w:pPr>
+        <w:pStyle w:val="BodyText"/>
+      </w:pPr>
+      <w:r>
+        <w:t xml:space="preserve">A chave foi conferida no LocalStack em 22/10/2026, com o script </w:t>
+      </w:r>
+      <w:r>
+        <w:rPr>
+          <w:rStyle w:val="VerbatimChar"/>
+        </w:rPr>
+        <w:t xml:space="preserve">testes/sprint2-dynamodb.sh</w:t>
+      </w:r>
+      <w:r>
+        <w:t xml:space="preserve">, que usa os critérios de aceite da Sprint 1 como dados: 13 conferências, 13 aprovadas. A tabela foi criada com </w:t>
+      </w:r>
+      <w:r>
+        <w:rPr>
+          <w:rStyle w:val="VerbatimChar"/>
+        </w:rPr>
+        <w:t xml:space="preserve">estacao_id</w:t>
+      </w:r>
+      <w:r>
+        <w:t xml:space="preserve"> e </w:t>
+      </w:r>
+      <w:r>
+        <w:rPr>
+          <w:rStyle w:val="VerbatimChar"/>
+        </w:rPr>
+        <w:t xml:space="preserve">dia_protocolo</w:t>
+      </w:r>
+      <w:r>
+        <w:t xml:space="preserve">; a consulta da Tatuapé trouxe os 4 relatos da janela e leu só esses 4, sem ler o de 45 dias; a gravação condicional recusou os 5 reenvios do mesmo relato; a confirmação somou no relato de 5 dias e foi recusada no de 31; e a busca por tipo, sem a chave, precisou ler a tabela inteira.</w:t>
       </w:r>
     </w:p>
     <w:p>
@@ -6217,8 +5968,8 @@
         <w:tblLook w:firstRow="1" w:lastRow="0" w:firstColumn="0" w:lastColumn="0" w:noHBand="0" w:noVBand="0" w:val="0020"/>
       </w:tblPr>
       <w:tblGrid>
-        <w:gridCol w:w="1807"/>
-        <w:gridCol w:w="6113"/>
+        <w:gridCol w:w="1792"/>
+        <w:gridCol w:w="6128"/>
       </w:tblGrid>
       <w:tr>
         <w:trPr>
@@ -6270,7 +6021,7 @@
               <w:jc w:val="left"/>
             </w:pPr>
             <w:r>
-              <w:t xml:space="preserve">Os treze itens do backlog. Na Sprint 3, o caminho da gravação: RF-01, RF-02, RF-05, RNF-01, RNF-02 e RNF-05. Na Sprint 4, o que depende de haver o que listar e de existir a página, nesta ordem: RF-04, US-03 e RNF-04; depois RF-03, US-02 e RNF-03; e a US-01, que só se completa com a página.</w:t>
+              <w:t xml:space="preserve">Toda a prioridade alta e a confirmação: RF-01 a RF-05, US-01 a US-03, RNF-01, RNF-02, RNF-03 e RNF-05. Na Sprint 3, o caminho da gravação: RF-01, RF-02, RF-05, RNF-01, RNF-02 e RNF-05. Na Sprint 4, nesta ordem: RF-04 e US-03; depois RF-03, US-02 e RNF-03; e a US-01, que só se completa com a página.</w:t>
             </w:r>
           </w:p>
         </w:tc>
@@ -6296,7 +6047,7 @@
               <w:jc w:val="left"/>
             </w:pPr>
             <w:r>
-              <w:t xml:space="preserve">Nenhum item do backlog. Continuam fora do escopo, como declarado na Sprint 1: o botão de emergência, a sirene e a localização em tempo real; conta de usuário e autenticação; denúncia de crime ou de pessoa; moderação e remoção de relatos; e o envio dos relatos à operadora. Também fica de fora a consulta por linha, descartada na Sprint 1 e cara pela chave escolhida aqui.</w:t>
+              <w:t xml:space="preserve">Do backlog, o RNF-04: o reenvio de uma confirmação pode somar duas vezes. Do desenho, duas proteções da seção 9: o limite de uma confirmação a cada 10 minutos e a conferência do EXIF na função; a página continua limpando a foto. Continuam fora do escopo, como na Sprint 1: botão de emergência e localização em tempo real; conta e autenticação; denúncia de crime ou de pessoa; moderação; envio dos relatos à operadora; e a consulta por linha.</w:t>
             </w:r>
           </w:p>
         </w:tc>
@@ -6322,16 +6073,7 @@
               <w:jc w:val="left"/>
             </w:pPr>
             <w:r>
-              <w:t xml:space="preserve">Toda a prioridade alta cabe nas duas sprints, porque é o percurso do roteiro: uma função que grava e uma que consulta, atrás de uma API e de uma página. Os itens de média e de baixa entraram por decisão. A US-03 tem custo: obriga a escrever uma terceira função, </w:t>
-            </w:r>
-            <w:r>
-              <w:rPr>
-                <w:rStyle w:val="VerbatimChar"/>
-              </w:rPr>
-              <w:t xml:space="preserve">confirmar</w:t>
-            </w:r>
-            <w:r>
-              <w:t xml:space="preserve">, que o roteiro não ensina, e a razão está logo abaixo desta tabela. O RNF-03 não custa código, só medição. O RNF-01 e o RNF-04 custam poucas linhas: condições na gravação, que a própria tabela confere. O RNF-05 é uma linha de registro por recusa.</w:t>
+              <w:t xml:space="preserve">Por orientação da professora, o recorte tem de caber no tempo das Sprints 3 e 4. Fica toda a prioridade alta e a confirmação, que é o que separa o problema recorrente do caso isolado. O RNF-01, o RNF-03 e o RNF-05 entram porque custam pouco: uma condição na gravação, nenhum código além da chave, e uma linha de registro. O que saiu protege contra casos raros ou contra abuso deliberado, e volta na matriz de rastreabilidade da Sprint 5.</w:t>
             </w:r>
           </w:p>
         </w:tc>
@@ -6342,14 +6084,6 @@
         <w:pStyle w:val="BodyText"/>
       </w:pPr>
       <w:r>
-        <w:t xml:space="preserve">A alternativa mais barata seria declarar a confirmação fora do recorte, e é uma resposta legítima. Optamos por implementar porque a confirmação é o que separa o problema recorrente do caso isolado, que é a razão de ela estar no escopo desde a Sprint 1. Sem ela, todo relato teria 0 confirmações, a consulta sairia do mais recente para o mais antigo, e dez passageiras que passaram pela mesma escada escura gerariam dez relatos soltos.</w:t>
-      </w:r>
-    </w:p>
-    <w:p>
-      <w:pPr>
-        <w:pStyle w:val="BodyText"/>
-      </w:pPr>
-      <w:r>
         <w:t xml:space="preserve">Antes de a função </w:t>
       </w:r>
       <w:r>
@@ -6359,7 +6093,7 @@
         <w:t xml:space="preserve">registrar</w:t>
       </w:r>
       <w:r>
-        <w:t xml:space="preserve"> ser escrita, na Sprint 3, a lista de estações precisa ser conferida com a relação oficial das operadoras, como a Sprint 1 já tinha previsto, e cada estação recebe o seu código fixo. A partir daí o código não muda; o nome pode mudar.</w:t>
+        <w:t xml:space="preserve"> ser escrita, na Sprint 3, a lista de estações precisa ser conferida com a relação oficial das operadoras, e cada estação recebe o seu código fixo. A partir daí o código não muda; o nome pode mudar.</w:t>
       </w:r>
     </w:p>
     <w:p>
@@ -6378,9 +6112,9 @@
         <w:tblLook w:firstRow="1" w:lastRow="0" w:firstColumn="0" w:lastColumn="0" w:noHBand="0" w:noVBand="0" w:val="0020"/>
       </w:tblPr>
       <w:tblGrid>
-        <w:gridCol w:w="1992"/>
-        <w:gridCol w:w="2437"/>
-        <w:gridCol w:w="3491"/>
+        <w:gridCol w:w="2239"/>
+        <w:gridCol w:w="2601"/>
+        <w:gridCol w:w="3080"/>
       </w:tblGrid>
       <w:tr>
         <w:trPr>
@@ -6456,7 +6190,7 @@
               <w:jc w:val="left"/>
             </w:pPr>
             <w:r>
-              <w:t xml:space="preserve">Entre a chegada e a limpeza, a foto ficaria guardada com a localização do aparelho, o que o RD-01 não permite; e a passageira não receberia na mesma resposta o protocolo ou o campo recusado, que a US-01 cobra.</w:t>
+              <w:t xml:space="preserve">A foto ficaria guardada com a localização do aparelho até ser limpa (RD-01), e a passageira não receberia o protocolo na mesma resposta (US-01).</w:t>
             </w:r>
           </w:p>
         </w:tc>
@@ -6503,45 +6237,45 @@
               <w:jc w:val="left"/>
             </w:pPr>
             <w:r>
-              <w:t xml:space="preserve">O nome muda: quando uma estação fosse renomeada, os relatos antigos ficariam sob o nome velho, e a consulta pelo nome novo viria vazia numa estação com problemas relatados.</w:t>
-            </w:r>
-          </w:p>
-        </w:tc>
-      </w:tr>
-      <w:tr>
-        <w:tc>
-          <w:tcPr/>
-          <w:p>
-            <w:pPr>
-              <w:pStyle w:val="Compact"/>
-              <w:jc w:val="left"/>
-            </w:pPr>
-            <w:r>
-              <w:t xml:space="preserve">Recorte de implementação: os treze itens</w:t>
-            </w:r>
-          </w:p>
-        </w:tc>
-        <w:tc>
-          <w:tcPr/>
-          <w:p>
-            <w:pPr>
-              <w:pStyle w:val="Compact"/>
-              <w:jc w:val="left"/>
-            </w:pPr>
-            <w:r>
-              <w:t xml:space="preserve">Só a prioridade alta, deixando a confirmação especificada e não implementada</w:t>
-            </w:r>
-          </w:p>
-        </w:tc>
-        <w:tc>
-          <w:tcPr/>
-          <w:p>
-            <w:pPr>
-              <w:pStyle w:val="Compact"/>
-              <w:jc w:val="left"/>
-            </w:pPr>
-            <w:r>
-              <w:t xml:space="preserve">Seria mais barato e é legítimo, mas a consulta perderia o que a diferencia de uma lista de reclamações: saber o que se repete.</w:t>
+              <w:t xml:space="preserve">O nome muda: depois de uma renomeação, os relatos antigos ficariam sob o nome velho, e a consulta pelo nome novo viria vazia.</w:t>
+            </w:r>
+          </w:p>
+        </w:tc>
+      </w:tr>
+      <w:tr>
+        <w:tc>
+          <w:tcPr/>
+          <w:p>
+            <w:pPr>
+              <w:pStyle w:val="Compact"/>
+              <w:jc w:val="left"/>
+            </w:pPr>
+            <w:r>
+              <w:t xml:space="preserve">Recorte de implementação: a prioridade alta e a confirmação</w:t>
+            </w:r>
+          </w:p>
+        </w:tc>
+        <w:tc>
+          <w:tcPr/>
+          <w:p>
+            <w:pPr>
+              <w:pStyle w:val="Compact"/>
+              <w:jc w:val="left"/>
+            </w:pPr>
+            <w:r>
+              <w:t xml:space="preserve">Os treze itens do backlog, com o RNF-04 e as proteções desta tabela</w:t>
+            </w:r>
+          </w:p>
+        </w:tc>
+        <w:tc>
+          <w:tcPr/>
+          <w:p>
+            <w:pPr>
+              <w:pStyle w:val="Compact"/>
+              <w:jc w:val="left"/>
+            </w:pPr>
+            <w:r>
+              <w:t xml:space="preserve">Não cabe no tempo das Sprints 3 e 4. O que ficou de fora protege contra casos raros ou contra abuso deliberado.</w:t>
             </w:r>
           </w:p>
         </w:tc>
@@ -6567,33 +6301,33 @@
               <w:jc w:val="left"/>
             </w:pPr>
             <w:r>
-              <w:t xml:space="preserve">Escolher os RNFs pelas categorias de nuvem, como Segurança e Observabilidade, independentemente dos RFs</w:t>
-            </w:r>
-          </w:p>
-        </w:tc>
-        <w:tc>
-          <w:tcPr/>
-          <w:p>
-            <w:pPr>
-              <w:pStyle w:val="Compact"/>
-              <w:jc w:val="left"/>
-            </w:pPr>
-            <w:r>
-              <w:t xml:space="preserve">Com um RNF por RF, nenhum requisito funcional fica sem número que o confira, e cada número tem um dono no código. O anonimato e o limite de confirmações, que não são a qualidade de um RF só, ficaram como decisões nesta tabela.</w:t>
-            </w:r>
-          </w:p>
-        </w:tc>
-      </w:tr>
-      <w:tr>
-        <w:tc>
-          <w:tcPr/>
-          <w:p>
-            <w:pPr>
-              <w:pStyle w:val="Compact"/>
-              <w:jc w:val="left"/>
-            </w:pPr>
-            <w:r>
-              <w:t xml:space="preserve">O registro de cada função leva só campos nomeados, e o registro de acesso do API Gateway fica desligado</w:t>
+              <w:t xml:space="preserve">Escolher os RNFs por categoria de nuvem, independentemente dos RFs</w:t>
+            </w:r>
+          </w:p>
+        </w:tc>
+        <w:tc>
+          <w:tcPr/>
+          <w:p>
+            <w:pPr>
+              <w:pStyle w:val="Compact"/>
+              <w:jc w:val="left"/>
+            </w:pPr>
+            <w:r>
+              <w:t xml:space="preserve">Com um RNF por RF, todo requisito funcional tem um número que o confere. Foi a orientação da professora.</w:t>
+            </w:r>
+          </w:p>
+        </w:tc>
+      </w:tr>
+      <w:tr>
+        <w:tc>
+          <w:tcPr/>
+          <w:p>
+            <w:pPr>
+              <w:pStyle w:val="Compact"/>
+              <w:jc w:val="left"/>
+            </w:pPr>
+            <w:r>
+              <w:t xml:space="preserve">O registro leva só campos nomeados, e o registro de acesso do API Gateway fica desligado</w:t>
             </w:r>
           </w:p>
         </w:tc>
@@ -6613,34 +6347,31 @@
               </w:rPr>
               <w:t xml:space="preserve">print(event)</w:t>
             </w:r>
-            <w:r>
-              <w:t xml:space="preserve">, e ligar o registro de acesso do API Gateway</w:t>
-            </w:r>
-          </w:p>
-        </w:tc>
-        <w:tc>
-          <w:tcPr/>
-          <w:p>
-            <w:pPr>
-              <w:pStyle w:val="Compact"/>
-              <w:jc w:val="left"/>
-            </w:pPr>
-            <w:r>
-              <w:t xml:space="preserve">O evento que o API Gateway entrega à função traz o IP e o navegador de quem chamou, e o registro de acesso guarda o IP de cada chamada. As duas coisas gravariam no CloudWatch quem relatou, e o RD-01 seria quebrado sem ninguém perceber.</w:t>
-            </w:r>
-          </w:p>
-        </w:tc>
-      </w:tr>
-      <w:tr>
-        <w:tc>
-          <w:tcPr/>
-          <w:p>
-            <w:pPr>
-              <w:pStyle w:val="Compact"/>
-              <w:jc w:val="left"/>
-            </w:pPr>
-            <w:r>
-              <w:t xml:space="preserve">A página limpa a foto, e a função só confere</w:t>
+          </w:p>
+        </w:tc>
+        <w:tc>
+          <w:tcPr/>
+          <w:p>
+            <w:pPr>
+              <w:pStyle w:val="Compact"/>
+              <w:jc w:val="left"/>
+            </w:pPr>
+            <w:r>
+              <w:t xml:space="preserve">O evento traz o IP e o navegador de quem chamou; registrá-lo quebraria o RD-01 sem ninguém perceber.</w:t>
+            </w:r>
+          </w:p>
+        </w:tc>
+      </w:tr>
+      <w:tr>
+        <w:tc>
+          <w:tcPr/>
+          <w:p>
+            <w:pPr>
+              <w:pStyle w:val="Compact"/>
+              <w:jc w:val="left"/>
+            </w:pPr>
+            <w:r>
+              <w:t xml:space="preserve">A página limpa a foto antes de enviar</w:t>
             </w:r>
           </w:p>
         </w:tc>
@@ -6664,7 +6395,7 @@
               <w:jc w:val="left"/>
             </w:pPr>
             <w:r>
-              <w:t xml:space="preserve">A foto do celular carrega no EXIF a latitude, a longitude e o modelo do aparelho (RD-01). A biblioteca precisaria ser empacotada com a função, o que o percurso das Sprints 3 e 4 não cobre. A página já precisa redesenhar a foto para reduzi-la, e redesenhar tira o EXIF de graça. A função não confia nisso: confere a ausência do EXIF e recusa a foto que o tiver. Por isso, no critério US-01, cenário 1, a foto JPEG de 2 MB tem de chegar sem EXIF: pela página ela chega; mandada direto à API como saiu da câmera, seria recusada.</w:t>
+              <w:t xml:space="preserve">A biblioteca precisaria ser empacotada com a função, e a página já redesenha a foto para reduzi-la, o que tira o EXIF. A conferência do EXIF na função fica especificada e fora do recorte.</w:t>
             </w:r>
           </w:p>
         </w:tc>
@@ -6690,19 +6421,19 @@
               <w:jc w:val="left"/>
             </w:pPr>
             <w:r>
-              <w:t xml:space="preserve">Exigir conta, ou guardar um identificador do aparelho, para que cada pessoa confirme uma vez</w:t>
-            </w:r>
-          </w:p>
-        </w:tc>
-        <w:tc>
-          <w:tcPr/>
-          <w:p>
-            <w:pPr>
-              <w:pStyle w:val="Compact"/>
-              <w:jc w:val="left"/>
-            </w:pPr>
-            <w:r>
-              <w:t xml:space="preserve">As duas identificam quem participa e contrariam o RD-01. O intervalo não impede a fraude: torna-a lenta. Cinquenta confirmações falsas, que caberiam em um segundo, passam a exigir mais de oito horas. Quem quiser inflar um relato ainda consegue, com paciência; esse é o risco que a Sprint 1 declarou e que sobra, escrito aqui. Para que o critério US-03, cenário 1, passe, a última confirmação do relato A tem de ter mais de 10 minutos.</w:t>
+              <w:t xml:space="preserve">Exigir conta, ou guardar um identificador do aparelho</w:t>
+            </w:r>
+          </w:p>
+        </w:tc>
+        <w:tc>
+          <w:tcPr/>
+          <w:p>
+            <w:pPr>
+              <w:pStyle w:val="Compact"/>
+              <w:jc w:val="left"/>
+            </w:pPr>
+            <w:r>
+              <w:t xml:space="preserve">As duas identificam quem confirma e contrariam o RD-01. O intervalo só torna a fraude lenta; fica especificado e fora do recorte, e o risco continua declarado, como na Sprint 1.</w:t>
             </w:r>
           </w:p>
         </w:tc>
@@ -6728,19 +6459,19 @@
               <w:jc w:val="left"/>
             </w:pPr>
             <w:r>
-              <w:t xml:space="preserve">O protocolo é o próprio código gerado pela página</w:t>
-            </w:r>
-          </w:p>
-        </w:tc>
-        <w:tc>
-          <w:tcPr/>
-          <w:p>
-            <w:pPr>
-              <w:pStyle w:val="Compact"/>
-              <w:jc w:val="left"/>
-            </w:pPr>
-            <w:r>
-              <w:t xml:space="preserve">O protocolo aparece na consulta. Se ele fosse o código, quem o lesse poderia reenviá-lo num outro dia, com outra foto, e a foto nova seria gravada no endereço da foto do relato original. Com o hash, conhecer o protocolo não permite chegar ao código.</w:t>
+              <w:t xml:space="preserve">O protocolo é o próprio código da página</w:t>
+            </w:r>
+          </w:p>
+        </w:tc>
+        <w:tc>
+          <w:tcPr/>
+          <w:p>
+            <w:pPr>
+              <w:pStyle w:val="Compact"/>
+              <w:jc w:val="left"/>
+            </w:pPr>
+            <w:r>
+              <w:t xml:space="preserve">O protocolo aparece na consulta: se fosse o código, quem o lesse poderia reenviá-lo com outra foto e trocar a foto de um relato alheio. O código identifica o envio, e não quem enviou.</w:t>
             </w:r>
           </w:p>
         </w:tc>
@@ -6766,19 +6497,19 @@
               <w:jc w:val="left"/>
             </w:pPr>
             <w:r>
-              <w:t xml:space="preserve">O protocolo como chave de ordenação, com um filtro de 30 dias depois da leitura</w:t>
-            </w:r>
-          </w:p>
-        </w:tc>
-        <w:tc>
-          <w:tcPr/>
-          <w:p>
-            <w:pPr>
-              <w:pStyle w:val="Compact"/>
-              <w:jc w:val="left"/>
-            </w:pPr>
-            <w:r>
-              <w:t xml:space="preserve">O filtro é aplicado depois de ler: a consulta leria todos os relatos que a estação já teve, desde o primeiro dia, e o tempo cresceria para sempre. O preço desta decisão é um defeito conhecido: um reenvio que atravesse a meia-noite em UTC, 21h em Brasília, cai em outro dia, ganha outra chave e duplica o relato. A janela é de segundos, e fica declarada aqui.</w:t>
+              <w:t xml:space="preserve">O protocolo como chave de ordenação, com filtro de 30 dias depois da leitura</w:t>
+            </w:r>
+          </w:p>
+        </w:tc>
+        <w:tc>
+          <w:tcPr/>
+          <w:p>
+            <w:pPr>
+              <w:pStyle w:val="Compact"/>
+              <w:jc w:val="left"/>
+            </w:pPr>
+            <w:r>
+              <w:t xml:space="preserve">O filtro leria toda a história da estação. O preço é um defeito declarado: um reenvio que atravesse a meia-noite em UTC, 21h em Brasília, duplica o relato.</w:t>
             </w:r>
           </w:p>
         </w:tc>
@@ -6804,7 +6535,7 @@
               <w:jc w:val="left"/>
             </w:pPr>
             <w:r>
-              <w:t xml:space="preserve">Endereço temporário assinado, gerado pela função </w:t>
+              <w:t xml:space="preserve">Endereço temporário assinado pela função </w:t>
             </w:r>
             <w:r>
               <w:rPr>
@@ -6822,7 +6553,7 @@
               <w:jc w:val="left"/>
             </w:pPr>
             <w:r>
-              <w:t xml:space="preserve">Assinar exige que a </w:t>
+              <w:t xml:space="preserve">Assinar exige permissão no S3, e o RF-03 limita a </w:t>
             </w:r>
             <w:r>
               <w:rPr>
@@ -6831,7 +6562,7 @@
               <w:t xml:space="preserve">consultar</w:t>
             </w:r>
             <w:r>
-              <w:t xml:space="preserve"> tenha permissão no S3, e o RF-03 a limita a ler a tabela. A foto já é conteúdo público por definição (RF-02). O que não é público é listar o bucket, gravar ou apagar (RNF-02).</w:t>
+              <w:t xml:space="preserve"> a ler a tabela. Listar, gravar e apagar continuam proibidos (RNF-02).</w:t>
             </w:r>
           </w:p>
         </w:tc>
@@ -6857,19 +6588,19 @@
               <w:jc w:val="left"/>
             </w:pPr>
             <w:r>
-              <w:t xml:space="preserve">Uma segunda tabela no DynamoDB, com as estações</w:t>
-            </w:r>
-          </w:p>
-        </w:tc>
-        <w:tc>
-          <w:tcPr/>
-          <w:p>
-            <w:pPr>
-              <w:pStyle w:val="Compact"/>
-              <w:jc w:val="left"/>
-            </w:pPr>
-            <w:r>
-              <w:t xml:space="preserve">São 97 estações, que ninguém cadastra pela página e que mudam raramente. Uma tabela custaria uma leitura a mais em cada relato. Se um dia houver uma tela para manter a lista, a tabela passa a ser a escolha certa.</w:t>
+              <w:t xml:space="preserve">Uma tabela de estações no DynamoDB</w:t>
+            </w:r>
+          </w:p>
+        </w:tc>
+        <w:tc>
+          <w:tcPr/>
+          <w:p>
+            <w:pPr>
+              <w:pStyle w:val="Compact"/>
+              <w:jc w:val="left"/>
+            </w:pPr>
+            <w:r>
+              <w:t xml:space="preserve">São 97 estações, que mudam raramente; uma tabela custaria uma leitura a mais em cada relato.</w:t>
             </w:r>
           </w:p>
         </w:tc>
@@ -7056,6 +6787,14 @@
       </w:pPr>
       <w:r>
         <w:t xml:space="preserve">Ajuste após a orientação da professora (15/10/2026): os requisitos não funcionais passaram de quatro para cinco, um para cada requisito funcional da Sprint 1. O anonimato no registro e nas fotos e o limite de uma confirmação a cada 10 minutos, que eram requisitos não funcionais, passaram a decisões da seção 9, e o pilar 1 passou a ter requisito (RNF-05). Versão do documento: 1.1.</w:t>
+      </w:r>
+    </w:p>
+    <w:p>
+      <w:pPr>
+        <w:pStyle w:val="BodyText"/>
+      </w:pPr>
+      <w:r>
+        <w:t xml:space="preserve">Ajustes após a devolutiva da professora (22/10/2026): o uso do DynamoDB foi conferido no LocalStack (seção 6.2); as razões dos requisitos não funcionais foram encurtadas para uma ou duas frases; e o recorte passou a deixar especificados e não implementados o RNF-04, o limite de 10 minutos e a conferência do EXIF na função (seção 8). Versão do documento: 1.2.</w:t>
       </w:r>
     </w:p>
     <w:p>

</xml_diff>

<commit_message>
docs: diagrama feito no Lucidchart
A imagem do diagrama passa a ser a exportada do documento "CPTM SOS -
Arquitetura (Sprint 2)" no Lucidchart, gerado pelo Diagrama em código a
partir do Mermaid de docs/diagrama.md. Pedido da devolutiva de 22/10.

Co-Authored-By: Claude Opus 5.5 <noreply@anthropic.com>
</commit_message>
<xml_diff>
--- a/docs/02-arquitetura.docx
+++ b/docs/02-arquitetura.docx
@@ -2508,7 +2508,7 @@
         <w:pStyle w:val="FirstParagraph"/>
       </w:pPr>
       <w:r>
-        <w:t xml:space="preserve">O diagrama está abaixo e no arquivo </w:t>
+        <w:t xml:space="preserve">O diagrama foi feito no Lucidchart e está abaixo e no arquivo </w:t>
       </w:r>
       <w:r>
         <w:rPr>
@@ -2517,7 +2517,7 @@
         <w:t xml:space="preserve">docs/diagrama.png</w:t>
       </w:r>
       <w:r>
-        <w:t xml:space="preserve">. O código que o desenha, em Mermaid, está em </w:t>
+        <w:t xml:space="preserve">. Ele foi gerado no próprio Lucidchart a partir do código Mermaid que está em </w:t>
       </w:r>
       <w:r>
         <w:rPr>
@@ -2526,7 +2526,7 @@
         <w:t xml:space="preserve">docs/diagrama.md</w:t>
       </w:r>
       <w:r>
-        <w:t xml:space="preserve">, com a explicação de como ler as setas.</w:t>
+        <w:t xml:space="preserve">, com a explicação de como ler as setas: mudar o desenho é mudar o código e gerar de novo.</w:t>
       </w:r>
     </w:p>
     <w:p>
@@ -2536,7 +2536,7 @@
       <w:r>
         <w:drawing>
           <wp:inline distT="0" distB="0" distL="0" distR="0">
-            <wp:extent cx="5486400" cy="3103734"/>
+            <wp:extent cx="5486400" cy="4175475"/>
             <wp:effectExtent l="0" t="0" r="0" b="0"/>
             <wp:docPr id="1" name="Figura 1" descr="Diagrama de arquitetura de ponta a ponta do CPTM SOS · Relatos por estação"/>
             <wp:cNvGraphicFramePr>
@@ -2558,7 +2558,7 @@
                   <pic:spPr bwMode="auto">
                     <a:xfrm>
                       <a:off x="0" y="0"/>
-                      <a:ext cx="5486400" cy="3103734"/>
+                      <a:ext cx="5486400" cy="4175475"/>
                     </a:xfrm>
                     <a:prstGeom prst="rect">
                       <a:avLst/>
@@ -6794,7 +6794,7 @@
         <w:pStyle w:val="BodyText"/>
       </w:pPr>
       <w:r>
-        <w:t xml:space="preserve">Ajustes após a devolutiva da professora (22/10/2026): o uso do DynamoDB foi conferido no LocalStack (seção 6.2); as razões dos requisitos não funcionais foram encurtadas para uma ou duas frases; e o recorte passou a deixar especificados e não implementados o RNF-04, o limite de 10 minutos e a conferência do EXIF na função (seção 8). Versão do documento: 1.2.</w:t>
+        <w:t xml:space="preserve">Ajustes após a devolutiva da professora (22/10/2026): o uso do DynamoDB foi conferido no LocalStack (seção 6.2); as razões dos requisitos não funcionais foram encurtadas para uma ou duas frases; o recorte passou a deixar especificados e não implementados o RNF-04, o limite de 10 minutos e a conferência do EXIF na função (seção 8); e o diagrama passou a ser feito no Lucidchart (seção 5). Versão do documento: 1.2.</w:t>
       </w:r>
     </w:p>
     <w:p>

</xml_diff>

<commit_message>
docs: revisão da professora registrada nas sprints 1 e 2
A revisão das duas sprints foi feita com a professora, e não por outra
equipe. As seções de revisão passam a registrar o que ela apontou em
cada pergunta, sem respostas inventadas onde não houve apontamento. O
Word da Sprint 1 passa a seguir o Template 1, como o da Sprint 2 segue
o Template 2.

Co-Authored-By: Claude Opus 5.5 <noreply@anthropic.com>
</commit_message>
<xml_diff>
--- a/docs/02-arquitetura.docx
+++ b/docs/02-arquitetura.docx
@@ -84,13 +84,13 @@
         <w:br/>
       </w:r>
       <w:r>
-        <w:t xml:space="preserve">Data: 22/10/2026</w:t>
-      </w:r>
-      <w:r>
-        <w:br/>
-      </w:r>
-      <w:r>
-        <w:t xml:space="preserve">Versão: 1.2</w:t>
+        <w:t xml:space="preserve">Data: 27/10/2026</w:t>
+      </w:r>
+      <w:r>
+        <w:br/>
+      </w:r>
+      <w:r>
+        <w:t xml:space="preserve">Versão: 1.3</w:t>
       </w:r>
     </w:p>
     <w:p>
@@ -6619,13 +6619,13 @@
         <w:pStyle w:val="FirstParagraph"/>
       </w:pPr>
       <w:r>
-        <w:t xml:space="preserve">Revisado por: pendente, a revisão acontece na aula</w:t>
-      </w:r>
-      <w:r>
-        <w:br/>
-      </w:r>
-      <w:r>
-        <w:t xml:space="preserve">Data: pendente</w:t>
+        <w:t xml:space="preserve">Revisado por: Profa. Angélica Guimarães. A revisão foi feita com a professora, e não por outra equipe.</w:t>
+      </w:r>
+      <w:r>
+        <w:br/>
+      </w:r>
+      <w:r>
+        <w:t xml:space="preserve">Data: 15/10/2026 e 22/10/2026</w:t>
       </w:r>
     </w:p>
     <w:tbl>
@@ -6636,8 +6636,8 @@
         <w:tblLook w:firstRow="1" w:lastRow="0" w:firstColumn="0" w:lastColumn="0" w:noHBand="0" w:noVBand="0" w:val="0020"/>
       </w:tblPr>
       <w:tblGrid>
-        <w:gridCol w:w="3656"/>
-        <w:gridCol w:w="4264"/>
+        <w:gridCol w:w="2795"/>
+        <w:gridCol w:w="5125"/>
       </w:tblGrid>
       <w:tr>
         <w:trPr>
@@ -6689,7 +6689,7 @@
               <w:jc w:val="left"/>
             </w:pPr>
             <w:r>
-              <w:t xml:space="preserve">pendente — preenchido com a resposta da equipe revisora</w:t>
+              <w:t xml:space="preserve">Sem apontamento de número faltando. A orientação de 15/10 foi que os requisitos não funcionais fossem cinco, um para cada requisito funcional da Sprint 1.</w:t>
             </w:r>
           </w:p>
         </w:tc>
@@ -6715,7 +6715,7 @@
               <w:jc w:val="left"/>
             </w:pPr>
             <w:r>
-              <w:t xml:space="preserve">pendente — preenchido com a resposta da equipe revisora</w:t>
+              <w:t xml:space="preserve">Sem apontamento registrado.</w:t>
             </w:r>
           </w:p>
         </w:tc>
@@ -6741,7 +6741,7 @@
               <w:jc w:val="left"/>
             </w:pPr>
             <w:r>
-              <w:t xml:space="preserve">pendente — preenchido com a resposta da equipe revisora</w:t>
+              <w:t xml:space="preserve">Sem apontamento sobre as caixas. O pedido de 22/10 foi fazer o diagrama no Lucidchart.</w:t>
             </w:r>
           </w:p>
         </w:tc>
@@ -6767,7 +6767,7 @@
               <w:jc w:val="left"/>
             </w:pPr>
             <w:r>
-              <w:t xml:space="preserve">pendente — preenchido com a resposta da equipe revisora</w:t>
+              <w:t xml:space="preserve">Não como estava. Em 22/10, a professora apontou que as razões estavam extensas e que não daria para fazer tudo a tempo, e pediu para enxugar. Pediu também para conferir se o DynamoDB funciona.</w:t>
             </w:r>
           </w:p>
         </w:tc>
@@ -6802,7 +6802,7 @@
         <w:pStyle w:val="BodyText"/>
       </w:pPr>
       <w:r>
-        <w:t xml:space="preserve">Ajustes da revisão cruzada: pendente, registrados aqui depois do retorno da equipe revisora.</w:t>
+        <w:t xml:space="preserve">A revisão foi feita com a professora, e os ajustes que ela pediu são os dois registrados acima. Versão do documento: 1.3.</w:t>
       </w:r>
     </w:p>
     <w:sectPr>

</xml_diff>

<commit_message>
docs: diagrama sobre o modelo AWS do Lucidchart, com ícones
Pedido da professora em 29/10: o diagrama passa a usar o modelo
"Estrutura horizontal AWS (2019)" do Lucidchart, com o ícone oficial de
cada serviço e as setas do caminho de um relato numeradas de 1 a 5. A
passageira entra no desenho e na legenda. O documento vai à versão 1.4,
e a apresentação da Sprint 2 recebe o diagrama novo no slide 8.

Co-Authored-By: Claude Opus 5.5 <noreply@anthropic.com>
</commit_message>
<xml_diff>
--- a/docs/02-arquitetura.docx
+++ b/docs/02-arquitetura.docx
@@ -84,13 +84,13 @@
         <w:br/>
       </w:r>
       <w:r>
-        <w:t xml:space="preserve">Data: 27/10/2026</w:t>
-      </w:r>
-      <w:r>
-        <w:br/>
-      </w:r>
-      <w:r>
-        <w:t xml:space="preserve">Versão: 1.3</w:t>
+        <w:t xml:space="preserve">Data: 29/10/2026</w:t>
+      </w:r>
+      <w:r>
+        <w:br/>
+      </w:r>
+      <w:r>
+        <w:t xml:space="preserve">Versão: 1.4</w:t>
       </w:r>
     </w:p>
     <w:p>
@@ -2508,7 +2508,7 @@
         <w:pStyle w:val="FirstParagraph"/>
       </w:pPr>
       <w:r>
-        <w:t xml:space="preserve">O diagrama foi feito no Lucidchart e está abaixo e no arquivo </w:t>
+        <w:t xml:space="preserve">O diagrama foi feito no Lucidchart, sobre o modelo "Estrutura horizontal AWS (2019)", com o ícone oficial de cada serviço, e está abaixo e no arquivo </w:t>
       </w:r>
       <w:r>
         <w:rPr>
@@ -2517,7 +2517,7 @@
         <w:t xml:space="preserve">docs/diagrama.png</w:t>
       </w:r>
       <w:r>
-        <w:t xml:space="preserve">. Ele foi gerado no próprio Lucidchart a partir do código Mermaid que está em </w:t>
+        <w:t xml:space="preserve">. As setas numeradas de 1 a 5 seguem o caminho de um relato (seção 5.2), e a explicação de como ler as setas está em </w:t>
       </w:r>
       <w:r>
         <w:rPr>
@@ -2526,7 +2526,7 @@
         <w:t xml:space="preserve">docs/diagrama.md</w:t>
       </w:r>
       <w:r>
-        <w:t xml:space="preserve">, com a explicação de como ler as setas: mudar o desenho é mudar o código e gerar de novo.</w:t>
+        <w:t xml:space="preserve">.</w:t>
       </w:r>
     </w:p>
     <w:p>
@@ -2536,7 +2536,7 @@
       <w:r>
         <w:drawing>
           <wp:inline distT="0" distB="0" distL="0" distR="0">
-            <wp:extent cx="5486400" cy="4175475"/>
+            <wp:extent cx="5486400" cy="2826327"/>
             <wp:effectExtent l="0" t="0" r="0" b="0"/>
             <wp:docPr id="1" name="Figura 1" descr="Diagrama de arquitetura de ponta a ponta do CPTM SOS · Relatos por estação"/>
             <wp:cNvGraphicFramePr>
@@ -2558,7 +2558,7 @@
                   <pic:spPr bwMode="auto">
                     <a:xfrm>
                       <a:off x="0" y="0"/>
-                      <a:ext cx="5486400" cy="4175475"/>
+                      <a:ext cx="5486400" cy="2826327"/>
                     </a:xfrm>
                     <a:prstGeom prst="rect">
                       <a:avLst/>
@@ -2595,10 +2595,10 @@
         <w:tblLook w:firstRow="1" w:lastRow="0" w:firstColumn="0" w:lastColumn="0" w:noHBand="0" w:noVBand="0" w:val="0020"/>
       </w:tblPr>
       <w:tblGrid>
-        <w:gridCol w:w="1246"/>
-        <w:gridCol w:w="1975"/>
-        <w:gridCol w:w="3340"/>
-        <w:gridCol w:w="1359"/>
+        <w:gridCol w:w="1335"/>
+        <w:gridCol w:w="1953"/>
+        <w:gridCol w:w="3292"/>
+        <w:gridCol w:w="1340"/>
       </w:tblGrid>
       <w:tr>
         <w:trPr>
@@ -2649,6 +2649,56 @@
             </w:pPr>
             <w:r>
               <w:t xml:space="preserve">Requisito que a justifica</w:t>
+            </w:r>
+          </w:p>
+        </w:tc>
+      </w:tr>
+      <w:tr>
+        <w:tc>
+          <w:tcPr/>
+          <w:p>
+            <w:pPr>
+              <w:pStyle w:val="Compact"/>
+              <w:jc w:val="left"/>
+            </w:pPr>
+            <w:r>
+              <w:t xml:space="preserve">Passageira</w:t>
+            </w:r>
+          </w:p>
+        </w:tc>
+        <w:tc>
+          <w:tcPr/>
+          <w:p>
+            <w:pPr>
+              <w:pStyle w:val="Compact"/>
+              <w:jc w:val="left"/>
+            </w:pPr>
+            <w:r>
+              <w:t xml:space="preserve">—</w:t>
+            </w:r>
+          </w:p>
+        </w:tc>
+        <w:tc>
+          <w:tcPr/>
+          <w:p>
+            <w:pPr>
+              <w:pStyle w:val="Compact"/>
+              <w:jc w:val="left"/>
+            </w:pPr>
+            <w:r>
+              <w:t xml:space="preserve">Relata, consulta e confirma pela página, sem se identificar</w:t>
+            </w:r>
+          </w:p>
+        </w:tc>
+        <w:tc>
+          <w:tcPr/>
+          <w:p>
+            <w:pPr>
+              <w:pStyle w:val="Compact"/>
+              <w:jc w:val="left"/>
+            </w:pPr>
+            <w:r>
+              <w:t xml:space="preserve">US-01, US-02, US-03</w:t>
             </w:r>
           </w:p>
         </w:tc>
@@ -6625,7 +6675,7 @@
         <w:br/>
       </w:r>
       <w:r>
-        <w:t xml:space="preserve">Data: 15/10/2026 e 22/10/2026</w:t>
+        <w:t xml:space="preserve">Data: 15/10/2026, 22/10/2026 e 29/10/2026</w:t>
       </w:r>
     </w:p>
     <w:tbl>
@@ -6636,8 +6686,8 @@
         <w:tblLook w:firstRow="1" w:lastRow="0" w:firstColumn="0" w:lastColumn="0" w:noHBand="0" w:noVBand="0" w:val="0020"/>
       </w:tblPr>
       <w:tblGrid>
-        <w:gridCol w:w="2795"/>
-        <w:gridCol w:w="5125"/>
+        <w:gridCol w:w="2630"/>
+        <w:gridCol w:w="5290"/>
       </w:tblGrid>
       <w:tr>
         <w:trPr>
@@ -6741,7 +6791,7 @@
               <w:jc w:val="left"/>
             </w:pPr>
             <w:r>
-              <w:t xml:space="preserve">Sem apontamento sobre as caixas. O pedido de 22/10 foi fazer o diagrama no Lucidchart.</w:t>
+              <w:t xml:space="preserve">Sem apontamento sobre as caixas. O pedido de 22/10 foi fazer o diagrama no Lucidchart; o de 29/10, fazê-lo sobre um modelo AWS do Lucidchart, com o ícone de cada serviço.</w:t>
             </w:r>
           </w:p>
         </w:tc>
@@ -6802,7 +6852,15 @@
         <w:pStyle w:val="BodyText"/>
       </w:pPr>
       <w:r>
-        <w:t xml:space="preserve">A revisão foi feita com a professora, e os ajustes que ela pediu são os dois registrados acima. Versão do documento: 1.3.</w:t>
+        <w:t xml:space="preserve">Ajuste após a devolutiva da professora (29/10/2026): o diagrama foi refeito no Lucidchart sobre o modelo "Estrutura horizontal AWS (2019)", com o ícone oficial de cada serviço e as setas do caminho de um relato numeradas de 1 a 5 (seção 5). A passageira entrou no desenho e na legenda. Versão do documento: 1.4.</w:t>
+      </w:r>
+    </w:p>
+    <w:p>
+      <w:pPr>
+        <w:pStyle w:val="BodyText"/>
+      </w:pPr>
+      <w:r>
+        <w:t xml:space="preserve">A revisão foi feita com a professora, e os ajustes que ela pediu são os registrados acima.</w:t>
       </w:r>
     </w:p>
     <w:sectPr>

</xml_diff>